<commit_message>
Finalized Word documents for the submission.
</commit_message>
<xml_diff>
--- a/HE2AT_DMP_v2.2_COMPLETE_with_figures_09092025_TRACKED_CHANGES.docx
+++ b/HE2AT_DMP_v2.2_COMPLETE_with_figures_09092025_TRACKED_CHANGES.docx
@@ -755,7 +755,7 @@
           <w:noProof/>
         </w:rPr>
         <w:pict w14:anchorId="3DC4B031">
-          <v:rect id="_x0000_i1033" alt="" style="width:468pt;height:.05pt;mso-width-percent:0;mso-height-percent:0;mso-width-percent:0;mso-height-percent:0" o:hralign="center" o:hrstd="t" o:hr="t"/>
+          <v:rect id="_x0000_i1031" alt="" style="width:468pt;height:.05pt;mso-width-percent:0;mso-height-percent:0;mso-width-percent:0;mso-height-percent:0" o:hralign="center" o:hrstd="t" o:hr="t"/>
         </w:pict>
       </w:r>
     </w:p>
@@ -5161,7 +5161,7 @@
           <w:noProof/>
         </w:rPr>
         <w:pict w14:anchorId="183CBD10">
-          <v:rect id="_x0000_i1032" alt="" style="width:468pt;height:.05pt;mso-width-percent:0;mso-height-percent:0;mso-width-percent:0;mso-height-percent:0" o:hralign="center" o:hrstd="t" o:hr="t"/>
+          <v:rect id="_x0000_i1030" alt="" style="width:468pt;height:.05pt;mso-width-percent:0;mso-height-percent:0;mso-width-percent:0;mso-height-percent:0" o:hralign="center" o:hrstd="t" o:hr="t"/>
         </w:pict>
       </w:r>
     </w:p>
@@ -6261,7 +6261,7 @@
           <w:noProof/>
         </w:rPr>
         <w:pict w14:anchorId="2BD5C3A9">
-          <v:rect id="_x0000_i1031" alt="" style="width:468pt;height:.05pt;mso-width-percent:0;mso-height-percent:0;mso-width-percent:0;mso-height-percent:0" o:hralign="center" o:hrstd="t" o:hr="t"/>
+          <v:rect id="_x0000_i1029" alt="" style="width:468pt;height:.05pt;mso-width-percent:0;mso-height-percent:0;mso-width-percent:0;mso-height-percent:0" o:hralign="center" o:hrstd="t" o:hr="t"/>
         </w:pict>
       </w:r>
     </w:p>
@@ -7880,7 +7880,7 @@
           <w:noProof/>
         </w:rPr>
         <w:pict w14:anchorId="5938E00B">
-          <v:rect id="_x0000_i1030" alt="" style="width:468pt;height:.05pt;mso-width-percent:0;mso-height-percent:0;mso-width-percent:0;mso-height-percent:0" o:hralign="center" o:hrstd="t" o:hr="t"/>
+          <v:rect id="_x0000_i1028" alt="" style="width:468pt;height:.05pt;mso-width-percent:0;mso-height-percent:0;mso-width-percent:0;mso-height-percent:0" o:hralign="center" o:hrstd="t" o:hr="t"/>
         </w:pict>
       </w:r>
     </w:p>
@@ -8509,25 +8509,18 @@
       <w:r>
         <w:t>:</w:t>
       </w:r>
-      <w:del w:id="39" w:author="Craig Parker" w:date="2025-08-22T12:24:00Z" w16du:dateUtc="2025-08-22T10:24:00Z">
-        <w:r>
-          <w:delText xml:space="preserve"> </w:delText>
-        </w:r>
-      </w:del>
-      <w:ins w:id="40" w:author="Craig Parker" w:date="2025-08-22T12:24:00Z">
+      <w:ins w:id="39" w:author="Craig Parker" w:date="2025-08-22T12:24:00Z">
         <w:r>
           <w:rPr>
             <w:b/>
             <w:bCs/>
           </w:rPr>
-          <w:t xml:space="preserve"> Establish clear procedures for data sharing within the consortium and with external researchers through the Data Access Committee.</w:t>
+          <w:t xml:space="preserve"> </w:t>
         </w:r>
       </w:ins>
-      <w:del w:id="41" w:author="Craig Parker" w:date="2025-08-22T12:24:00Z" w16du:dateUtc="2025-08-22T10:24:00Z">
-        <w:r>
-          <w:delText>Clear guidelines and DTAs promote transparency and collaboration and support data sharing within the HE²AT Center Consortium, with other DS-I Africa projects, and with External Researchers.</w:delText>
-        </w:r>
-      </w:del>
+      <w:r>
+        <w:t>Establish clear procedures for data sharing within the consortium and with external researchers through the Data Access Committee.</w:t>
+      </w:r>
     </w:p>
     <w:p>
       <w:pPr>
@@ -8577,27 +8570,27 @@
       <w:pPr>
         <w:pStyle w:val="Heading3"/>
         <w:rPr>
-          <w:ins w:id="42" w:author="Craig Parker" w:date="2025-08-22T12:24:00Z" w16du:dateUtc="2025-08-22T10:24:00Z"/>
-        </w:rPr>
-      </w:pPr>
-      <w:bookmarkStart w:id="43" w:name="_Toc206760662"/>
-      <w:bookmarkStart w:id="44" w:name="overview-of-the-data-management-workflow"/>
+          <w:ins w:id="40" w:author="Craig Parker" w:date="2025-08-22T12:24:00Z" w16du:dateUtc="2025-08-22T10:24:00Z"/>
+        </w:rPr>
+      </w:pPr>
+      <w:bookmarkStart w:id="41" w:name="_Toc206760662"/>
+      <w:bookmarkStart w:id="42" w:name="overview-of-the-data-management-workflow"/>
       <w:bookmarkEnd w:id="38"/>
       <w:r>
         <w:t>3.4. Overview of the Data Management Workflow</w:t>
       </w:r>
-      <w:bookmarkEnd w:id="43"/>
+      <w:bookmarkEnd w:id="41"/>
     </w:p>
     <w:p>
       <w:pPr>
         <w:pStyle w:val="BodyText"/>
-        <w:pPrChange w:id="45" w:author="Craig Parker" w:date="2025-08-22T12:24:00Z" w16du:dateUtc="2025-08-22T10:24:00Z">
+        <w:pPrChange w:id="43" w:author="Craig Parker" w:date="2025-08-22T12:24:00Z" w16du:dateUtc="2025-08-22T10:24:00Z">
           <w:pPr>
             <w:pStyle w:val="Heading3"/>
           </w:pPr>
         </w:pPrChange>
       </w:pPr>
-      <w:ins w:id="46" w:author="Craig Parker" w:date="2025-08-22T12:24:00Z">
+      <w:ins w:id="44" w:author="Craig Parker" w:date="2025-08-22T12:24:00Z">
         <w:r>
           <w:rPr>
             <w:b/>
@@ -8748,15 +8741,15 @@
       <w:pPr>
         <w:pStyle w:val="BodyText"/>
       </w:pPr>
-      <w:commentRangeStart w:id="47"/>
-      <w:commentRangeEnd w:id="47"/>
+      <w:commentRangeStart w:id="45"/>
+      <w:commentRangeEnd w:id="45"/>
       <w:r>
         <w:rPr>
           <w:rStyle w:val="CommentReference"/>
         </w:rPr>
-        <w:commentReference w:id="47"/>
-      </w:r>
-      <w:ins w:id="48" w:author="Craig Parker [2]" w:date="2025-09-05T09:53:00Z" w16du:dateUtc="2025-09-05T07:53:00Z">
+        <w:commentReference w:id="45"/>
+      </w:r>
+      <w:ins w:id="46" w:author="Craig Parker [2]" w:date="2025-09-05T09:53:00Z" w16du:dateUtc="2025-09-05T07:53:00Z">
         <w:r>
           <w:rPr>
             <w:noProof/>
@@ -8806,27 +8799,14 @@
       <w:r>
         <w:t xml:space="preserve">Figure </w:t>
       </w:r>
-      <w:r>
-        <w:fldChar w:fldCharType="begin"/>
-      </w:r>
-      <w:r>
-        <w:instrText xml:space="preserve"> SEQ Figure \* ARABIC </w:instrText>
-      </w:r>
-      <w:r>
-        <w:fldChar w:fldCharType="separate"/>
-      </w:r>
-      <w:r>
-        <w:rPr>
-          <w:noProof/>
-        </w:rPr>
-        <w:t>1</w:t>
-      </w:r>
-      <w:r>
-        <w:rPr>
-          <w:noProof/>
-        </w:rPr>
-        <w:fldChar w:fldCharType="end"/>
-      </w:r>
+      <w:fldSimple w:instr=" SEQ Figure \* ARABIC ">
+        <w:r>
+          <w:rPr>
+            <w:noProof/>
+          </w:rPr>
+          <w:t>1</w:t>
+        </w:r>
+      </w:fldSimple>
       <w:r>
         <w:t>: HE²AT Center Data Management Workflow</w:t>
       </w:r>
@@ -8843,20 +8823,20 @@
           <w:cols w:space="720"/>
         </w:sectPr>
       </w:pPr>
-      <w:bookmarkStart w:id="49" w:name="data-types"/>
+      <w:bookmarkStart w:id="47" w:name="data-types"/>
       <w:bookmarkEnd w:id="31"/>
-      <w:bookmarkEnd w:id="44"/>
+      <w:bookmarkEnd w:id="42"/>
     </w:p>
     <w:p>
       <w:pPr>
         <w:pStyle w:val="Heading2"/>
       </w:pPr>
-      <w:bookmarkStart w:id="50" w:name="_Toc206760663"/>
+      <w:bookmarkStart w:id="48" w:name="_Toc206760663"/>
       <w:r>
         <w:lastRenderedPageBreak/>
         <w:t>4. Data types</w:t>
       </w:r>
-      <w:bookmarkEnd w:id="50"/>
+      <w:bookmarkEnd w:id="48"/>
     </w:p>
     <w:p>
       <w:pPr>
@@ -8878,20 +8858,54 @@
       <w:pPr>
         <w:pStyle w:val="Heading3"/>
       </w:pPr>
-      <w:bookmarkStart w:id="51" w:name="_Toc206760664"/>
-      <w:bookmarkStart w:id="52" w:name="health-related-data"/>
+      <w:bookmarkStart w:id="49" w:name="_Toc206760664"/>
+      <w:bookmarkStart w:id="50" w:name="health-related-data"/>
       <w:r>
         <w:t>4.1. Health-related data</w:t>
       </w:r>
+      <w:bookmarkEnd w:id="49"/>
+    </w:p>
+    <w:p>
+      <w:pPr>
+        <w:pStyle w:val="Heading4"/>
+      </w:pPr>
+      <w:bookmarkStart w:id="51" w:name="summary-of-data-categories"/>
+      <w:r>
+        <w:t>4.1.1. Summary of data categories</w:t>
+      </w:r>
+    </w:p>
+    <w:p>
+      <w:pPr>
+        <w:pStyle w:val="FirstParagraph"/>
+      </w:pPr>
+      <w:r>
+        <w:t xml:space="preserve">The </w:t>
+      </w:r>
+      <w:proofErr w:type="spellStart"/>
+      <w:r>
+        <w:t>categorisation</w:t>
+      </w:r>
+      <w:proofErr w:type="spellEnd"/>
+      <w:r>
+        <w:t xml:space="preserve"> of health data within the HE²AT Center ensures that the HE²AT Center adheres to ethical and legal standards whilst facilitating collaborative research among the HE²AT Center Consortium and External Researchers with controlled access. Health data is classified into four distinct forms, ranging from original, individual-level data, aggregated to inferential data. This structured approach aims to maintain data privacy and protection throughout the HE²AT Center Project lifecycle.</w:t>
+      </w:r>
+    </w:p>
+    <w:p>
+      <w:pPr>
+        <w:pStyle w:val="BodyText"/>
+      </w:pPr>
+      <w:r>
+        <w:t>In all activities involving health data, the HE²AT Center Consortium contractually undertakes not to use the data to attempt to re-identify any Data Subjects.</w:t>
+      </w:r>
+    </w:p>
+    <w:p>
+      <w:pPr>
+        <w:pStyle w:val="Heading4"/>
+      </w:pPr>
+      <w:bookmarkStart w:id="52" w:name="original-study-data"/>
       <w:bookmarkEnd w:id="51"/>
-    </w:p>
-    <w:p>
-      <w:pPr>
-        <w:pStyle w:val="Heading4"/>
-      </w:pPr>
-      <w:bookmarkStart w:id="53" w:name="summary-of-data-categories"/>
-      <w:r>
-        <w:t>4.1.1. Summary of data categories</w:t>
+      <w:r>
+        <w:t>4.1.2. Original Study Data</w:t>
       </w:r>
     </w:p>
     <w:p>
@@ -8899,81 +8913,47 @@
         <w:pStyle w:val="FirstParagraph"/>
       </w:pPr>
       <w:r>
+        <w:t xml:space="preserve">This category includes original, unprocessed health data collected directly through the various previously completed cohort studies and clinical trials that fulfil the study eligibility criteria. Ownership of this data is retained by the Data Provider who conducted or commissioned the studies and/or clinical trial. The Original Study Data is acquired </w:t>
+      </w:r>
+      <w:proofErr w:type="gramStart"/>
+      <w:r>
+        <w:t>on the basis of</w:t>
+      </w:r>
+      <w:proofErr w:type="gramEnd"/>
+      <w:r>
+        <w:t xml:space="preserve"> a Data Transfer </w:t>
+      </w:r>
+      <w:proofErr w:type="gramStart"/>
+      <w:r>
+        <w:t>Agreement, and</w:t>
+      </w:r>
+      <w:proofErr w:type="gramEnd"/>
+      <w:r>
+        <w:t xml:space="preserve"> is retained for a period of five years after the completion of the HE²AT Center Project for the purposes of concluding and correcting any analysis and publications resulting from the Data. Any retention of Data after this five-year period will be further agreed with the Data Provider. The Data provider may elect to terminate the Data Transfer Agreement and data retention will then be dealt with in a manner requested by the Data Provider.</w:t>
+      </w:r>
+    </w:p>
+    <w:p>
+      <w:pPr>
+        <w:pStyle w:val="BodyText"/>
+      </w:pPr>
+      <w:r>
         <w:t xml:space="preserve">The </w:t>
       </w:r>
-      <w:proofErr w:type="spellStart"/>
-      <w:r>
-        <w:t>categorisation</w:t>
-      </w:r>
-      <w:proofErr w:type="spellEnd"/>
-      <w:r>
-        <w:t xml:space="preserve"> of health data within the HE²AT Center ensures that the HE²AT Center adheres to ethical and legal standards whilst facilitating collaborative research among the HE²AT Center Consortium and External Researchers with controlled access. Health data is classified into four distinct forms, ranging from original, individual-level data, aggregated to inferential data. This structured approach aims to maintain data privacy and protection throughout the HE²AT Center Project lifecycle.</w:t>
-      </w:r>
-    </w:p>
-    <w:p>
-      <w:pPr>
-        <w:pStyle w:val="BodyText"/>
-      </w:pPr>
-      <w:r>
-        <w:t>In all activities involving health data, the HE²AT Center Consortium contractually undertakes not to use the data to attempt to re-identify any Data Subjects.</w:t>
-      </w:r>
-    </w:p>
-    <w:p>
-      <w:pPr>
-        <w:pStyle w:val="Heading4"/>
-      </w:pPr>
-      <w:bookmarkStart w:id="54" w:name="original-study-data"/>
-      <w:bookmarkEnd w:id="53"/>
-      <w:r>
-        <w:t>4.1.2. Original Study Data</w:t>
-      </w:r>
-    </w:p>
-    <w:p>
-      <w:pPr>
-        <w:pStyle w:val="FirstParagraph"/>
-      </w:pPr>
-      <w:r>
-        <w:t xml:space="preserve">This category includes original, unprocessed health data collected directly through the various previously completed cohort studies and clinical trials that fulfil the study eligibility criteria. Ownership of this data is retained by the Data Provider who conducted or commissioned the studies and/or clinical trial. The Original Study Data is acquired </w:t>
-      </w:r>
-      <w:proofErr w:type="gramStart"/>
-      <w:r>
-        <w:t>on the basis of</w:t>
-      </w:r>
-      <w:proofErr w:type="gramEnd"/>
-      <w:r>
-        <w:t xml:space="preserve"> a Data Transfer </w:t>
-      </w:r>
-      <w:proofErr w:type="gramStart"/>
-      <w:r>
-        <w:t>Agreement, and</w:t>
-      </w:r>
-      <w:proofErr w:type="gramEnd"/>
-      <w:r>
-        <w:t xml:space="preserve"> is retained for a period of five years after the completion of the HE²AT Center Project for the purposes of concluding and correcting any analysis and publications resulting from the Data. Any retention of Data after this five-year period will be further agreed with the Data Provider. The Data provider may elect to terminate the Data Transfer Agreement and data retention will then be dealt with in a manner requested by the Data Provider.</w:t>
-      </w:r>
-    </w:p>
-    <w:p>
-      <w:pPr>
-        <w:pStyle w:val="BodyText"/>
-      </w:pPr>
-      <w:r>
-        <w:t xml:space="preserve">The </w:t>
-      </w:r>
-      <w:commentRangeStart w:id="55"/>
+      <w:commentRangeStart w:id="53"/>
       <w:r>
         <w:t xml:space="preserve">Original Study Data </w:t>
       </w:r>
-      <w:commentRangeEnd w:id="55"/>
+      <w:commentRangeEnd w:id="53"/>
       <w:r>
         <w:rPr>
           <w:rStyle w:val="CommentReference"/>
         </w:rPr>
-        <w:commentReference w:id="55"/>
+        <w:commentReference w:id="53"/>
       </w:r>
       <w:r>
         <w:t>is</w:t>
       </w:r>
-      <w:ins w:id="56" w:author="Craig Parker [2]" w:date="2025-09-09T11:35:00Z" w16du:dateUtc="2025-09-09T09:35:00Z">
+      <w:ins w:id="54" w:author="Craig Parker [2]" w:date="2025-09-09T11:35:00Z" w16du:dateUtc="2025-09-09T09:35:00Z">
         <w:r>
           <w:rPr>
             <w:b/>
@@ -8982,9 +8962,9 @@
           <w:t xml:space="preserve"> </w:t>
         </w:r>
       </w:ins>
-      <w:commentRangeStart w:id="57"/>
-      <w:ins w:id="58" w:author="Craig Parker" w:date="2025-08-22T12:30:00Z">
-        <w:del w:id="59" w:author="Craig Parker [2]" w:date="2025-09-09T11:35:00Z" w16du:dateUtc="2025-09-09T09:35:00Z">
+      <w:commentRangeStart w:id="55"/>
+      <w:ins w:id="56" w:author="Craig Parker" w:date="2025-08-22T12:30:00Z">
+        <w:del w:id="57" w:author="Craig Parker [2]" w:date="2025-09-09T11:35:00Z" w16du:dateUtc="2025-09-09T09:35:00Z">
           <w:r>
             <w:rPr>
               <w:b/>
@@ -8994,17 +8974,17 @@
           </w:r>
         </w:del>
       </w:ins>
-      <w:commentRangeEnd w:id="57"/>
-      <w:del w:id="60" w:author="Craig Parker [2]" w:date="2025-09-09T11:35:00Z" w16du:dateUtc="2025-09-09T09:35:00Z">
+      <w:commentRangeEnd w:id="55"/>
+      <w:del w:id="58" w:author="Craig Parker [2]" w:date="2025-09-09T11:35:00Z" w16du:dateUtc="2025-09-09T09:35:00Z">
         <w:r>
           <w:rPr>
             <w:rStyle w:val="CommentReference"/>
           </w:rPr>
-          <w:commentReference w:id="57"/>
+          <w:commentReference w:id="55"/>
         </w:r>
       </w:del>
-      <w:ins w:id="61" w:author="Craig Parker" w:date="2025-08-22T12:30:00Z">
-        <w:del w:id="62" w:author="Craig Parker [2]" w:date="2025-09-09T11:35:00Z" w16du:dateUtc="2025-09-09T09:35:00Z">
+      <w:ins w:id="59" w:author="Craig Parker" w:date="2025-08-22T12:30:00Z">
+        <w:del w:id="60" w:author="Craig Parker [2]" w:date="2025-09-09T11:35:00Z" w16du:dateUtc="2025-09-09T09:35:00Z">
           <w:r>
             <w:rPr>
               <w:b/>
@@ -9014,8 +8994,8 @@
           </w:r>
         </w:del>
       </w:ins>
-      <w:ins w:id="63" w:author="Lisa van Aardenne" w:date="2025-08-25T18:06:00Z">
-        <w:del w:id="64" w:author="Craig Parker [2]" w:date="2025-09-09T11:35:00Z" w16du:dateUtc="2025-09-09T09:35:00Z">
+      <w:ins w:id="61" w:author="Lisa van Aardenne" w:date="2025-08-25T18:06:00Z">
+        <w:del w:id="62" w:author="Craig Parker [2]" w:date="2025-09-09T11:35:00Z" w16du:dateUtc="2025-09-09T09:35:00Z">
           <w:r>
             <w:rPr>
               <w:b/>
@@ -9025,8 +9005,8 @@
           </w:r>
         </w:del>
       </w:ins>
-      <w:ins w:id="65" w:author="Lisa van Aardenne" w:date="2025-08-25T18:07:00Z">
-        <w:del w:id="66" w:author="Craig Parker [2]" w:date="2025-09-09T11:35:00Z" w16du:dateUtc="2025-09-09T09:35:00Z">
+      <w:ins w:id="63" w:author="Lisa van Aardenne" w:date="2025-08-25T18:07:00Z">
+        <w:del w:id="64" w:author="Craig Parker [2]" w:date="2025-09-09T11:35:00Z" w16du:dateUtc="2025-09-09T09:35:00Z">
           <w:r>
             <w:rPr>
               <w:b/>
@@ -9036,8 +9016,8 @@
           </w:r>
         </w:del>
       </w:ins>
-      <w:ins w:id="67" w:author="Lisa van Aardenne" w:date="2025-08-25T14:27:00Z">
-        <w:del w:id="68" w:author="Craig Parker [2]" w:date="2025-09-09T11:35:00Z" w16du:dateUtc="2025-09-09T09:35:00Z">
+      <w:ins w:id="65" w:author="Lisa van Aardenne" w:date="2025-08-25T14:27:00Z">
+        <w:del w:id="66" w:author="Craig Parker [2]" w:date="2025-09-09T11:35:00Z" w16du:dateUtc="2025-09-09T09:35:00Z">
           <w:r>
             <w:rPr>
               <w:b/>
@@ -9047,8 +9027,8 @@
           </w:r>
         </w:del>
       </w:ins>
-      <w:ins w:id="69" w:author="Craig Parker" w:date="2025-08-22T12:30:00Z">
-        <w:del w:id="70" w:author="Craig Parker [2]" w:date="2025-09-09T11:35:00Z" w16du:dateUtc="2025-09-09T09:35:00Z">
+      <w:ins w:id="67" w:author="Craig Parker" w:date="2025-08-22T12:30:00Z">
+        <w:del w:id="68" w:author="Craig Parker [2]" w:date="2025-09-09T11:35:00Z" w16du:dateUtc="2025-09-09T09:35:00Z">
           <w:r>
             <w:rPr>
               <w:b/>
@@ -9065,7 +9045,7 @@
           </w:r>
         </w:del>
       </w:ins>
-      <w:ins w:id="71" w:author="Craig Parker [2]" w:date="2025-09-09T11:36:00Z" w16du:dateUtc="2025-09-09T09:36:00Z">
+      <w:ins w:id="69" w:author="Craig Parker [2]" w:date="2025-09-09T11:36:00Z" w16du:dateUtc="2025-09-09T09:36:00Z">
         <w:r>
           <w:t xml:space="preserve"> </w:t>
         </w:r>
@@ -9079,13 +9059,13 @@
           </w:rPr>
           <w:t xml:space="preserve">and </w:t>
         </w:r>
-        <w:commentRangeStart w:id="72"/>
-        <w:commentRangeEnd w:id="72"/>
+        <w:commentRangeStart w:id="70"/>
+        <w:commentRangeEnd w:id="70"/>
         <w:r>
           <w:rPr>
             <w:rStyle w:val="CommentReference"/>
           </w:rPr>
-          <w:commentReference w:id="72"/>
+          <w:commentReference w:id="70"/>
         </w:r>
         <w:r>
           <w:rPr>
@@ -9107,24 +9087,8 @@
       <w:r>
         <w:t xml:space="preserve"> </w:t>
       </w:r>
-      <w:ins w:id="73" w:author="Lisa van Aardenne" w:date="2025-08-25T14:33:00Z">
-        <w:r>
-          <w:rPr>
-            <w:u w:val="single"/>
-          </w:rPr>
-          <w:t>sharing on the cloud with</w:t>
-        </w:r>
-        <w:r>
-          <w:t xml:space="preserve"> </w:t>
-        </w:r>
-      </w:ins>
-      <w:commentRangeStart w:id="74"/>
-      <w:commentRangeEnd w:id="74"/>
-      <w:r>
-        <w:rPr>
-          <w:rStyle w:val="CommentReference"/>
-        </w:rPr>
-        <w:commentReference w:id="74"/>
+      <w:r>
+        <w:t xml:space="preserve">sharing on the cloud with  </w:t>
       </w:r>
       <w:r>
         <w:t>the remainder of the HE²AT Center Consortium (e.g., names and contact numbers</w:t>
@@ -9142,8 +9106,8 @@
       <w:pPr>
         <w:pStyle w:val="Heading4"/>
       </w:pPr>
-      <w:bookmarkStart w:id="75" w:name="consortium-shared-data"/>
-      <w:bookmarkEnd w:id="54"/>
+      <w:bookmarkStart w:id="71" w:name="consortium-shared-data"/>
+      <w:bookmarkEnd w:id="52"/>
       <w:r>
         <w:lastRenderedPageBreak/>
         <w:t>4.1.3. Consortium-shared data</w:t>
@@ -9249,8 +9213,8 @@
       <w:pPr>
         <w:pStyle w:val="Heading4"/>
       </w:pPr>
-      <w:bookmarkStart w:id="76" w:name="rp1rp2-de-identified-data"/>
-      <w:bookmarkEnd w:id="75"/>
+      <w:bookmarkStart w:id="72" w:name="rp1rp2-de-identified-data"/>
+      <w:bookmarkEnd w:id="71"/>
       <w:r>
         <w:lastRenderedPageBreak/>
         <w:t>4.1.4. RP1/RP2 De-identified data</w:t>
@@ -9261,30 +9225,27 @@
         <w:pStyle w:val="FirstParagraph"/>
       </w:pPr>
       <w:r>
-        <w:t xml:space="preserve">Data that has been further processed and de-identified falls into this category. The HE²AT Center owns this de-identified data. The de-identified data is retained indefinitely unless agreed otherwise in the DTA with the Data Provider. Where possible, requests from Data Providers for an arrangement other than those described here shall be accommodated. Access is granted to </w:t>
+        <w:t xml:space="preserve">Data that has been further processed and de-identified falls into this category. The HE²AT Center owns this de-identified data. The de-identified data is retained indefinitely unless agreed otherwise in the DTA with the Data Provider. Where possible, requests from Data Providers for an arrangement other than those described here shall be accommodated. </w:t>
+      </w:r>
+      <w:r>
+        <w:t xml:space="preserve">Access is granted to Institutions representing research projects which </w:t>
+      </w:r>
+      <w:r>
+        <w:t>have met specific conditions and requirements set by the HE²AT Cent</w:t>
+      </w:r>
+      <w:r>
+        <w:t>re</w:t>
+      </w:r>
+      <w:r>
+        <w:t xml:space="preserve"> Data Access Committee. The de-identified data may be </w:t>
       </w:r>
       <w:proofErr w:type="spellStart"/>
-      <w:ins w:id="77" w:author="Lisa van Aardenne" w:date="2025-08-25T14:37:00Z">
-        <w:r>
-          <w:t>Instittions</w:t>
-        </w:r>
-        <w:proofErr w:type="spellEnd"/>
-        <w:r>
-          <w:t xml:space="preserve"> representing research proj</w:t>
-        </w:r>
-      </w:ins>
-      <w:ins w:id="78" w:author="Lisa van Aardenne" w:date="2025-08-25T14:38:00Z">
-        <w:r>
-          <w:t>ects which</w:t>
-        </w:r>
-      </w:ins>
-      <w:del w:id="79" w:author="Lisa van Aardenne" w:date="2025-08-25T14:37:00Z">
-        <w:r>
-          <w:delText>External Researchers outside the HE²AT Center Consortium who</w:delText>
-        </w:r>
-      </w:del>
-      <w:r>
-        <w:t xml:space="preserve"> have met specific conditions and requirements set by the HE²AT Center Data Access Committee. The de-identified data may be </w:t>
+      <w:r>
+        <w:t>harmonised</w:t>
+      </w:r>
+      <w:proofErr w:type="spellEnd"/>
+      <w:r>
+        <w:t xml:space="preserve"> health data, or </w:t>
       </w:r>
       <w:proofErr w:type="spellStart"/>
       <w:r>
@@ -9292,62 +9253,54 @@
       </w:r>
       <w:proofErr w:type="spellEnd"/>
       <w:r>
-        <w:t xml:space="preserve"> health data, or </w:t>
+        <w:t xml:space="preserve"> health data integrated with climate and other environmental data, depending on available resources and type of data request.</w:t>
+      </w:r>
+    </w:p>
+    <w:p>
+      <w:pPr>
+        <w:pStyle w:val="BodyText"/>
+      </w:pPr>
+      <w:r>
+        <w:t xml:space="preserve">The HE²AT Center will apply the principles of de-identification through two complementary approaches. </w:t>
+      </w:r>
+      <w:proofErr w:type="gramStart"/>
+      <w:r>
+        <w:t xml:space="preserve">The Safe </w:t>
       </w:r>
       <w:proofErr w:type="spellStart"/>
       <w:r>
-        <w:t>harmonised</w:t>
+        <w:t>Harbour</w:t>
       </w:r>
       <w:proofErr w:type="spellEnd"/>
       <w:r>
-        <w:t xml:space="preserve"> health data integrated with climate and other environmental data, depending on available resources and type of data request.</w:t>
-      </w:r>
-    </w:p>
-    <w:p>
-      <w:pPr>
-        <w:pStyle w:val="BodyText"/>
-      </w:pPr>
-      <w:r>
-        <w:t xml:space="preserve">The HE²AT Center will apply the principles of de-identification through two complementary approaches. </w:t>
-      </w:r>
-      <w:proofErr w:type="gramStart"/>
-      <w:r>
-        <w:t xml:space="preserve">The Safe </w:t>
+        <w:t xml:space="preserve"> approach,</w:t>
+      </w:r>
+      <w:proofErr w:type="gramEnd"/>
+      <w:r>
+        <w:t xml:space="preserve"> is </w:t>
       </w:r>
       <w:proofErr w:type="spellStart"/>
       <w:r>
+        <w:t>utilised</w:t>
+      </w:r>
+      <w:proofErr w:type="spellEnd"/>
+      <w:r>
+        <w:t xml:space="preserve"> where feasible, where 18 identifying variables are removed, including all dates, and high-resolution geolocation information. Additionally, the expert determination approach, which relies on an external expert to certify the minimal risk of re-identification, is used in conjunction with, and in certain cases, in lieu of the Safe </w:t>
+      </w:r>
+      <w:proofErr w:type="spellStart"/>
+      <w:r>
         <w:t>Harbour</w:t>
       </w:r>
       <w:proofErr w:type="spellEnd"/>
       <w:r>
-        <w:t xml:space="preserve"> approach,</w:t>
-      </w:r>
-      <w:proofErr w:type="gramEnd"/>
-      <w:r>
-        <w:t xml:space="preserve"> is </w:t>
+        <w:t xml:space="preserve"> approach, where appropriate. This data type is </w:t>
       </w:r>
       <w:proofErr w:type="spellStart"/>
       <w:r>
-        <w:t>utilised</w:t>
+        <w:t>categorised</w:t>
       </w:r>
       <w:proofErr w:type="spellEnd"/>
       <w:r>
-        <w:t xml:space="preserve"> where feasible, where 18 identifying variables are removed, including all dates, and high-resolution geolocation information. Additionally, the expert determination approach, which relies on an external expert to certify the minimal risk of re-identification, is used in conjunction with, and in certain cases, in lieu of the Safe </w:t>
-      </w:r>
-      <w:proofErr w:type="spellStart"/>
-      <w:r>
-        <w:t>Harbour</w:t>
-      </w:r>
-      <w:proofErr w:type="spellEnd"/>
-      <w:r>
-        <w:t xml:space="preserve"> approach, where appropriate. This data type is </w:t>
-      </w:r>
-      <w:proofErr w:type="spellStart"/>
-      <w:r>
-        <w:t>categorised</w:t>
-      </w:r>
-      <w:proofErr w:type="spellEnd"/>
-      <w:r>
         <w:t xml:space="preserve"> as de-identified data under POPIA, meaning it has been thoroughly de-identified to prevent any reasonable possibility of re-identification. The identifiers in this dataset are limited to health variables without any direct or indirect personal identifiers. For example, age data for pregnant or postpartum women in RP1, and for adolescents and adults in RP2 will be reported in five-year age bands rather than as age whole numbers, and the geographic data will be reported in larger units, such as cities or districts.</w:t>
       </w:r>
     </w:p>
@@ -9355,8 +9308,8 @@
       <w:pPr>
         <w:pStyle w:val="Heading4"/>
       </w:pPr>
-      <w:bookmarkStart w:id="80" w:name="inferential-data"/>
-      <w:bookmarkEnd w:id="76"/>
+      <w:bookmarkStart w:id="73" w:name="inferential-data"/>
+      <w:bookmarkEnd w:id="72"/>
       <w:r>
         <w:t>4.1.5. Inferential data</w:t>
       </w:r>
@@ -9424,9 +9377,9 @@
       <w:pPr>
         <w:pStyle w:val="Caption"/>
         <w:rPr>
-          <w:ins w:id="81" w:author="Craig Parker" w:date="2025-08-05T12:05:00Z" w16du:dateUtc="2025-08-05T10:05:00Z"/>
-        </w:rPr>
-        <w:pPrChange w:id="82" w:author="Craig Parker" w:date="2025-08-05T12:05:00Z" w16du:dateUtc="2025-08-05T10:05:00Z">
+          <w:ins w:id="74" w:author="Craig Parker" w:date="2025-08-05T12:05:00Z" w16du:dateUtc="2025-08-05T10:05:00Z"/>
+        </w:rPr>
+        <w:pPrChange w:id="75" w:author="Craig Parker" w:date="2025-08-05T12:05:00Z" w16du:dateUtc="2025-08-05T10:05:00Z">
           <w:pPr>
             <w:pStyle w:val="BodyText"/>
           </w:pPr>
@@ -9461,14 +9414,14 @@
       <w:pPr>
         <w:pStyle w:val="Heading3"/>
       </w:pPr>
-      <w:bookmarkStart w:id="83" w:name="_Toc206760665"/>
-      <w:bookmarkStart w:id="84" w:name="climateweather-data"/>
-      <w:bookmarkEnd w:id="52"/>
-      <w:bookmarkEnd w:id="80"/>
+      <w:bookmarkStart w:id="76" w:name="_Toc206760665"/>
+      <w:bookmarkStart w:id="77" w:name="climateweather-data"/>
+      <w:bookmarkEnd w:id="50"/>
+      <w:bookmarkEnd w:id="73"/>
       <w:r>
         <w:t>4.2. Climate/weather data</w:t>
       </w:r>
-      <w:bookmarkEnd w:id="83"/>
+      <w:bookmarkEnd w:id="76"/>
     </w:p>
     <w:p>
       <w:pPr>
@@ -9554,17 +9507,17 @@
       <w:r>
         <w:t xml:space="preserve"> will be accessed through open data repositories, such as the Copernicus Climate Data Store (CDS), Earth System Grid Federation and Sentinel data systems. The data will be stored on IBM Research Africa and CSAG/UCT systems</w:t>
       </w:r>
-      <w:ins w:id="85" w:author="Lisa van Aardenne" w:date="2025-08-25T16:40:00Z">
+      <w:ins w:id="78" w:author="Lisa van Aardenne" w:date="2025-08-25T16:40:00Z">
         <w:r>
           <w:t>.</w:t>
         </w:r>
       </w:ins>
-      <w:ins w:id="86" w:author="Craig Parker" w:date="2025-08-22T12:32:00Z">
+      <w:ins w:id="79" w:author="Craig Parker" w:date="2025-08-22T12:32:00Z">
         <w:r>
           <w:t xml:space="preserve"> </w:t>
         </w:r>
       </w:ins>
-      <w:del w:id="87" w:author="Craig Parker" w:date="2025-08-05T12:02:00Z">
+      <w:del w:id="80" w:author="Craig Parker" w:date="2025-08-05T12:02:00Z">
         <w:r>
           <w:delText xml:space="preserve"> </w:delText>
         </w:r>
@@ -9576,7 +9529,7 @@
           <w:delText>[TRACKED CHANGE] and WHC-managed cloud services with auto-scaling capabilities for handling variable seasonal data volumes and improved accessibility for authorised researchers</w:delText>
         </w:r>
       </w:del>
-      <w:ins w:id="88" w:author="Lisa van Aardenne" w:date="2025-08-25T16:37:00Z">
+      <w:ins w:id="81" w:author="Lisa van Aardenne" w:date="2025-08-25T16:37:00Z">
         <w:r>
           <w:rPr>
             <w:b/>
@@ -9585,7 +9538,7 @@
           <w:t xml:space="preserve"> </w:t>
         </w:r>
       </w:ins>
-      <w:ins w:id="89" w:author="Craig Parker [2]" w:date="2025-09-09T11:52:00Z" w16du:dateUtc="2025-09-09T09:52:00Z">
+      <w:ins w:id="82" w:author="Craig Parker [2]" w:date="2025-09-09T11:52:00Z" w16du:dateUtc="2025-09-09T09:52:00Z">
         <w:r>
           <w:rPr>
             <w:b/>
@@ -9610,74 +9563,71 @@
           <w:t xml:space="preserve"> will also be stored on the WHC-managed cloud services to allow for the association / linkage with the health datasets. </w:t>
         </w:r>
       </w:ins>
-      <w:del w:id="90" w:author="Lisa van Aardenne" w:date="2025-08-25T16:41:00Z">
+      <w:r>
+        <w:t xml:space="preserve"> </w:t>
+      </w:r>
+      <w:r>
+        <w:t>CSAG/UCT will be responsible for managing and updating the relevant data indexes during this period</w:t>
+      </w:r>
+      <w:r>
+        <w:t>. These datasets also follow open data policies, typically requiring citation when used for non-commercial research.</w:t>
+      </w:r>
+    </w:p>
+    <w:p>
+      <w:pPr>
+        <w:pStyle w:val="Heading3"/>
+      </w:pPr>
+      <w:bookmarkStart w:id="83" w:name="_Toc206760666"/>
+      <w:bookmarkStart w:id="84" w:name="arealgeospatial-socio-economic-data"/>
+      <w:bookmarkEnd w:id="77"/>
+      <w:r>
+        <w:lastRenderedPageBreak/>
+        <w:t>4.3. Areal/geospatial socio-economic data</w:t>
+      </w:r>
+      <w:bookmarkEnd w:id="83"/>
+    </w:p>
+    <w:p>
+      <w:pPr>
+        <w:pStyle w:val="FirstParagraph"/>
+      </w:pPr>
+      <w:r>
+        <w:t>These data represent measures of socio-economic and related conditions, such as household economic status, access to services such as water and sanitation, and dwelling type. Typical sources include national census data and more focused household and demographic survey data.</w:t>
+      </w:r>
+    </w:p>
+    <w:p>
+      <w:pPr>
+        <w:pStyle w:val="BodyText"/>
+      </w:pPr>
+      <w:r>
+        <w:t>Socio-economic data will be sourced from open and restricted-access repositories (e.g., South African census data and GCRO Quality of Life Surveys). Primary copies will be indexed and stored on CSAG/UCT data storage</w:t>
+      </w:r>
+      <w:del w:id="85" w:author="Craig Parker [2]" w:date="2025-09-11T14:50:00Z" w16du:dateUtc="2025-09-11T12:50:00Z">
         <w:r>
-          <w:delText xml:space="preserve">, with </w:delText>
+          <w:delText>, while a copy will be stored on the WHC-managed cloud services</w:delText>
         </w:r>
       </w:del>
-      <w:r>
-        <w:t xml:space="preserve">CSAG/UCT </w:t>
-      </w:r>
-      <w:ins w:id="91" w:author="Lisa van Aardenne" w:date="2025-08-25T16:41:00Z">
+      <w:ins w:id="86" w:author="Craig Parker [2]" w:date="2025-09-11T14:50:00Z" w16du:dateUtc="2025-09-11T12:50:00Z">
         <w:r>
-          <w:t xml:space="preserve">will be </w:t>
+          <w:t xml:space="preserve"> </w:t>
         </w:r>
-      </w:ins>
-      <w:r>
-        <w:t>responsible for managing and updating the relevant data indexes</w:t>
-      </w:r>
-      <w:ins w:id="92" w:author="Lisa van Aardenne" w:date="2025-08-25T16:39:00Z">
-        <w:r>
-          <w:t xml:space="preserve"> during this period</w:t>
-        </w:r>
-      </w:ins>
-      <w:r>
-        <w:t>. These datasets also follow open data policies, typically requiring citation when used for non-commercial research.</w:t>
-      </w:r>
-    </w:p>
-    <w:p>
-      <w:pPr>
-        <w:pStyle w:val="Heading3"/>
-      </w:pPr>
-      <w:bookmarkStart w:id="93" w:name="_Toc206760666"/>
-      <w:bookmarkStart w:id="94" w:name="arealgeospatial-socio-economic-data"/>
-      <w:bookmarkEnd w:id="84"/>
-      <w:r>
-        <w:lastRenderedPageBreak/>
-        <w:t>4.3. Areal/geospatial socio-economic data</w:t>
-      </w:r>
-      <w:bookmarkEnd w:id="93"/>
-    </w:p>
-    <w:p>
-      <w:pPr>
-        <w:pStyle w:val="FirstParagraph"/>
-      </w:pPr>
-      <w:r>
-        <w:t>These data represent measures of socio-economic and related conditions, such as household economic status, access to services such as water and sanitation, and dwelling type. Typical sources include national census data and more focused household and demographic survey data.</w:t>
-      </w:r>
-    </w:p>
-    <w:p>
-      <w:pPr>
-        <w:pStyle w:val="BodyText"/>
-      </w:pPr>
-      <w:r>
-        <w:t>Socio-economic data will be sourced from open and restricted-access repositories (e.g., South African census data and GCRO Quality of Life Surveys). Primary copies will be indexed and stored on CSAG/UCT data storage</w:t>
-      </w:r>
-      <w:ins w:id="95" w:author="Lisa van Aardenne" w:date="2025-08-25T16:43:00Z">
         <w:r>
           <w:t>, while a copy will be stored on the WHC-managed cloud services</w:t>
         </w:r>
       </w:ins>
       <w:r>
-        <w:t>. The IBM Research Africa team will acquire and have access to some of the geo-reference Quality of Life survey data from the GCRO and will undertake processing of this data from their own internal computing systems. Outputs and indices calculated from the data by IBM Research Africa will be shared with the rest of the HE²AT Center Consortium through the HE²AT Center’s DAC</w:t>
-      </w:r>
-      <w:del w:id="96" w:author="Lisa van Aardenne" w:date="2025-08-25T16:42:00Z">
-        <w:r>
-          <w:delText xml:space="preserve"> at UCT</w:delText>
-        </w:r>
-      </w:del>
+        <w:t>. The IBM Research Africa team will acquire and have access to some of the geo-reference Quality of Life survey data from the GCRO</w:t>
+      </w:r>
       <w:r>
         <w:t>.</w:t>
+      </w:r>
+      <w:r>
+        <w:t xml:space="preserve"> </w:t>
+      </w:r>
+      <w:r>
+        <w:t>It</w:t>
+      </w:r>
+      <w:r>
+        <w:t xml:space="preserve"> will undertake processing of this data from their own internal computing systems. Outputs and indices calculated from the data by IBM Research Africa will be shared with the rest of the HE²AT Center Consortium through the HE²AT Center’s DAC.</w:t>
       </w:r>
     </w:p>
     <w:p>
@@ -9717,20 +9667,20 @@
           <w:cols w:space="720"/>
         </w:sectPr>
       </w:pPr>
-      <w:bookmarkStart w:id="97" w:name="Xfc9d5062703af22053e042226c9b85f6cfdea68"/>
-      <w:bookmarkEnd w:id="49"/>
-      <w:bookmarkEnd w:id="94"/>
+      <w:bookmarkStart w:id="87" w:name="Xfc9d5062703af22053e042226c9b85f6cfdea68"/>
+      <w:bookmarkEnd w:id="47"/>
+      <w:bookmarkEnd w:id="84"/>
     </w:p>
     <w:p>
       <w:pPr>
         <w:pStyle w:val="Heading2"/>
       </w:pPr>
-      <w:bookmarkStart w:id="98" w:name="_Toc206760667"/>
+      <w:bookmarkStart w:id="88" w:name="_Toc206760667"/>
       <w:r>
         <w:lastRenderedPageBreak/>
         <w:t>5. Data transfer, and ethics approvals and notification</w:t>
       </w:r>
-      <w:bookmarkEnd w:id="98"/>
+      <w:bookmarkEnd w:id="88"/>
     </w:p>
     <w:p>
       <w:pPr>
@@ -9752,12 +9702,12 @@
       <w:pPr>
         <w:pStyle w:val="Heading3"/>
       </w:pPr>
-      <w:bookmarkStart w:id="99" w:name="_Toc206760668"/>
-      <w:bookmarkStart w:id="100" w:name="data-transfer-agreement"/>
+      <w:bookmarkStart w:id="89" w:name="_Toc206760668"/>
+      <w:bookmarkStart w:id="90" w:name="data-transfer-agreement"/>
       <w:r>
         <w:t>5.1. Data Transfer Agreement:</w:t>
       </w:r>
-      <w:bookmarkEnd w:id="99"/>
+      <w:bookmarkEnd w:id="89"/>
     </w:p>
     <w:p>
       <w:pPr>
@@ -9782,13 +9732,13 @@
       <w:pPr>
         <w:pStyle w:val="Heading3"/>
       </w:pPr>
-      <w:bookmarkStart w:id="101" w:name="_Toc206760669"/>
-      <w:bookmarkStart w:id="102" w:name="X36f2f6f938b086ff6c1f45029638f55711fc1ea"/>
-      <w:bookmarkEnd w:id="100"/>
+      <w:bookmarkStart w:id="91" w:name="_Toc206760669"/>
+      <w:bookmarkStart w:id="92" w:name="X36f2f6f938b086ff6c1f45029638f55711fc1ea"/>
+      <w:bookmarkEnd w:id="90"/>
       <w:r>
         <w:t>5.2. Ethics committee notification for new studies:</w:t>
       </w:r>
-      <w:bookmarkEnd w:id="101"/>
+      <w:bookmarkEnd w:id="91"/>
     </w:p>
     <w:p>
       <w:pPr>
@@ -9839,15 +9789,15 @@
           <w:cols w:space="720"/>
         </w:sectPr>
       </w:pPr>
-      <w:bookmarkStart w:id="103" w:name="Xc2b56e42c4a0cc1f5f67fe2de97181bc59bd9b5"/>
-      <w:bookmarkEnd w:id="97"/>
-      <w:bookmarkEnd w:id="102"/>
+      <w:bookmarkStart w:id="93" w:name="Xc2b56e42c4a0cc1f5f67fe2de97181bc59bd9b5"/>
+      <w:bookmarkEnd w:id="87"/>
+      <w:bookmarkEnd w:id="92"/>
     </w:p>
     <w:p>
       <w:pPr>
         <w:pStyle w:val="Heading2"/>
       </w:pPr>
-      <w:bookmarkStart w:id="104" w:name="_Toc206760670"/>
+      <w:bookmarkStart w:id="94" w:name="_Toc206760670"/>
       <w:r>
         <w:lastRenderedPageBreak/>
         <w:t xml:space="preserve">6. Pre-processing and </w:t>
@@ -9860,7 +9810,7 @@
       <w:r>
         <w:t xml:space="preserve"> of health data</w:t>
       </w:r>
-      <w:bookmarkEnd w:id="104"/>
+      <w:bookmarkEnd w:id="94"/>
     </w:p>
     <w:p>
       <w:pPr>
@@ -9882,12 +9832,12 @@
       <w:pPr>
         <w:pStyle w:val="Heading3"/>
       </w:pPr>
-      <w:bookmarkStart w:id="105" w:name="_Toc206760671"/>
-      <w:bookmarkStart w:id="106" w:name="pre-processing"/>
+      <w:bookmarkStart w:id="95" w:name="_Toc206760671"/>
+      <w:bookmarkStart w:id="96" w:name="pre-processing"/>
       <w:r>
         <w:t>6.1. Pre-processing</w:t>
       </w:r>
-      <w:bookmarkEnd w:id="105"/>
+      <w:bookmarkEnd w:id="95"/>
     </w:p>
     <w:p>
       <w:pPr>
@@ -9904,7 +9854,7 @@
       <w:r>
         <w:t xml:space="preserve"> to access incoming data securely stored on UCT data servers</w:t>
       </w:r>
-      <w:del w:id="107" w:author="Craig Parker" w:date="2025-08-15T07:37:00Z">
+      <w:del w:id="97" w:author="Craig Parker" w:date="2025-08-15T07:37:00Z">
         <w:r>
           <w:delText xml:space="preserve"> </w:delText>
         </w:r>
@@ -9919,7 +9869,7 @@
           <w:delText>.</w:delText>
         </w:r>
       </w:del>
-      <w:ins w:id="108" w:author="Craig Parker [2]" w:date="2025-09-09T11:57:00Z" w16du:dateUtc="2025-09-09T09:57:00Z">
+      <w:ins w:id="98" w:author="Craig Parker [2]" w:date="2025-09-09T11:57:00Z" w16du:dateUtc="2025-09-09T09:57:00Z">
         <w:r>
           <w:t xml:space="preserve"> </w:t>
         </w:r>
@@ -10022,13 +9972,13 @@
       <w:pPr>
         <w:pStyle w:val="Heading3"/>
       </w:pPr>
-      <w:bookmarkStart w:id="109" w:name="_Toc206760672"/>
-      <w:bookmarkStart w:id="110" w:name="variable-mapping"/>
-      <w:bookmarkEnd w:id="106"/>
+      <w:bookmarkStart w:id="99" w:name="_Toc206760672"/>
+      <w:bookmarkStart w:id="100" w:name="variable-mapping"/>
+      <w:bookmarkEnd w:id="96"/>
       <w:r>
         <w:t>6.2. Variable mapping</w:t>
       </w:r>
-      <w:bookmarkEnd w:id="109"/>
+      <w:bookmarkEnd w:id="99"/>
     </w:p>
     <w:p>
       <w:pPr>
@@ -10126,13 +10076,13 @@
       <w:pPr>
         <w:pStyle w:val="Heading3"/>
       </w:pPr>
-      <w:bookmarkStart w:id="111" w:name="_Toc206760673"/>
-      <w:bookmarkStart w:id="112" w:name="mapping-validation"/>
-      <w:bookmarkEnd w:id="110"/>
+      <w:bookmarkStart w:id="101" w:name="_Toc206760673"/>
+      <w:bookmarkStart w:id="102" w:name="mapping-validation"/>
+      <w:bookmarkEnd w:id="100"/>
       <w:r>
         <w:t>6.3. Mapping validation</w:t>
       </w:r>
-      <w:bookmarkEnd w:id="111"/>
+      <w:bookmarkEnd w:id="101"/>
     </w:p>
     <w:p>
       <w:pPr>
@@ -10194,13 +10144,13 @@
       <w:pPr>
         <w:pStyle w:val="Heading3"/>
       </w:pPr>
-      <w:bookmarkStart w:id="113" w:name="_Toc206760674"/>
-      <w:bookmarkStart w:id="114" w:name="database-population"/>
-      <w:bookmarkEnd w:id="112"/>
+      <w:bookmarkStart w:id="103" w:name="_Toc206760674"/>
+      <w:bookmarkStart w:id="104" w:name="database-population"/>
+      <w:bookmarkEnd w:id="102"/>
       <w:r>
         <w:t>6.4. Database population</w:t>
       </w:r>
-      <w:bookmarkEnd w:id="113"/>
+      <w:bookmarkEnd w:id="103"/>
     </w:p>
     <w:p>
       <w:pPr>
@@ -10222,58 +10172,21 @@
       <w:pPr>
         <w:pStyle w:val="BodyText"/>
         <w:rPr>
-          <w:del w:id="115" w:author="Craig Parker" w:date="2025-08-05T12:02:00Z" w16du:dateUtc="2025-08-05T10:02:00Z"/>
-        </w:rPr>
-      </w:pPr>
-      <w:del w:id="116" w:author="Craig Parker" w:date="2025-08-05T12:02:00Z" w16du:dateUtc="2025-08-05T10:02:00Z">
+          <w:ins w:id="105" w:author="Craig Parker [2]" w:date="2025-09-11T14:53:00Z" w16du:dateUtc="2025-09-11T12:53:00Z"/>
+          <w:b/>
+          <w:bCs/>
+        </w:rPr>
+      </w:pPr>
+      <w:ins w:id="106" w:author="Craig Parker [2]" w:date="2025-09-11T14:53:00Z" w16du:dateUtc="2025-09-11T12:53:00Z">
         <w:r>
           <w:rPr>
             <w:b/>
             <w:bCs/>
           </w:rPr>
           <w:lastRenderedPageBreak/>
-          <w:delText>[TRACKED CHANGE] Database population utilises both existing UCT infrastructure and cloud-native database services, providing automated backup and recovery systems with enhanced data integrity and disaster recovery capabilities.</w:delText>
+          <w:t xml:space="preserve">Database population initially </w:t>
         </w:r>
-      </w:del>
-    </w:p>
-    <w:p>
-      <w:pPr>
-        <w:pStyle w:val="BodyText"/>
-        <w:rPr>
-          <w:ins w:id="117" w:author="Craig Parker" w:date="2025-08-22T12:35:00Z" w16du:dateUtc="2025-08-22T10:35:00Z"/>
-          <w:b/>
-          <w:bCs/>
-        </w:rPr>
-      </w:pPr>
-      <w:ins w:id="118" w:author="Craig Parker" w:date="2025-08-22T12:35:00Z">
-        <w:r>
-          <w:rPr>
-            <w:b/>
-            <w:bCs/>
-          </w:rPr>
-          <w:t xml:space="preserve">Database population </w:t>
-        </w:r>
-      </w:ins>
-      <w:ins w:id="119" w:author="Lisa van Aardenne" w:date="2025-08-25T16:51:00Z">
-        <w:r>
-          <w:rPr>
-            <w:b/>
-            <w:bCs/>
-          </w:rPr>
-          <w:t>init</w:t>
-        </w:r>
-      </w:ins>
-      <w:ins w:id="120" w:author="Lisa van Aardenne" w:date="2025-08-25T16:53:00Z">
-        <w:r>
-          <w:rPr>
-            <w:b/>
-            <w:bCs/>
-          </w:rPr>
-          <w:t xml:space="preserve">ially </w:t>
-        </w:r>
-      </w:ins>
-      <w:proofErr w:type="spellStart"/>
-      <w:ins w:id="121" w:author="Craig Parker" w:date="2025-08-22T12:35:00Z">
+        <w:proofErr w:type="spellStart"/>
         <w:r>
           <w:rPr>
             <w:b/>
@@ -10295,16 +10208,7 @@
             <w:b/>
             <w:bCs/>
           </w:rPr>
-          <w:t>services</w:t>
-        </w:r>
-      </w:ins>
-      <w:ins w:id="122" w:author="Lisa van Aardenne" w:date="2025-08-25T16:53:00Z">
-        <w:r>
-          <w:rPr>
-            <w:b/>
-            <w:bCs/>
-          </w:rPr>
-          <w:t>, but</w:t>
+          <w:t>services, but</w:t>
         </w:r>
         <w:proofErr w:type="gramEnd"/>
         <w:r>
@@ -10312,36 +10216,9 @@
             <w:b/>
             <w:bCs/>
           </w:rPr>
-          <w:t xml:space="preserve"> will shift to the cloud-based </w:t>
+          <w:t xml:space="preserve"> will shift to the cloud-based system by the end of Year 5, providing automated backup and recovery systems with enhanced data integrity and disaster recovery capabilities.</w:t>
         </w:r>
       </w:ins>
-      <w:ins w:id="123" w:author="Lisa van Aardenne" w:date="2025-08-25T16:54:00Z">
-        <w:r>
-          <w:rPr>
-            <w:b/>
-            <w:bCs/>
-          </w:rPr>
-          <w:t>system by the end of Year 5</w:t>
-        </w:r>
-      </w:ins>
-      <w:ins w:id="124" w:author="Craig Parker" w:date="2025-08-22T12:35:00Z">
-        <w:del w:id="125" w:author="Lisa van Aardenne" w:date="2025-08-25T16:54:00Z">
-          <w:r>
-            <w:rPr>
-              <w:b/>
-              <w:bCs/>
-            </w:rPr>
-            <w:delText xml:space="preserve"> during the transition period</w:delText>
-          </w:r>
-        </w:del>
-        <w:r>
-          <w:rPr>
-            <w:b/>
-            <w:bCs/>
-          </w:rPr>
-          <w:t>, providing automated backup and recovery systems with enhanced data integrity and disaster recovery capabilities.</w:t>
-        </w:r>
-      </w:ins>
     </w:p>
     <w:p>
       <w:pPr>
@@ -10379,102 +10256,17 @@
       <w:pPr>
         <w:pStyle w:val="Heading3"/>
       </w:pPr>
-      <w:bookmarkStart w:id="126" w:name="_Toc206760675"/>
-      <w:bookmarkStart w:id="127" w:name="rp1rp2-de-identified-dataset-creation"/>
-      <w:bookmarkEnd w:id="114"/>
+      <w:bookmarkStart w:id="107" w:name="_Toc206760675"/>
+      <w:bookmarkStart w:id="108" w:name="rp1rp2-de-identified-dataset-creation"/>
+      <w:bookmarkEnd w:id="104"/>
       <w:r>
         <w:t>6.5. RP1/RP2 De-Identified Dataset Creation</w:t>
       </w:r>
-      <w:bookmarkEnd w:id="126"/>
-    </w:p>
-    <w:p>
-      <w:pPr>
-        <w:pStyle w:val="FirstParagraph"/>
-      </w:pPr>
-      <w:r>
-        <w:t xml:space="preserve">The final stage involves creating a de-identified dataset that can be shared with </w:t>
-      </w:r>
-      <w:del w:id="128" w:author="Craig Parker [2]" w:date="2025-09-09T11:57:00Z" w16du:dateUtc="2025-09-09T09:57:00Z">
-        <w:r>
-          <w:delText>External</w:delText>
-        </w:r>
-      </w:del>
-      <w:ins w:id="129" w:author="Craig Parker [2]" w:date="2025-09-09T11:57:00Z" w16du:dateUtc="2025-09-09T09:57:00Z">
-        <w:r>
-          <w:t>bona</w:t>
-        </w:r>
-      </w:ins>
-      <w:r>
-        <w:t xml:space="preserve"> </w:t>
-      </w:r>
-      <w:del w:id="130" w:author="Craig Parker [2]" w:date="2025-09-09T11:57:00Z" w16du:dateUtc="2025-09-09T09:57:00Z">
-        <w:r>
-          <w:delText>Bona</w:delText>
-        </w:r>
-      </w:del>
-      <w:ins w:id="131" w:author="Craig Parker [2]" w:date="2025-09-09T11:57:00Z" w16du:dateUtc="2025-09-09T09:57:00Z">
-        <w:r>
-          <w:t>fide</w:t>
-        </w:r>
-      </w:ins>
-      <w:r>
-        <w:t xml:space="preserve"> </w:t>
-      </w:r>
-      <w:del w:id="132" w:author="Craig Parker [2]" w:date="2025-09-09T11:57:00Z" w16du:dateUtc="2025-09-09T09:57:00Z">
-        <w:r>
-          <w:delText>Fide</w:delText>
-        </w:r>
-      </w:del>
-      <w:ins w:id="133" w:author="Craig Parker [2]" w:date="2025-09-09T11:57:00Z" w16du:dateUtc="2025-09-09T09:57:00Z">
-        <w:r>
-          <w:t>external</w:t>
-        </w:r>
-      </w:ins>
-      <w:r>
-        <w:t xml:space="preserve"> </w:t>
-      </w:r>
-      <w:del w:id="134" w:author="Craig Parker [2]" w:date="2025-09-09T11:57:00Z" w16du:dateUtc="2025-09-09T09:57:00Z">
-        <w:r>
-          <w:delText>Researchers</w:delText>
-        </w:r>
-      </w:del>
-      <w:ins w:id="135" w:author="Lisa van Aardenne" w:date="2025-08-25T16:56:00Z">
-        <w:del w:id="136" w:author="Craig Parker [2]" w:date="2025-09-09T11:57:00Z" w16du:dateUtc="2025-09-09T09:57:00Z">
-          <w:r>
-            <w:delText xml:space="preserve"> </w:delText>
-          </w:r>
-        </w:del>
-      </w:ins>
-      <w:ins w:id="137" w:author="Craig Parker [2]" w:date="2025-09-09T11:57:00Z" w16du:dateUtc="2025-09-09T09:57:00Z">
-        <w:r>
-          <w:t>r</w:t>
-        </w:r>
-        <w:r>
-          <w:t xml:space="preserve">esearchers </w:t>
-        </w:r>
-      </w:ins>
-      <w:ins w:id="138" w:author="Lisa van Aardenne" w:date="2025-08-25T16:56:00Z">
-        <w:r>
-          <w:t xml:space="preserve">for </w:t>
-        </w:r>
-        <w:del w:id="139" w:author="Craig Parker [2]" w:date="2025-09-09T11:57:00Z" w16du:dateUtc="2025-09-09T09:57:00Z">
-          <w:r>
-            <w:delText>othe</w:delText>
-          </w:r>
-        </w:del>
-      </w:ins>
-      <w:ins w:id="140" w:author="Craig Parker [2]" w:date="2025-09-09T11:57:00Z" w16du:dateUtc="2025-09-09T09:57:00Z">
-        <w:r>
-          <w:t>thei</w:t>
-        </w:r>
-      </w:ins>
-      <w:ins w:id="141" w:author="Lisa van Aardenne" w:date="2025-08-25T16:56:00Z">
-        <w:r>
-          <w:t>r studies</w:t>
-        </w:r>
-      </w:ins>
-      <w:r>
-        <w:t xml:space="preserve">. The Core Data Team continues with the de-identification process, ensuring that the dataset meets the highest privacy standards. The Safe </w:t>
+      <w:bookmarkEnd w:id="107"/>
+    </w:p>
+    <w:p>
+      <w:r>
+        <w:t xml:space="preserve">The final stage involves creating a de-identified dataset that can be shared with bona fide external researchers for their studies. The Core Data Team continues with the de-identification process, ensuring that the dataset meets the highest privacy standards. The Safe </w:t>
       </w:r>
       <w:proofErr w:type="spellStart"/>
       <w:r>
@@ -10485,7 +10277,6 @@
         <w:t xml:space="preserve"> method is supplemented by expert determination, supervised by the Data Access Committee, to ensure that the dataset complies with the HE²AT Center’s ethical and legal guidelines. Once these steps are complete, the dataset can be shared under the terms outlined in Section 10.</w:t>
       </w:r>
     </w:p>
-    <w:p/>
     <w:p>
       <w:pPr>
         <w:pStyle w:val="Heading2"/>
@@ -10498,31 +10289,31 @@
           <w:cols w:space="720"/>
         </w:sectPr>
       </w:pPr>
-      <w:bookmarkStart w:id="142" w:name="integration-and-analysis-interfaces"/>
-      <w:bookmarkEnd w:id="103"/>
-      <w:bookmarkEnd w:id="127"/>
+      <w:bookmarkStart w:id="109" w:name="integration-and-analysis-interfaces"/>
+      <w:bookmarkEnd w:id="93"/>
+      <w:bookmarkEnd w:id="108"/>
     </w:p>
     <w:p>
       <w:pPr>
         <w:pStyle w:val="Heading2"/>
       </w:pPr>
-      <w:bookmarkStart w:id="143" w:name="_Toc206760676"/>
+      <w:bookmarkStart w:id="110" w:name="_Toc206760676"/>
       <w:r>
         <w:lastRenderedPageBreak/>
         <w:t>7. Integration and analysis interfaces</w:t>
       </w:r>
-      <w:bookmarkEnd w:id="143"/>
+      <w:bookmarkEnd w:id="110"/>
     </w:p>
     <w:p>
       <w:pPr>
         <w:pStyle w:val="Heading3"/>
       </w:pPr>
-      <w:bookmarkStart w:id="144" w:name="_Toc206760677"/>
-      <w:bookmarkStart w:id="145" w:name="X27a7b84d115bffc8b02a1ebae6595fb5946ef7a"/>
+      <w:bookmarkStart w:id="111" w:name="_Toc206760677"/>
+      <w:bookmarkStart w:id="112" w:name="X27a7b84d115bffc8b02a1ebae6595fb5946ef7a"/>
       <w:r>
         <w:t>7.1. Integration of climate and socio-economic variables</w:t>
       </w:r>
-      <w:bookmarkEnd w:id="144"/>
+      <w:bookmarkEnd w:id="111"/>
     </w:p>
     <w:p>
       <w:pPr>
@@ -10536,13 +10327,13 @@
       <w:pPr>
         <w:pStyle w:val="Heading3"/>
       </w:pPr>
-      <w:bookmarkStart w:id="146" w:name="_Toc206760678"/>
-      <w:bookmarkStart w:id="147" w:name="sourcing-pre-processed-data"/>
-      <w:bookmarkEnd w:id="145"/>
+      <w:bookmarkStart w:id="113" w:name="_Toc206760678"/>
+      <w:bookmarkStart w:id="114" w:name="sourcing-pre-processed-data"/>
+      <w:bookmarkEnd w:id="112"/>
       <w:r>
         <w:t>7.2. Sourcing pre-processed data</w:t>
       </w:r>
-      <w:bookmarkEnd w:id="146"/>
+      <w:bookmarkEnd w:id="113"/>
     </w:p>
     <w:p>
       <w:pPr>
@@ -10564,13 +10355,13 @@
       <w:pPr>
         <w:pStyle w:val="Heading3"/>
       </w:pPr>
-      <w:bookmarkStart w:id="148" w:name="_Toc206760679"/>
-      <w:bookmarkStart w:id="149" w:name="automated-data-retrieval"/>
-      <w:bookmarkEnd w:id="147"/>
+      <w:bookmarkStart w:id="115" w:name="_Toc206760679"/>
+      <w:bookmarkStart w:id="116" w:name="automated-data-retrieval"/>
+      <w:bookmarkEnd w:id="114"/>
       <w:r>
         <w:t>7.3. Automated data retrieval</w:t>
       </w:r>
-      <w:bookmarkEnd w:id="148"/>
+      <w:bookmarkEnd w:id="115"/>
     </w:p>
     <w:p>
       <w:pPr>
@@ -10592,13 +10383,13 @@
       <w:pPr>
         <w:pStyle w:val="Heading3"/>
       </w:pPr>
-      <w:bookmarkStart w:id="150" w:name="_Toc206760680"/>
-      <w:bookmarkStart w:id="151" w:name="integration-into-broader-dataset"/>
-      <w:bookmarkEnd w:id="149"/>
+      <w:bookmarkStart w:id="117" w:name="_Toc206760680"/>
+      <w:bookmarkStart w:id="118" w:name="integration-into-broader-dataset"/>
+      <w:bookmarkEnd w:id="116"/>
       <w:r>
         <w:t>7.4. Integration into broader dataset</w:t>
       </w:r>
-      <w:bookmarkEnd w:id="150"/>
+      <w:bookmarkEnd w:id="117"/>
     </w:p>
     <w:p>
       <w:pPr>
@@ -10636,13 +10427,13 @@
       <w:pPr>
         <w:pStyle w:val="Heading3"/>
       </w:pPr>
-      <w:bookmarkStart w:id="152" w:name="_Toc206760681"/>
-      <w:bookmarkStart w:id="153" w:name="collaboration-with-csaguct"/>
-      <w:bookmarkEnd w:id="151"/>
+      <w:bookmarkStart w:id="119" w:name="_Toc206760681"/>
+      <w:bookmarkStart w:id="120" w:name="collaboration-with-csaguct"/>
+      <w:bookmarkEnd w:id="118"/>
       <w:r>
         <w:t>7.5. Collaboration with CSAG/UCT</w:t>
       </w:r>
-      <w:bookmarkEnd w:id="152"/>
+      <w:bookmarkEnd w:id="119"/>
     </w:p>
     <w:p>
       <w:pPr>
@@ -10656,14 +10447,14 @@
       <w:pPr>
         <w:pStyle w:val="Heading3"/>
       </w:pPr>
-      <w:bookmarkStart w:id="154" w:name="_Toc206760682"/>
-      <w:bookmarkStart w:id="155" w:name="alignment-with-analysis-objectives"/>
-      <w:bookmarkEnd w:id="153"/>
+      <w:bookmarkStart w:id="121" w:name="_Toc206760682"/>
+      <w:bookmarkStart w:id="122" w:name="alignment-with-analysis-objectives"/>
+      <w:bookmarkEnd w:id="120"/>
       <w:r>
         <w:lastRenderedPageBreak/>
         <w:t>7.6. Alignment with analysis objectives</w:t>
       </w:r>
-      <w:bookmarkEnd w:id="154"/>
+      <w:bookmarkEnd w:id="121"/>
     </w:p>
     <w:p>
       <w:pPr>
@@ -10686,20 +10477,20 @@
           <w:cols w:space="720"/>
         </w:sectPr>
       </w:pPr>
-      <w:bookmarkStart w:id="156" w:name="data-analysis-platform"/>
-      <w:bookmarkEnd w:id="142"/>
-      <w:bookmarkEnd w:id="155"/>
+      <w:bookmarkStart w:id="123" w:name="data-analysis-platform"/>
+      <w:bookmarkEnd w:id="109"/>
+      <w:bookmarkEnd w:id="122"/>
     </w:p>
     <w:p>
       <w:pPr>
         <w:pStyle w:val="Heading2"/>
       </w:pPr>
-      <w:bookmarkStart w:id="157" w:name="_Toc206760683"/>
+      <w:bookmarkStart w:id="124" w:name="_Toc206760683"/>
       <w:r>
         <w:lastRenderedPageBreak/>
         <w:t>8. Data analysis platform</w:t>
       </w:r>
-      <w:bookmarkEnd w:id="157"/>
+      <w:bookmarkEnd w:id="124"/>
     </w:p>
     <w:p>
       <w:pPr>
@@ -10708,11 +10499,9 @@
       <w:r>
         <w:t xml:space="preserve">Data analysis involving the Consortium Shared Data and RP1/RP2 de-identified data will </w:t>
       </w:r>
-      <w:ins w:id="158" w:author="Lisa van Aardenne" w:date="2025-08-25T16:58:00Z">
-        <w:r>
-          <w:t xml:space="preserve">initially </w:t>
-        </w:r>
-      </w:ins>
+      <w:r>
+        <w:t xml:space="preserve">initially </w:t>
+      </w:r>
       <w:r>
         <w:t xml:space="preserve">be facilitated through the CSAG/UCT </w:t>
       </w:r>
@@ -10722,13 +10511,12 @@
       </w:r>
       <w:proofErr w:type="spellEnd"/>
       <w:r>
-        <w:t xml:space="preserve"> Hub </w:t>
-      </w:r>
-      <w:proofErr w:type="spellStart"/>
-      <w:r>
-        <w:t>platform</w:t>
-      </w:r>
-      <w:del w:id="159" w:author="Craig Parker" w:date="2025-08-05T12:16:00Z">
+        <w:t xml:space="preserve"> Hub platform</w:t>
+      </w:r>
+      <w:r>
+        <w:t xml:space="preserve"> </w:t>
+      </w:r>
+      <w:del w:id="125" w:author="Craig Parker" w:date="2025-08-05T12:16:00Z">
         <w:r>
           <w:delText xml:space="preserve"> </w:delText>
         </w:r>
@@ -10740,75 +10528,13 @@
           <w:delText>[TRACKED CHANGE] and cloud-based computational resources with GPU acceleration for complex analyses, improved processing times, and enhanced analytical capabilities</w:delText>
         </w:r>
       </w:del>
-      <w:ins w:id="160" w:author="Craig Parker" w:date="2025-08-22T12:36:00Z">
+      <w:ins w:id="126" w:author="Craig Parker [2]" w:date="2025-09-11T14:57:00Z" w16du:dateUtc="2025-09-11T12:57:00Z">
         <w:r>
           <w:rPr>
             <w:b/>
             <w:bCs/>
           </w:rPr>
-          <w:t>and</w:t>
-        </w:r>
-        <w:proofErr w:type="spellEnd"/>
-        <w:r>
-          <w:rPr>
-            <w:b/>
-            <w:bCs/>
-          </w:rPr>
-          <w:t xml:space="preserve"> </w:t>
-        </w:r>
-      </w:ins>
-      <w:ins w:id="161" w:author="Lisa van Aardenne" w:date="2025-08-25T16:57:00Z">
-        <w:r>
-          <w:rPr>
-            <w:b/>
-            <w:bCs/>
-          </w:rPr>
-          <w:t>wi</w:t>
-        </w:r>
-      </w:ins>
-      <w:ins w:id="162" w:author="Lisa van Aardenne" w:date="2025-08-25T16:59:00Z">
-        <w:r>
-          <w:rPr>
-            <w:b/>
-            <w:bCs/>
-          </w:rPr>
-          <w:t>ll</w:t>
-        </w:r>
-      </w:ins>
-      <w:ins w:id="163" w:author="Lisa van Aardenne" w:date="2025-08-25T16:57:00Z">
-        <w:r>
-          <w:rPr>
-            <w:b/>
-            <w:bCs/>
-          </w:rPr>
-          <w:t xml:space="preserve"> transition to </w:t>
-        </w:r>
-      </w:ins>
-      <w:ins w:id="164" w:author="Lisa van Aardenne" w:date="2025-08-25T16:58:00Z">
-        <w:r>
-          <w:rPr>
-            <w:b/>
-            <w:bCs/>
-          </w:rPr>
-          <w:t xml:space="preserve">being performed </w:t>
-        </w:r>
-      </w:ins>
-      <w:ins w:id="165" w:author="Craig Parker" w:date="2025-08-22T12:36:00Z">
-        <w:del w:id="166" w:author="Lisa van Aardenne" w:date="2025-08-25T16:58:00Z">
-          <w:r>
-            <w:rPr>
-              <w:b/>
-              <w:bCs/>
-            </w:rPr>
-            <w:delText>during the transition period</w:delText>
-          </w:r>
-        </w:del>
-        <w:r>
-          <w:rPr>
-            <w:b/>
-            <w:bCs/>
-          </w:rPr>
-          <w:t xml:space="preserve"> through cloud-based computational resources with GPU acceleration for complex analyses, improved processing times, and enhanced analytical capabilities</w:t>
+          <w:t>and will transition to being performed  through cloud-based computational resources with GPU acceleration for complex analyses, improved processing times, and enhanced analytical capabilities</w:t>
         </w:r>
       </w:ins>
       <w:r>
@@ -10971,19 +10697,19 @@
           <w:cols w:space="720"/>
         </w:sectPr>
       </w:pPr>
-      <w:bookmarkStart w:id="167" w:name="de-identification"/>
-      <w:bookmarkEnd w:id="156"/>
+      <w:bookmarkStart w:id="127" w:name="de-identification"/>
+      <w:bookmarkEnd w:id="123"/>
     </w:p>
     <w:p>
       <w:pPr>
         <w:pStyle w:val="Heading2"/>
       </w:pPr>
-      <w:bookmarkStart w:id="168" w:name="_Toc206760684"/>
+      <w:bookmarkStart w:id="128" w:name="_Toc206760684"/>
       <w:r>
         <w:lastRenderedPageBreak/>
         <w:t>9. De-identification</w:t>
       </w:r>
-      <w:bookmarkEnd w:id="168"/>
+      <w:bookmarkEnd w:id="128"/>
     </w:p>
     <w:p>
       <w:pPr>
@@ -11054,8 +10780,8 @@
       <w:pPr>
         <w:pStyle w:val="Heading3"/>
       </w:pPr>
-      <w:bookmarkStart w:id="169" w:name="_Toc206760685"/>
-      <w:bookmarkStart w:id="170" w:name="safe-harbour-andor-expert-determination"/>
+      <w:bookmarkStart w:id="129" w:name="_Toc206760685"/>
+      <w:bookmarkStart w:id="130" w:name="safe-harbour-andor-expert-determination"/>
       <w:r>
         <w:t xml:space="preserve">9.1. Safe </w:t>
       </w:r>
@@ -11067,7 +10793,7 @@
       <w:r>
         <w:t xml:space="preserve"> and/or expert determination</w:t>
       </w:r>
-      <w:bookmarkEnd w:id="169"/>
+      <w:bookmarkEnd w:id="129"/>
     </w:p>
     <w:p>
       <w:pPr>
@@ -11105,14 +10831,14 @@
       <w:pPr>
         <w:pStyle w:val="Heading3"/>
       </w:pPr>
-      <w:bookmarkStart w:id="171" w:name="_Toc206760686"/>
-      <w:bookmarkStart w:id="172" w:name="geographic-aggregation"/>
-      <w:bookmarkEnd w:id="170"/>
+      <w:bookmarkStart w:id="131" w:name="_Toc206760686"/>
+      <w:bookmarkStart w:id="132" w:name="geographic-aggregation"/>
+      <w:bookmarkEnd w:id="130"/>
       <w:r>
         <w:lastRenderedPageBreak/>
         <w:t>9.2. Geographic aggregation</w:t>
       </w:r>
-      <w:bookmarkEnd w:id="171"/>
+      <w:bookmarkEnd w:id="131"/>
     </w:p>
     <w:p>
       <w:pPr>
@@ -11134,13 +10860,13 @@
       <w:pPr>
         <w:pStyle w:val="Heading3"/>
       </w:pPr>
-      <w:bookmarkStart w:id="173" w:name="_Toc206760687"/>
-      <w:bookmarkStart w:id="174" w:name="location-jittering"/>
-      <w:bookmarkEnd w:id="172"/>
+      <w:bookmarkStart w:id="133" w:name="_Toc206760687"/>
+      <w:bookmarkStart w:id="134" w:name="location-jittering"/>
+      <w:bookmarkEnd w:id="132"/>
       <w:r>
         <w:t>9.3. Location jittering</w:t>
       </w:r>
-      <w:bookmarkEnd w:id="173"/>
+      <w:bookmarkEnd w:id="133"/>
     </w:p>
     <w:p>
       <w:pPr>
@@ -11148,88 +10874,6 @@
       </w:pPr>
       <w:r>
         <w:t>Latitude/longitude coordinates may be “jittered” by adding random values to each coordinate to obscure the exact location whilst retaining sufficient geographical information to support analysis. As detailed by Zandbergen (2014), jittering can involve various methods:</w:t>
-      </w:r>
-    </w:p>
-    <w:p>
-      <w:pPr>
-        <w:pStyle w:val="BodyText"/>
-      </w:pPr>
-      <w:r>
-        <w:rPr>
-          <w:b/>
-          <w:bCs/>
-        </w:rPr>
-        <w:t>[FIGURE 3 PLACEHOLDER: Geographic Masking Techniques]</w:t>
-      </w:r>
-      <w:r>
-        <w:t xml:space="preserve"> </w:t>
-      </w:r>
-      <w:r>
-        <w:rPr>
-          <w:i/>
-          <w:iCs/>
-        </w:rPr>
-        <w:t>Insert technical diagrams showing the five masking approaches:</w:t>
-      </w:r>
-      <w:r>
-        <w:t xml:space="preserve"> - </w:t>
-      </w:r>
-      <w:r>
-        <w:rPr>
-          <w:i/>
-          <w:iCs/>
-        </w:rPr>
-        <w:t>(a) Random Direction and Fixed Radius</w:t>
-      </w:r>
-      <w:r>
-        <w:t xml:space="preserve"> - </w:t>
-      </w:r>
-      <w:r>
-        <w:rPr>
-          <w:i/>
-          <w:iCs/>
-        </w:rPr>
-        <w:t>(b) Random Perturbation within a Circle</w:t>
-      </w:r>
-      <w:r>
-        <w:t xml:space="preserve"> - </w:t>
-      </w:r>
-      <w:r>
-        <w:rPr>
-          <w:i/>
-          <w:iCs/>
-        </w:rPr>
-        <w:t>(c) Gaussian Displacement</w:t>
-      </w:r>
-      <w:r>
-        <w:t xml:space="preserve"> - </w:t>
-      </w:r>
-      <w:r>
-        <w:rPr>
-          <w:i/>
-          <w:iCs/>
-        </w:rPr>
-        <w:t>(d) Donut Masking</w:t>
-      </w:r>
-      <w:r>
-        <w:t xml:space="preserve"> - </w:t>
-      </w:r>
-      <w:r>
-        <w:rPr>
-          <w:i/>
-          <w:iCs/>
-        </w:rPr>
-        <w:t>(e) Bimodal Gaussian Displacement</w:t>
-      </w:r>
-      <w:r>
-        <w:t xml:space="preserve"> </w:t>
-      </w:r>
-      <w:r>
-        <w:rPr>
-          <w:i/>
-          <w:iCs/>
-        </w:rPr>
-        <w:t>Each diagram should show the original location point and the masked area/displacement pattern</w:t>
       </w:r>
     </w:p>
     <w:p>
@@ -11322,7 +10966,7 @@
         <w:t xml:space="preserve">Figure </w:t>
       </w:r>
       <w:fldSimple w:instr=" SEQ Figure \* ARABIC ">
-        <w:ins w:id="175" w:author="Craig Parker [2]" w:date="2025-09-05T08:59:00Z" w16du:dateUtc="2025-09-05T06:59:00Z">
+        <w:ins w:id="135" w:author="Craig Parker [2]" w:date="2025-09-05T08:59:00Z" w16du:dateUtc="2025-09-05T06:59:00Z">
           <w:r>
             <w:rPr>
               <w:noProof/>
@@ -11330,7 +10974,7 @@
             <w:t>2</w:t>
           </w:r>
         </w:ins>
-        <w:del w:id="176" w:author="Craig Parker [2]" w:date="2025-09-05T08:59:00Z" w16du:dateUtc="2025-09-05T06:59:00Z">
+        <w:del w:id="136" w:author="Craig Parker [2]" w:date="2025-09-05T08:59:00Z" w16du:dateUtc="2025-09-05T06:59:00Z">
           <w:r>
             <w:rPr>
               <w:noProof/>
@@ -11364,21 +11008,24 @@
         </w:rPr>
         <w:br/>
       </w:r>
+      <w:r>
+        <w:t xml:space="preserve">Jittering is applied when finer spatial detail is necessary, but privacy must still be protected, such as RP2, where urban heat-health outcomes are </w:t>
+      </w:r>
+      <w:proofErr w:type="spellStart"/>
+      <w:r>
+        <w:t>analysed</w:t>
+      </w:r>
+      <w:proofErr w:type="spellEnd"/>
+      <w:r>
+        <w:t xml:space="preserve"> at a high-resolution (e.g., census small areas or wards).</w:t>
+      </w:r>
     </w:p>
     <w:p>
       <w:pPr>
         <w:pStyle w:val="BodyText"/>
       </w:pPr>
       <w:r>
-        <w:t xml:space="preserve">Jittering is applied when finer spatial detail is necessary, but privacy must still be protected, such as RP2, where urban heat-health outcomes are </w:t>
-      </w:r>
-      <w:proofErr w:type="spellStart"/>
-      <w:r>
-        <w:t>analysed</w:t>
-      </w:r>
-      <w:proofErr w:type="spellEnd"/>
-      <w:r>
-        <w:t xml:space="preserve"> at a high-resolution (e.g., census small areas or wards).</w:t>
+        <w:t>Gaussian displacement jittering is specifically used when more precise geographic information is required, balancing data utility and privacy by adjusting displacement based on population density.</w:t>
       </w:r>
     </w:p>
     <w:p>
@@ -11386,14 +11033,6 @@
         <w:pStyle w:val="BodyText"/>
       </w:pPr>
       <w:r>
-        <w:t>Gaussian displacement jittering is specifically used when more precise geographic information is required, balancing data utility and privacy by adjusting displacement based on population density.</w:t>
-      </w:r>
-    </w:p>
-    <w:p>
-      <w:pPr>
-        <w:pStyle w:val="BodyText"/>
-      </w:pPr>
-      <w:r>
         <w:t>The risk of re-identification will be quantified using spatial k-anonymity metrics, as described by Zandbergen (2014). This involves ensuring that each masked location is indistinguishable from at least k-1 other locations within a specified distance. The displacement required for adequate masking will be inversely proportional to the local population density to maintain high spatial k-anonymity.</w:t>
       </w:r>
     </w:p>
@@ -11401,13 +11040,13 @@
       <w:pPr>
         <w:pStyle w:val="Heading3"/>
       </w:pPr>
-      <w:bookmarkStart w:id="177" w:name="_Toc206760688"/>
-      <w:bookmarkStart w:id="178" w:name="expert-review-and-risk-assessment"/>
-      <w:bookmarkEnd w:id="174"/>
+      <w:bookmarkStart w:id="137" w:name="_Toc206760688"/>
+      <w:bookmarkStart w:id="138" w:name="expert-review-and-risk-assessment"/>
+      <w:bookmarkEnd w:id="134"/>
       <w:r>
         <w:t>9.4. Expert review and risk assessment</w:t>
       </w:r>
-      <w:bookmarkEnd w:id="177"/>
+      <w:bookmarkEnd w:id="137"/>
     </w:p>
     <w:p>
       <w:pPr>
@@ -11427,13 +11066,13 @@
       </w:r>
     </w:p>
     <w:p>
-      <w:del w:id="179" w:author="Craig Parker" w:date="2025-08-05T12:16:00Z" w16du:dateUtc="2025-08-05T10:16:00Z">
+      <w:del w:id="139" w:author="Craig Parker" w:date="2025-08-05T12:16:00Z" w16du:dateUtc="2025-08-05T10:16:00Z">
         <w:r>
           <w:rPr>
             <w:noProof/>
           </w:rPr>
           <w:pict w14:anchorId="329B3CD2">
-            <v:rect id="_x0000_i1029" alt="" style="width:468pt;height:.05pt;mso-width-percent:0;mso-height-percent:0;mso-width-percent:0;mso-height-percent:0" o:hralign="center" o:hrstd="t" o:hr="t"/>
+            <v:rect id="_x0000_i1027" alt="" style="width:468pt;height:.05pt;mso-width-percent:0;mso-height-percent:0;mso-width-percent:0;mso-height-percent:0" o:hralign="center" o:hrstd="t" o:hr="t"/>
           </w:pict>
         </w:r>
       </w:del>
@@ -11450,20 +11089,20 @@
           <w:cols w:space="720"/>
         </w:sectPr>
       </w:pPr>
-      <w:bookmarkStart w:id="180" w:name="data-sharing"/>
-      <w:bookmarkEnd w:id="167"/>
-      <w:bookmarkEnd w:id="178"/>
+      <w:bookmarkStart w:id="140" w:name="data-sharing"/>
+      <w:bookmarkEnd w:id="127"/>
+      <w:bookmarkEnd w:id="138"/>
     </w:p>
     <w:p>
       <w:pPr>
         <w:pStyle w:val="Heading2"/>
       </w:pPr>
-      <w:bookmarkStart w:id="181" w:name="_Toc206760689"/>
+      <w:bookmarkStart w:id="141" w:name="_Toc206760689"/>
       <w:r>
         <w:lastRenderedPageBreak/>
         <w:t>10. Data sharing</w:t>
       </w:r>
-      <w:bookmarkEnd w:id="181"/>
+      <w:bookmarkEnd w:id="141"/>
     </w:p>
     <w:p>
       <w:pPr>
@@ -11485,12 +11124,12 @@
       <w:pPr>
         <w:pStyle w:val="Heading3"/>
       </w:pPr>
-      <w:bookmarkStart w:id="182" w:name="_Toc206760690"/>
-      <w:bookmarkStart w:id="183" w:name="restrictions-to-data-sharing"/>
+      <w:bookmarkStart w:id="142" w:name="_Toc206760690"/>
+      <w:bookmarkStart w:id="143" w:name="restrictions-to-data-sharing"/>
       <w:r>
         <w:t>10.1. Restrictions to Data Sharing</w:t>
       </w:r>
-      <w:bookmarkEnd w:id="182"/>
+      <w:bookmarkEnd w:id="142"/>
     </w:p>
     <w:p>
       <w:pPr>
@@ -11512,13 +11151,13 @@
       <w:pPr>
         <w:pStyle w:val="Heading3"/>
       </w:pPr>
-      <w:bookmarkStart w:id="184" w:name="_Toc206760691"/>
-      <w:bookmarkStart w:id="185" w:name="discoverability"/>
-      <w:bookmarkEnd w:id="183"/>
+      <w:bookmarkStart w:id="144" w:name="_Toc206760691"/>
+      <w:bookmarkStart w:id="145" w:name="discoverability"/>
+      <w:bookmarkEnd w:id="143"/>
       <w:r>
         <w:t>10.2. Discoverability</w:t>
       </w:r>
-      <w:bookmarkEnd w:id="184"/>
+      <w:bookmarkEnd w:id="144"/>
     </w:p>
     <w:p>
       <w:pPr>
@@ -11612,13 +11251,13 @@
       <w:pPr>
         <w:pStyle w:val="Heading3"/>
       </w:pPr>
-      <w:bookmarkStart w:id="186" w:name="_Toc206760692"/>
-      <w:bookmarkStart w:id="187" w:name="levels-of-data-access"/>
-      <w:bookmarkEnd w:id="185"/>
+      <w:bookmarkStart w:id="146" w:name="_Toc206760692"/>
+      <w:bookmarkStart w:id="147" w:name="levels-of-data-access"/>
+      <w:bookmarkEnd w:id="145"/>
       <w:r>
         <w:t>10.3. Levels of Data Access</w:t>
       </w:r>
-      <w:bookmarkEnd w:id="186"/>
+      <w:bookmarkEnd w:id="146"/>
     </w:p>
     <w:p>
       <w:pPr>
@@ -11737,27 +11376,27 @@
       <w:pPr>
         <w:pStyle w:val="Heading3"/>
         <w:rPr>
-          <w:ins w:id="188" w:author="Craig Parker" w:date="2025-08-22T12:37:00Z" w16du:dateUtc="2025-08-22T10:37:00Z"/>
-        </w:rPr>
-      </w:pPr>
-      <w:bookmarkStart w:id="189" w:name="_Toc206760693"/>
-      <w:bookmarkStart w:id="190" w:name="X9cdf1622c40d1ef45648b54535984369e341b58"/>
-      <w:bookmarkEnd w:id="187"/>
+          <w:ins w:id="148" w:author="Craig Parker" w:date="2025-08-22T12:37:00Z" w16du:dateUtc="2025-08-22T10:37:00Z"/>
+        </w:rPr>
+      </w:pPr>
+      <w:bookmarkStart w:id="149" w:name="_Toc206760693"/>
+      <w:bookmarkStart w:id="150" w:name="X9cdf1622c40d1ef45648b54535984369e341b58"/>
+      <w:bookmarkEnd w:id="147"/>
       <w:r>
         <w:t>10.4. Procedure for Making RP1/RP2 De-identified Data Available to Bona Fide Researchers</w:t>
       </w:r>
-      <w:bookmarkEnd w:id="189"/>
+      <w:bookmarkEnd w:id="149"/>
     </w:p>
     <w:p>
       <w:pPr>
         <w:pStyle w:val="BodyText"/>
-        <w:pPrChange w:id="191" w:author="Craig Parker" w:date="2025-08-22T12:37:00Z" w16du:dateUtc="2025-08-22T10:37:00Z">
+        <w:pPrChange w:id="151" w:author="Craig Parker" w:date="2025-08-22T12:37:00Z" w16du:dateUtc="2025-08-22T10:37:00Z">
           <w:pPr>
             <w:pStyle w:val="Heading3"/>
           </w:pPr>
         </w:pPrChange>
       </w:pPr>
-      <w:ins w:id="192" w:author="Craig Parker" w:date="2025-08-22T12:37:00Z">
+      <w:ins w:id="152" w:author="Craig Parker" w:date="2025-08-22T12:37:00Z">
         <w:r>
           <w:rPr>
             <w:b/>
@@ -11774,18 +11413,19 @@
       <w:r>
         <w:t xml:space="preserve">The procedures for making RP1/RP2 De-identified Data available to qualifying </w:t>
       </w:r>
-      <w:ins w:id="193" w:author="Lisa van Aardenne" w:date="2025-08-25T17:56:00Z">
-        <w:r>
-          <w:t xml:space="preserve">projects and </w:t>
-        </w:r>
-      </w:ins>
-      <w:del w:id="194" w:author="Lisa van Aardenne" w:date="2025-08-25T17:55:00Z">
-        <w:r>
-          <w:delText>External</w:delText>
-        </w:r>
-      </w:del>
-      <w:r>
-        <w:t xml:space="preserve"> Researchers are outlined below. These procedures ensure compliance with ethical, legal, and scientific standards, whilst maintaining data integrity and security.</w:t>
+      <w:r>
+        <w:t xml:space="preserve">projects </w:t>
+      </w:r>
+      <w:proofErr w:type="gramStart"/>
+      <w:r>
+        <w:t xml:space="preserve">and  </w:t>
+      </w:r>
+      <w:r>
+        <w:t>Researchers</w:t>
+      </w:r>
+      <w:proofErr w:type="gramEnd"/>
+      <w:r>
+        <w:t xml:space="preserve"> are outlined below. These procedures ensure compliance with ethical, legal, and scientific standards, whilst maintaining data integrity and security.</w:t>
       </w:r>
     </w:p>
     <w:p>
@@ -12022,13 +11662,13 @@
       </w:r>
     </w:p>
     <w:p>
-      <w:del w:id="195" w:author="Craig Parker" w:date="2025-08-05T12:16:00Z" w16du:dateUtc="2025-08-05T10:16:00Z">
+      <w:del w:id="153" w:author="Craig Parker" w:date="2025-08-05T12:16:00Z" w16du:dateUtc="2025-08-05T10:16:00Z">
         <w:r>
           <w:rPr>
             <w:noProof/>
           </w:rPr>
           <w:pict w14:anchorId="2307DE28">
-            <v:rect id="_x0000_i1028" alt="" style="width:468pt;height:.05pt;mso-width-percent:0;mso-height-percent:0;mso-width-percent:0;mso-height-percent:0" o:hralign="center" o:hrstd="t" o:hr="t"/>
+            <v:rect id="_x0000_i1026" alt="" style="width:468pt;height:.05pt;mso-width-percent:0;mso-height-percent:0;mso-width-percent:0;mso-height-percent:0" o:hralign="center" o:hrstd="t" o:hr="t"/>
           </w:pict>
         </w:r>
       </w:del>
@@ -12045,20 +11685,20 @@
           <w:cols w:space="720"/>
         </w:sectPr>
       </w:pPr>
-      <w:bookmarkStart w:id="196" w:name="X2db6ef8ae2f5832aef8e8b4c0bcb654737aa512"/>
-      <w:bookmarkEnd w:id="180"/>
-      <w:bookmarkEnd w:id="190"/>
+      <w:bookmarkStart w:id="154" w:name="X2db6ef8ae2f5832aef8e8b4c0bcb654737aa512"/>
+      <w:bookmarkEnd w:id="140"/>
+      <w:bookmarkEnd w:id="150"/>
     </w:p>
     <w:p>
       <w:pPr>
         <w:pStyle w:val="Heading2"/>
       </w:pPr>
-      <w:bookmarkStart w:id="197" w:name="_Toc206760694"/>
+      <w:bookmarkStart w:id="155" w:name="_Toc206760694"/>
       <w:r>
         <w:lastRenderedPageBreak/>
         <w:t>11. POPIA compliance and protection of personal information</w:t>
       </w:r>
-      <w:bookmarkEnd w:id="197"/>
+      <w:bookmarkEnd w:id="155"/>
     </w:p>
     <w:p>
       <w:pPr>
@@ -12320,19 +11960,19 @@
           <w:cols w:space="720"/>
         </w:sectPr>
       </w:pPr>
-      <w:bookmarkStart w:id="198" w:name="governance-and-compliance"/>
-      <w:bookmarkEnd w:id="196"/>
+      <w:bookmarkStart w:id="156" w:name="governance-and-compliance"/>
+      <w:bookmarkEnd w:id="154"/>
     </w:p>
     <w:p>
       <w:pPr>
         <w:pStyle w:val="Heading2"/>
       </w:pPr>
-      <w:bookmarkStart w:id="199" w:name="_Toc206760695"/>
+      <w:bookmarkStart w:id="157" w:name="_Toc206760695"/>
       <w:r>
         <w:lastRenderedPageBreak/>
         <w:t>12. Governance and compliance</w:t>
       </w:r>
-      <w:bookmarkEnd w:id="199"/>
+      <w:bookmarkEnd w:id="157"/>
     </w:p>
     <w:p>
       <w:pPr>
@@ -12346,12 +11986,12 @@
       <w:pPr>
         <w:pStyle w:val="Heading3"/>
       </w:pPr>
-      <w:bookmarkStart w:id="200" w:name="_Toc206760696"/>
-      <w:bookmarkStart w:id="201" w:name="data-governance"/>
+      <w:bookmarkStart w:id="158" w:name="_Toc206760696"/>
+      <w:bookmarkStart w:id="159" w:name="data-governance"/>
       <w:r>
         <w:t>12.1. Data Governance</w:t>
       </w:r>
-      <w:bookmarkEnd w:id="200"/>
+      <w:bookmarkEnd w:id="158"/>
     </w:p>
     <w:p>
       <w:pPr>
@@ -12373,13 +12013,13 @@
       <w:pPr>
         <w:pStyle w:val="Heading3"/>
       </w:pPr>
-      <w:bookmarkStart w:id="202" w:name="_Toc206760697"/>
-      <w:bookmarkStart w:id="203" w:name="data-indexing-and-metadata-management"/>
-      <w:bookmarkEnd w:id="201"/>
+      <w:bookmarkStart w:id="160" w:name="_Toc206760697"/>
+      <w:bookmarkStart w:id="161" w:name="data-indexing-and-metadata-management"/>
+      <w:bookmarkEnd w:id="159"/>
       <w:r>
         <w:t>12.2. Data Indexing and Metadata Management</w:t>
       </w:r>
-      <w:bookmarkEnd w:id="202"/>
+      <w:bookmarkEnd w:id="160"/>
     </w:p>
     <w:p>
       <w:pPr>
@@ -12514,45 +12154,45 @@
       <w:pPr>
         <w:pStyle w:val="Heading3"/>
       </w:pPr>
-      <w:bookmarkStart w:id="204" w:name="_Toc206760698"/>
-      <w:bookmarkStart w:id="205" w:name="data-access-committee"/>
-      <w:bookmarkEnd w:id="203"/>
+      <w:bookmarkStart w:id="162" w:name="_Toc206760698"/>
+      <w:bookmarkStart w:id="163" w:name="data-access-committee"/>
+      <w:bookmarkEnd w:id="161"/>
       <w:r>
         <w:t>12.3. Data Access Committee</w:t>
       </w:r>
-      <w:bookmarkEnd w:id="204"/>
+      <w:bookmarkEnd w:id="162"/>
+    </w:p>
+    <w:p>
+      <w:pPr>
+        <w:pStyle w:val="FirstParagraph"/>
+      </w:pPr>
+      <w:r>
+        <w:t xml:space="preserve">The DAC is an independent committee that plays a central role in the governance of data sharing. The committee’s responsibilities include evaluating data access requests and overseeing DTAs that are signed between the HEAT Center Consortium (Data Provider) and the Bona Fide External Researcher (Data Recipient) to ensure compliance with legal and ethical standards. The DTA will outline the terms for data use, confidentiality, and </w:t>
+      </w:r>
+      <w:r>
+        <w:lastRenderedPageBreak/>
+        <w:t>compliance with relevant laws and guidelines. The agreement will also prohibit the on-sharing of data, without explicit DAC approval.</w:t>
+      </w:r>
     </w:p>
     <w:p>
       <w:pPr>
         <w:pStyle w:val="BodyText"/>
         <w:rPr>
-          <w:del w:id="206" w:author="Craig Parker" w:date="2025-08-22T12:39:00Z" w16du:dateUtc="2025-08-22T10:39:00Z"/>
+          <w:ins w:id="164" w:author="Craig Parker" w:date="2025-08-22T12:39:00Z" w16du:dateUtc="2025-08-22T10:39:00Z"/>
+        </w:rPr>
+      </w:pPr>
+    </w:p>
+    <w:p>
+      <w:pPr>
+        <w:pStyle w:val="BodyText"/>
+      </w:pPr>
+      <w:r>
+        <w:rPr>
           <w:b/>
           <w:bCs/>
         </w:rPr>
-      </w:pPr>
-      <w:ins w:id="207" w:author="Craig Parker" w:date="2025-08-22T12:39:00Z">
-        <w:r>
-          <w:rPr>
-            <w:b/>
-            <w:bCs/>
-          </w:rPr>
-          <w:t>The DAC is an independent committee that evaluates ALL data access requests from both consortium members and external researchers, ensuring consistent application of ethical and scientific standards.</w:t>
-        </w:r>
-      </w:ins>
-      <w:del w:id="208" w:author="Craig Parker" w:date="2025-08-22T12:39:00Z" w16du:dateUtc="2025-08-22T10:39:00Z">
-        <w:r>
-          <w:delText>The DAC is an independent committee that plays a central role in the governance of data sharing. The committee’s responsibilities include evaluating data access requests and overseeing DTAs that are signed between the HEAT Center Consortium (Data Provider) and the Bona Fide External Researcher (Data Recipient) to ensure compliance with legal and ethical standards. The DTA will outline the terms for data use, confidentiality, and compliance with relevant laws and guidelines. The agreement will also prohibit the on-sharing of data, without explicit DAC approval.</w:delText>
-        </w:r>
-      </w:del>
-    </w:p>
-    <w:p>
-      <w:pPr>
-        <w:pStyle w:val="FirstParagraph"/>
-        <w:rPr>
-          <w:ins w:id="209" w:author="Craig Parker" w:date="2025-08-22T12:39:00Z" w16du:dateUtc="2025-08-22T10:39:00Z"/>
-        </w:rPr>
-      </w:pPr>
+        <w:t>12.3.1 Review Process</w:t>
+      </w:r>
     </w:p>
     <w:p>
       <w:pPr>
@@ -12563,7 +12203,18 @@
           <w:b/>
           <w:bCs/>
         </w:rPr>
-        <w:t>12.3.1 Review Process</w:t>
+        <w:t>Submission</w:t>
+      </w:r>
+      <w:r>
+        <w:t xml:space="preserve">: Data requests must be submitted using a </w:t>
+      </w:r>
+      <w:proofErr w:type="spellStart"/>
+      <w:r>
+        <w:t>standardised</w:t>
+      </w:r>
+      <w:proofErr w:type="spellEnd"/>
+      <w:r>
+        <w:t xml:space="preserve"> form that details the project objectives, required data, resource implications and ethical approvals. The form must be complete before the request will be considered. This form is included in Annex 5 of the DMP.</w:t>
       </w:r>
     </w:p>
     <w:p>
@@ -12575,19 +12226,18 @@
           <w:b/>
           <w:bCs/>
         </w:rPr>
-        <w:lastRenderedPageBreak/>
-        <w:t>Submission</w:t>
-      </w:r>
-      <w:r>
-        <w:t xml:space="preserve">: Data requests must be submitted using a </w:t>
+        <w:t>Preliminary Screening</w:t>
+      </w:r>
+      <w:r>
+        <w:t xml:space="preserve">: All requests will undergo preliminary screening by the HEAT Center </w:t>
       </w:r>
       <w:proofErr w:type="spellStart"/>
       <w:r>
-        <w:t>standardised</w:t>
+        <w:t>SteerCo</w:t>
       </w:r>
       <w:proofErr w:type="spellEnd"/>
       <w:r>
-        <w:t xml:space="preserve"> form that details the project objectives, required data, resource implications and ethical approvals. The form must be complete before the request will be considered. This form is included in Annex 5 of the DMP.</w:t>
+        <w:t xml:space="preserve"> to confirm completeness of Data Access Requests forms.</w:t>
       </w:r>
     </w:p>
     <w:p>
@@ -12599,18 +12249,10 @@
           <w:b/>
           <w:bCs/>
         </w:rPr>
-        <w:t>Preliminary Screening</w:t>
-      </w:r>
-      <w:r>
-        <w:t xml:space="preserve">: All requests will undergo preliminary screening by the HEAT Center </w:t>
-      </w:r>
-      <w:proofErr w:type="spellStart"/>
-      <w:r>
-        <w:t>SteerCo</w:t>
-      </w:r>
-      <w:proofErr w:type="spellEnd"/>
-      <w:r>
-        <w:t xml:space="preserve"> to confirm completeness of Data Access Requests forms.</w:t>
+        <w:t>Evaluation of data request</w:t>
+      </w:r>
+      <w:r>
+        <w:t>: The DAC will evaluate requests based on criteria such as research credentials of the applicants (only applications from bona fide researchers will be considered), scientific merit, feasibility, potential privacy risks, resources available in the HEAT Center for preparing the De-Identified database, the avoidance of overlap with ongoing research, potential public health impact, and adherence to ethical and legal standards outlined in the application.</w:t>
       </w:r>
     </w:p>
     <w:p>
@@ -12622,10 +12264,7 @@
           <w:b/>
           <w:bCs/>
         </w:rPr>
-        <w:t>Evaluation of data request</w:t>
-      </w:r>
-      <w:r>
-        <w:t>: The DAC will evaluate requests based on criteria such as research credentials of the applicants (only applications from bona fide researchers will be considered), scientific merit, feasibility, potential privacy risks, resources available in the HEAT Center for preparing the De-Identified database, the avoidance of overlap with ongoing research, potential public health impact, and adherence to ethical and legal standards outlined in the application.</w:t>
+        <w:t>12.3.2 Membership of the DAC</w:t>
       </w:r>
     </w:p>
     <w:p>
@@ -12633,11 +12272,23 @@
         <w:pStyle w:val="BodyText"/>
       </w:pPr>
       <w:r>
-        <w:rPr>
-          <w:b/>
-          <w:bCs/>
-        </w:rPr>
-        <w:t>12.3.2 Membership of the DAC</w:t>
+        <w:t xml:space="preserve">The DAC will comprise of independent experts who may include Ethics Committee members, representatives from the DS-I Africa ELSI team or the </w:t>
+      </w:r>
+      <w:proofErr w:type="spellStart"/>
+      <w:r>
+        <w:t>eLwazi</w:t>
+      </w:r>
+      <w:proofErr w:type="spellEnd"/>
+      <w:r>
+        <w:t xml:space="preserve"> platform and people with expertise in data science, ethics, and legal matters. The HEAT Center Scientific Advisory Board and the HEAT Center </w:t>
+      </w:r>
+      <w:proofErr w:type="spellStart"/>
+      <w:r>
+        <w:t>SteerCo</w:t>
+      </w:r>
+      <w:proofErr w:type="spellEnd"/>
+      <w:r>
+        <w:t xml:space="preserve"> will select the members of the DAC.</w:t>
       </w:r>
     </w:p>
     <w:p>
@@ -12645,45 +12296,10 @@
         <w:pStyle w:val="BodyText"/>
       </w:pPr>
       <w:r>
-        <w:t xml:space="preserve">The DAC will comprise of independent experts who may include Ethics Committee members, representatives from the DS-I Africa ELSI team or the </w:t>
-      </w:r>
-      <w:proofErr w:type="spellStart"/>
-      <w:r>
-        <w:t>eLwazi</w:t>
-      </w:r>
-      <w:proofErr w:type="spellEnd"/>
-      <w:r>
-        <w:t xml:space="preserve"> platform and people with expertise in data science, ethics, and legal matters. The HEAT Center Scientific Advisory Board and the HEAT Center </w:t>
-      </w:r>
-      <w:proofErr w:type="spellStart"/>
-      <w:r>
-        <w:t>SteerCo</w:t>
-      </w:r>
-      <w:proofErr w:type="spellEnd"/>
-      <w:r>
-        <w:t xml:space="preserve"> will select the members of the DAC.</w:t>
-      </w:r>
-    </w:p>
-    <w:p>
-      <w:pPr>
-        <w:pStyle w:val="BodyText"/>
-      </w:pPr>
-      <w:r>
         <w:t>For a more detailed description of the roles, responsibilities and specific procedures relating to the DAC, refer to Annex 4: Terms of Reference for the DAC.</w:t>
       </w:r>
     </w:p>
-    <w:p>
-      <w:del w:id="210" w:author="Craig Parker" w:date="2025-08-05T12:16:00Z" w16du:dateUtc="2025-08-05T10:16:00Z">
-        <w:r>
-          <w:rPr>
-            <w:noProof/>
-          </w:rPr>
-          <w:pict w14:anchorId="532F0873">
-            <v:rect id="_x0000_i1027" alt="" style="width:468pt;height:.05pt;mso-width-percent:0;mso-height-percent:0;mso-width-percent:0;mso-height-percent:0" o:hralign="center" o:hrstd="t" o:hr="t"/>
-          </w:pict>
-        </w:r>
-      </w:del>
-    </w:p>
+    <w:p/>
     <w:p>
       <w:pPr>
         <w:pStyle w:val="Heading2"/>
@@ -12696,20 +12312,20 @@
           <w:cols w:space="720"/>
         </w:sectPr>
       </w:pPr>
-      <w:bookmarkStart w:id="211" w:name="data-retention"/>
-      <w:bookmarkEnd w:id="198"/>
-      <w:bookmarkEnd w:id="205"/>
+      <w:bookmarkStart w:id="165" w:name="data-retention"/>
+      <w:bookmarkEnd w:id="156"/>
+      <w:bookmarkEnd w:id="163"/>
     </w:p>
     <w:p>
       <w:pPr>
         <w:pStyle w:val="Heading2"/>
       </w:pPr>
-      <w:bookmarkStart w:id="212" w:name="_Toc206760699"/>
+      <w:bookmarkStart w:id="166" w:name="_Toc206760699"/>
       <w:r>
         <w:lastRenderedPageBreak/>
         <w:t>13. Data retention</w:t>
       </w:r>
-      <w:bookmarkEnd w:id="212"/>
+      <w:bookmarkEnd w:id="166"/>
     </w:p>
     <w:p>
       <w:pPr>
@@ -12731,12 +12347,12 @@
       <w:pPr>
         <w:pStyle w:val="Heading3"/>
       </w:pPr>
-      <w:bookmarkStart w:id="213" w:name="_Toc206760700"/>
-      <w:bookmarkStart w:id="214" w:name="retention-periods"/>
+      <w:bookmarkStart w:id="167" w:name="_Toc206760700"/>
+      <w:bookmarkStart w:id="168" w:name="retention-periods"/>
       <w:r>
         <w:t>13.1. Retention Periods:</w:t>
       </w:r>
-      <w:bookmarkEnd w:id="213"/>
+      <w:bookmarkEnd w:id="167"/>
     </w:p>
     <w:p>
       <w:pPr>
@@ -12814,13 +12430,13 @@
       <w:pPr>
         <w:pStyle w:val="Heading3"/>
       </w:pPr>
-      <w:bookmarkStart w:id="215" w:name="_Toc206760701"/>
-      <w:bookmarkStart w:id="216" w:name="X8930c258198720edd7181ea182bae298f76f11e"/>
-      <w:bookmarkEnd w:id="214"/>
+      <w:bookmarkStart w:id="169" w:name="_Toc206760701"/>
+      <w:bookmarkStart w:id="170" w:name="X8930c258198720edd7181ea182bae298f76f11e"/>
+      <w:bookmarkEnd w:id="168"/>
       <w:r>
         <w:t>13.2. Ongoing Monitoring of Data Transfer Agreements</w:t>
       </w:r>
-      <w:bookmarkEnd w:id="215"/>
+      <w:bookmarkEnd w:id="169"/>
     </w:p>
     <w:p>
       <w:pPr>
@@ -12838,18 +12454,7 @@
         <w:t xml:space="preserve"> if necessary, ensures compliance with the agreement’s terms.</w:t>
       </w:r>
     </w:p>
-    <w:p>
-      <w:del w:id="217" w:author="Craig Parker" w:date="2025-08-05T12:16:00Z" w16du:dateUtc="2025-08-05T10:16:00Z">
-        <w:r>
-          <w:rPr>
-            <w:noProof/>
-          </w:rPr>
-          <w:pict w14:anchorId="1D7C1A34">
-            <v:rect id="_x0000_i1026" alt="" style="width:468pt;height:.05pt;mso-width-percent:0;mso-height-percent:0;mso-width-percent:0;mso-height-percent:0" o:hralign="center" o:hrstd="t" o:hr="t"/>
-          </w:pict>
-        </w:r>
-      </w:del>
-    </w:p>
+    <w:p/>
     <w:p>
       <w:pPr>
         <w:pStyle w:val="Heading2"/>
@@ -12862,20 +12467,20 @@
           <w:cols w:space="720"/>
         </w:sectPr>
       </w:pPr>
-      <w:bookmarkStart w:id="218" w:name="restricted-data-access"/>
-      <w:bookmarkEnd w:id="211"/>
-      <w:bookmarkEnd w:id="216"/>
+      <w:bookmarkStart w:id="171" w:name="restricted-data-access"/>
+      <w:bookmarkEnd w:id="165"/>
+      <w:bookmarkEnd w:id="170"/>
     </w:p>
     <w:p>
       <w:pPr>
         <w:pStyle w:val="Heading2"/>
       </w:pPr>
-      <w:bookmarkStart w:id="219" w:name="_Toc206760702"/>
+      <w:bookmarkStart w:id="172" w:name="_Toc206760702"/>
       <w:r>
         <w:lastRenderedPageBreak/>
         <w:t>14. Restricted data access</w:t>
       </w:r>
-      <w:bookmarkEnd w:id="219"/>
+      <w:bookmarkEnd w:id="172"/>
     </w:p>
     <w:p>
       <w:pPr>
@@ -12889,12 +12494,12 @@
       <w:pPr>
         <w:pStyle w:val="Heading3"/>
       </w:pPr>
-      <w:bookmarkStart w:id="220" w:name="_Toc206760703"/>
-      <w:bookmarkStart w:id="221" w:name="data-transfer-storage-and-encryption"/>
+      <w:bookmarkStart w:id="173" w:name="_Toc206760703"/>
+      <w:bookmarkStart w:id="174" w:name="data-transfer-storage-and-encryption"/>
       <w:r>
         <w:t>14.1. Data transfer, storage and encryption</w:t>
       </w:r>
-      <w:bookmarkEnd w:id="220"/>
+      <w:bookmarkEnd w:id="173"/>
     </w:p>
     <w:p>
       <w:pPr>
@@ -12904,21 +12509,17 @@
         <w:t xml:space="preserve">Data is transferred using Transport Layer Security (TLS) protocols are employed during transmission to maintain encryption and prevent interception. We use </w:t>
       </w:r>
       <w:proofErr w:type="spellStart"/>
-      <w:ins w:id="222" w:author="Lisa van Aardenne" w:date="2025-08-25T17:59:00Z">
-        <w:r>
-          <w:t>FileSender</w:t>
-        </w:r>
-      </w:ins>
+      <w:r>
+        <w:t>FileSender</w:t>
+      </w:r>
       <w:proofErr w:type="spellEnd"/>
-      <w:del w:id="223" w:author="Lisa van Aardenne" w:date="2025-08-25T17:59:00Z">
-        <w:r>
-          <w:delText>WeTransfer</w:delText>
-        </w:r>
-      </w:del>
-      <w:r>
-        <w:t xml:space="preserve"> modality, which is encrypted. Once transferred to UCT </w:t>
-      </w:r>
-      <w:del w:id="224" w:author="Craig Parker" w:date="2025-08-05T12:02:00Z">
+      <w:r>
+        <w:t xml:space="preserve"> </w:t>
+      </w:r>
+      <w:r>
+        <w:t xml:space="preserve">modality, which is encrypted. Once transferred to UCT </w:t>
+      </w:r>
+      <w:del w:id="175" w:author="Craig Parker" w:date="2025-08-05T12:02:00Z">
         <w:r>
           <w:rPr>
             <w:b/>
@@ -12930,114 +12531,85 @@
           <w:delText xml:space="preserve">, </w:delText>
         </w:r>
       </w:del>
-      <w:ins w:id="225" w:author="Craig Parker" w:date="2025-08-22T12:39:00Z">
-        <w:del w:id="226" w:author="Lisa van Aardenne" w:date="2025-08-25T17:59:00Z">
+      <w:ins w:id="176" w:author="Craig Parker [2]" w:date="2025-09-11T15:04:00Z" w16du:dateUtc="2025-09-11T13:04:00Z">
+        <w:r>
+          <w:rPr>
+            <w:b/>
+            <w:bCs/>
+          </w:rPr>
+          <w:t>or the WHC-managed cloud infrastructure</w:t>
+        </w:r>
+      </w:ins>
+      <w:r>
+        <w:rPr>
+          <w:b/>
+          <w:bCs/>
+        </w:rPr>
+        <w:t>,</w:t>
+      </w:r>
+      <w:ins w:id="177" w:author="Craig Parker [2]" w:date="2025-09-11T15:04:00Z" w16du:dateUtc="2025-09-11T13:04:00Z">
+        <w:r>
+          <w:rPr>
+            <w:b/>
+            <w:bCs/>
+          </w:rPr>
+          <w:t xml:space="preserve"> </w:t>
+        </w:r>
+        <w:r>
+          <w:t>any data identified as containing Personal Identifiers or specified by the DTA is encrypted for storage using</w:t>
+        </w:r>
+        <w:del w:id="178" w:author="Craig Parker" w:date="2025-08-05T12:02:00Z">
+          <w:r>
+            <w:delText xml:space="preserve"> </w:delText>
+          </w:r>
           <w:r>
             <w:rPr>
               <w:b/>
               <w:bCs/>
             </w:rPr>
-            <w:delText>and during the transition period to</w:delText>
+            <w:delText>[TRACKED CHANGE] AES-256 encryption standard for both UCT servers and cloud storage</w:delText>
           </w:r>
         </w:del>
-      </w:ins>
-      <w:ins w:id="227" w:author="Lisa van Aardenne" w:date="2025-08-25T17:59:00Z">
         <w:r>
           <w:rPr>
             <w:b/>
             <w:bCs/>
           </w:rPr>
-          <w:t xml:space="preserve"> or the</w:t>
+          <w:t xml:space="preserve"> </w:t>
         </w:r>
       </w:ins>
-      <w:ins w:id="228" w:author="Craig Parker" w:date="2025-08-22T12:39:00Z">
-        <w:r>
-          <w:rPr>
-            <w:b/>
-            <w:bCs/>
-          </w:rPr>
-          <w:t xml:space="preserve"> WHC-managed cloud infrastructure </w:t>
-        </w:r>
-      </w:ins>
-      <w:r>
-        <w:t>any data identified as containing Personal Identifiers or specified by the DTA is encrypted for storage using</w:t>
-      </w:r>
-      <w:del w:id="229" w:author="Craig Parker" w:date="2025-08-05T12:02:00Z">
-        <w:r>
-          <w:delText xml:space="preserve"> </w:delText>
-        </w:r>
-        <w:r>
-          <w:rPr>
-            <w:b/>
-            <w:bCs/>
-          </w:rPr>
-          <w:delText>[TRACKED CHANGE] AES-256 encryption standard for both UCT servers and cloud storage</w:delText>
-        </w:r>
-      </w:del>
-      <w:r>
-        <w:rPr>
-          <w:b/>
-          <w:bCs/>
-        </w:rPr>
-        <w:t xml:space="preserve"> </w:t>
-      </w:r>
-      <w:ins w:id="230" w:author="Craig Parker" w:date="2025-08-05T12:02:00Z">
-        <w:r>
-          <w:rPr>
-            <w:b/>
-            <w:bCs/>
-          </w:rPr>
-          <w:t>AES-256 encryption standard for both UCT servers and cloud storage</w:t>
-        </w:r>
-      </w:ins>
+      <w:r>
+        <w:t xml:space="preserve">the </w:t>
+      </w:r>
+      <w:r>
+        <w:t xml:space="preserve">AES-256 encryption standard for both UCT servers and cloud storage. Encryption key access is restricted to </w:t>
+      </w:r>
+      <w:proofErr w:type="spellStart"/>
+      <w:r>
+        <w:t>authorised</w:t>
+      </w:r>
+      <w:proofErr w:type="spellEnd"/>
+      <w:r>
+        <w:t xml:space="preserve"> personnel, ensuring data security and preventing re-identification attempts</w:t>
+      </w:r>
       <w:r>
         <w:t xml:space="preserve">. </w:t>
       </w:r>
-      <w:ins w:id="231" w:author="Craig Parker" w:date="2025-08-22T12:40:00Z">
-        <w:r>
-          <w:rPr>
-            <w:b/>
-            <w:bCs/>
-          </w:rPr>
-          <w:t xml:space="preserve">Encryption key access is restricted to </w:t>
-        </w:r>
-        <w:proofErr w:type="spellStart"/>
-        <w:r>
-          <w:rPr>
-            <w:b/>
-            <w:bCs/>
-          </w:rPr>
-          <w:t>authorised</w:t>
-        </w:r>
-        <w:proofErr w:type="spellEnd"/>
-        <w:r>
-          <w:rPr>
-            <w:b/>
-            <w:bCs/>
-          </w:rPr>
-          <w:t xml:space="preserve"> personnel, ensuring data security and preventing re-identification attempts</w:t>
-        </w:r>
-      </w:ins>
-      <w:del w:id="232" w:author="Craig Parker" w:date="2025-08-22T12:40:00Z">
-        <w:r>
-          <w:delText>The AES-256 encryption standard is applied, with encryption key access restricted to authorised personnel by Clause 2.10 of the Data Transfer Agreement, ensuring that the Data Recipient does not attempt to re-identify any Data Subjects</w:delText>
-        </w:r>
-      </w:del>
-      <w:r>
-        <w:t>. This complies with privacy and data protection legislation, including the Protection of Personal Information Act (POPIA). Metadata, however, is stored separately to facilitate indexing and software development whilst maintaining security.</w:t>
+      <w:r>
+        <w:t>This complies with privacy and data protection legislation, including the Protection of Personal Information Act (POPIA). Metadata, however, is stored separately to facilitate indexing and software development whilst maintaining security.</w:t>
       </w:r>
     </w:p>
     <w:p>
       <w:pPr>
         <w:pStyle w:val="Heading3"/>
       </w:pPr>
-      <w:bookmarkStart w:id="233" w:name="_Toc206760704"/>
-      <w:bookmarkStart w:id="234" w:name="network-security"/>
-      <w:bookmarkEnd w:id="221"/>
+      <w:bookmarkStart w:id="179" w:name="_Toc206760704"/>
+      <w:bookmarkStart w:id="180" w:name="network-security"/>
+      <w:bookmarkEnd w:id="174"/>
       <w:r>
         <w:t>14.2. Network security</w:t>
       </w:r>
-      <w:bookmarkEnd w:id="233"/>
+      <w:bookmarkEnd w:id="179"/>
     </w:p>
     <w:p>
       <w:pPr>
@@ -13046,7 +12618,7 @@
       <w:r>
         <w:t>The CSAG compute infrastructure benefits from UCT’s comprehensive security policies</w:t>
       </w:r>
-      <w:del w:id="235" w:author="Craig Parker" w:date="2025-08-05T12:03:00Z">
+      <w:del w:id="181" w:author="Craig Parker" w:date="2025-08-05T12:03:00Z">
         <w:r>
           <w:delText xml:space="preserve"> </w:delText>
         </w:r>
@@ -13058,7 +12630,7 @@
           <w:delText>[TRACKED CHANGE] and WHC-managed cloud security architecture with 24/7 Security Operations Centre (SOC) monitoring and advanced threat detection systems for improved security posture and compliance</w:delText>
         </w:r>
       </w:del>
-      <w:ins w:id="236" w:author="Lisa van Aardenne" w:date="2025-08-25T18:08:00Z">
+      <w:ins w:id="182" w:author="Lisa van Aardenne" w:date="2025-08-25T18:08:00Z">
         <w:r>
           <w:rPr>
             <w:b/>
@@ -13067,7 +12639,7 @@
           <w:t>,</w:t>
         </w:r>
       </w:ins>
-      <w:ins w:id="237" w:author="Craig Parker" w:date="2025-08-22T12:41:00Z">
+      <w:ins w:id="183" w:author="Craig Parker" w:date="2025-08-22T12:41:00Z">
         <w:r>
           <w:rPr>
             <w:rFonts w:ascii="Arial" w:hAnsi="Arial" w:cs="Arial"/>
@@ -13077,6 +12649,8 @@
           </w:rPr>
           <w:t> </w:t>
         </w:r>
+      </w:ins>
+      <w:ins w:id="184" w:author="Craig Parker [2]" w:date="2025-09-11T15:05:00Z" w16du:dateUtc="2025-09-11T13:05:00Z">
         <w:r>
           <w:rPr>
             <w:rStyle w:val="addition"/>
@@ -13084,7 +12658,7 @@
             <w:b/>
             <w:bCs/>
             <w:color w:val="FF0000"/>
-            <w:rPrChange w:id="238" w:author="Craig Parker" w:date="2025-08-22T12:42:00Z">
+            <w:rPrChange w:id="185" w:author="Craig Parker" w:date="2025-08-22T12:42:00Z">
               <w:rPr>
                 <w:rStyle w:val="addition"/>
                 <w:rFonts w:ascii="Arial" w:hAnsi="Arial" w:cs="Arial"/>
@@ -13096,54 +12670,8 @@
               </w:rPr>
             </w:rPrChange>
           </w:rPr>
-          <w:t xml:space="preserve">and </w:t>
+          <w:t xml:space="preserve">and  </w:t>
         </w:r>
-        <w:del w:id="239" w:author="Lisa van Aardenne" w:date="2025-08-25T18:08:00Z">
-          <w:r>
-            <w:rPr>
-              <w:rStyle w:val="addition"/>
-              <w:rFonts w:cs="Arial"/>
-              <w:b/>
-              <w:bCs/>
-              <w:color w:val="FF0000"/>
-              <w:rPrChange w:id="240" w:author="Craig Parker" w:date="2025-08-22T12:42:00Z">
-                <w:rPr>
-                  <w:rStyle w:val="addition"/>
-                  <w:rFonts w:ascii="Arial" w:hAnsi="Arial" w:cs="Arial"/>
-                  <w:b/>
-                  <w:bCs/>
-                  <w:color w:val="FF0000"/>
-                  <w:sz w:val="27"/>
-                  <w:szCs w:val="27"/>
-                </w:rPr>
-              </w:rPrChange>
-            </w:rPr>
-            <w:delText>during the transition period</w:delText>
-          </w:r>
-        </w:del>
-        <w:r>
-          <w:rPr>
-            <w:rStyle w:val="addition"/>
-            <w:rFonts w:cs="Arial"/>
-            <w:b/>
-            <w:bCs/>
-            <w:color w:val="FF0000"/>
-            <w:rPrChange w:id="241" w:author="Craig Parker" w:date="2025-08-22T12:42:00Z">
-              <w:rPr>
-                <w:rStyle w:val="addition"/>
-                <w:rFonts w:ascii="Arial" w:hAnsi="Arial" w:cs="Arial"/>
-                <w:b/>
-                <w:bCs/>
-                <w:color w:val="FF0000"/>
-                <w:sz w:val="27"/>
-                <w:szCs w:val="27"/>
-              </w:rPr>
-            </w:rPrChange>
-          </w:rPr>
-          <w:t xml:space="preserve"> </w:t>
-        </w:r>
-      </w:ins>
-      <w:ins w:id="242" w:author="Lisa van Aardenne" w:date="2025-08-25T18:08:00Z">
         <w:r>
           <w:rPr>
             <w:rStyle w:val="addition"/>
@@ -13154,8 +12682,6 @@
           </w:rPr>
           <w:t xml:space="preserve">from the start of Year 5, </w:t>
         </w:r>
-      </w:ins>
-      <w:ins w:id="243" w:author="Craig Parker" w:date="2025-08-22T12:41:00Z">
         <w:r>
           <w:rPr>
             <w:rStyle w:val="addition"/>
@@ -13163,7 +12689,7 @@
             <w:b/>
             <w:bCs/>
             <w:color w:val="FF0000"/>
-            <w:rPrChange w:id="244" w:author="Craig Parker" w:date="2025-08-22T12:42:00Z">
+            <w:rPrChange w:id="186" w:author="Craig Parker" w:date="2025-08-22T12:42:00Z">
               <w:rPr>
                 <w:rStyle w:val="addition"/>
                 <w:rFonts w:ascii="Arial" w:hAnsi="Arial" w:cs="Arial"/>
@@ -13183,7 +12709,7 @@
             <w:b/>
             <w:bCs/>
             <w:color w:val="FF0000"/>
-            <w:rPrChange w:id="245" w:author="Craig Parker" w:date="2025-08-22T12:42:00Z">
+            <w:rPrChange w:id="187" w:author="Craig Parker" w:date="2025-08-22T12:42:00Z">
               <w:rPr>
                 <w:rFonts w:ascii="Arial" w:hAnsi="Arial" w:cs="Arial"/>
                 <w:b/>
@@ -13196,12 +12722,15 @@
           </w:rPr>
           <w:t> and during the transition period from WHC-managed cloud security architecture with 24/7 Security Operations Centre (SOC) monitoring and advanced threat detection systems for improved security posture and compliance.</w:t>
         </w:r>
+        <w:del w:id="188" w:author="Craig Parker" w:date="2025-08-22T12:41:00Z">
+          <w:r>
+            <w:delText>.</w:delText>
+          </w:r>
+        </w:del>
+        <w:r>
+          <w:t xml:space="preserve"> </w:t>
+        </w:r>
       </w:ins>
-      <w:del w:id="246" w:author="Craig Parker" w:date="2025-08-22T12:41:00Z">
-        <w:r>
-          <w:delText>.</w:delText>
-        </w:r>
-      </w:del>
       <w:r>
         <w:t xml:space="preserve"> Key measures include:</w:t>
       </w:r>
@@ -13223,7 +12752,7 @@
       <w:r>
         <w:t xml:space="preserve">: UCT’s Cisco firewall </w:t>
       </w:r>
-      <w:del w:id="247" w:author="Craig Parker" w:date="2025-08-22T12:42:00Z" w16du:dateUtc="2025-08-22T10:42:00Z">
+      <w:del w:id="189" w:author="Craig Parker" w:date="2025-08-22T12:42:00Z" w16du:dateUtc="2025-08-22T10:42:00Z">
         <w:r>
           <w:rPr>
             <w:b/>
@@ -13232,7 +12761,7 @@
           <w:delText>[TRACKED CHANGE] and cloud-native firewall services</w:delText>
         </w:r>
       </w:del>
-      <w:ins w:id="248" w:author="Craig Parker" w:date="2025-08-22T12:42:00Z" w16du:dateUtc="2025-08-22T10:42:00Z">
+      <w:ins w:id="190" w:author="Craig Parker" w:date="2025-08-22T12:42:00Z" w16du:dateUtc="2025-08-22T10:42:00Z">
         <w:r>
           <w:rPr>
             <w:b/>
@@ -13304,9 +12833,9 @@
       <w:pPr>
         <w:pStyle w:val="Heading3"/>
       </w:pPr>
-      <w:bookmarkStart w:id="249" w:name="_Toc206760705"/>
-      <w:bookmarkStart w:id="250" w:name="local-authentication-and-authorisation"/>
-      <w:bookmarkEnd w:id="234"/>
+      <w:bookmarkStart w:id="191" w:name="_Toc206760705"/>
+      <w:bookmarkStart w:id="192" w:name="local-authentication-and-authorisation"/>
+      <w:bookmarkEnd w:id="180"/>
       <w:r>
         <w:t xml:space="preserve">14.3. Local authentication and </w:t>
       </w:r>
@@ -13314,7 +12843,7 @@
       <w:r>
         <w:t>authorisation</w:t>
       </w:r>
-      <w:bookmarkEnd w:id="249"/>
+      <w:bookmarkEnd w:id="191"/>
       <w:proofErr w:type="spellEnd"/>
     </w:p>
     <w:p>
@@ -13332,7 +12861,7 @@
       <w:r>
         <w:t xml:space="preserve"> protocols </w:t>
       </w:r>
-      <w:del w:id="251" w:author="Craig Parker" w:date="2025-08-05T12:03:00Z" w16du:dateUtc="2025-08-05T10:03:00Z">
+      <w:del w:id="193" w:author="Craig Parker" w:date="2025-08-05T12:03:00Z" w16du:dateUtc="2025-08-05T10:03:00Z">
         <w:r>
           <w:rPr>
             <w:b/>
@@ -13344,7 +12873,7 @@
           <w:delText xml:space="preserve">. </w:delText>
         </w:r>
       </w:del>
-      <w:del w:id="252" w:author="Craig Parker" w:date="2025-08-22T12:43:00Z" w16du:dateUtc="2025-08-22T10:43:00Z">
+      <w:del w:id="194" w:author="Craig Parker" w:date="2025-08-22T12:43:00Z" w16du:dateUtc="2025-08-22T10:43:00Z">
         <w:r>
           <w:rPr>
             <w:b/>
@@ -13367,7 +12896,7 @@
           <w:delText xml:space="preserve"> </w:delText>
         </w:r>
       </w:del>
-      <w:ins w:id="253" w:author="Craig Parker" w:date="2025-08-22T12:43:00Z" w16du:dateUtc="2025-08-22T10:43:00Z">
+      <w:ins w:id="195" w:author="Craig Parker" w:date="2025-08-22T12:43:00Z" w16du:dateUtc="2025-08-22T10:43:00Z">
         <w:r>
           <w:rPr>
             <w:b/>
@@ -13407,7 +12936,7 @@
       </w:r>
     </w:p>
     <w:p>
-      <w:del w:id="254" w:author="Craig Parker" w:date="2025-08-05T12:16:00Z" w16du:dateUtc="2025-08-05T10:16:00Z">
+      <w:del w:id="196" w:author="Craig Parker" w:date="2025-08-05T12:16:00Z" w16du:dateUtc="2025-08-05T10:16:00Z">
         <w:r>
           <w:rPr>
             <w:noProof/>
@@ -13421,54 +12950,24 @@
     <w:p>
       <w:pPr>
         <w:rPr>
-          <w:ins w:id="255" w:author="Craig Parker" w:date="2025-08-22T12:44:00Z"/>
-        </w:rPr>
-        <w:pPrChange w:id="256" w:author="Craig Parker" w:date="2025-08-22T12:44:00Z" w16du:dateUtc="2025-08-22T10:44:00Z">
+          <w:ins w:id="197" w:author="Craig Parker [2]" w:date="2025-09-11T15:07:00Z" w16du:dateUtc="2025-09-11T13:07:00Z"/>
+        </w:rPr>
+        <w:pPrChange w:id="198" w:author="Craig Parker" w:date="2025-08-22T12:44:00Z" w16du:dateUtc="2025-08-22T10:44:00Z">
           <w:pPr>
             <w:pStyle w:val="Heading2"/>
           </w:pPr>
         </w:pPrChange>
       </w:pPr>
-      <w:bookmarkStart w:id="257" w:name="roles-and-responsibilities"/>
-      <w:bookmarkEnd w:id="218"/>
-      <w:bookmarkEnd w:id="250"/>
-      <w:ins w:id="258" w:author="Craig Parker" w:date="2025-08-22T12:44:00Z">
-        <w:del w:id="259" w:author="Lisa van Aardenne" w:date="2025-08-25T18:09:00Z">
-          <w:r>
-            <w:rPr>
-              <w:rPrChange w:id="260" w:author="Craig Parker" w:date="2025-08-22T12:44:00Z">
-                <w:rPr>
-                  <w:b/>
-                  <w:bCs/>
-                </w:rPr>
-              </w:rPrChange>
-            </w:rPr>
-            <w:delText>During the transition period</w:delText>
-          </w:r>
-        </w:del>
-        <w:del w:id="261" w:author="Lisa van Aardenne" w:date="2025-08-25T18:10:00Z">
-          <w:r>
-            <w:rPr>
-              <w:rPrChange w:id="262" w:author="Craig Parker" w:date="2025-08-22T12:44:00Z">
-                <w:rPr>
-                  <w:b/>
-                  <w:bCs/>
-                </w:rPr>
-              </w:rPrChange>
-            </w:rPr>
-            <w:delText>,</w:delText>
-          </w:r>
-        </w:del>
-      </w:ins>
-      <w:ins w:id="263" w:author="Lisa van Aardenne" w:date="2025-08-25T18:09:00Z">
+      <w:bookmarkStart w:id="199" w:name="roles-and-responsibilities"/>
+      <w:bookmarkEnd w:id="171"/>
+      <w:bookmarkEnd w:id="192"/>
+      <w:ins w:id="200" w:author="Craig Parker [2]" w:date="2025-09-11T15:07:00Z" w16du:dateUtc="2025-09-11T13:07:00Z">
         <w:r>
           <w:t>From the start of Year 5,</w:t>
         </w:r>
-      </w:ins>
-      <w:ins w:id="264" w:author="Craig Parker" w:date="2025-08-22T12:44:00Z">
         <w:r>
           <w:rPr>
-            <w:rPrChange w:id="265" w:author="Craig Parker" w:date="2025-08-22T12:44:00Z">
+            <w:rPrChange w:id="201" w:author="Craig Parker" w:date="2025-08-22T12:44:00Z">
               <w:rPr>
                 <w:b/>
                 <w:bCs/>
@@ -13487,9 +12986,9 @@
           <w:numId w:val="27"/>
         </w:numPr>
         <w:rPr>
-          <w:ins w:id="266" w:author="Craig Parker" w:date="2025-08-22T12:44:00Z"/>
-        </w:rPr>
-        <w:pPrChange w:id="267" w:author="Craig Parker" w:date="2025-08-22T12:44:00Z" w16du:dateUtc="2025-08-22T10:44:00Z">
+          <w:ins w:id="202" w:author="Craig Parker [2]" w:date="2025-09-11T15:07:00Z" w16du:dateUtc="2025-09-11T13:07:00Z"/>
+        </w:rPr>
+        <w:pPrChange w:id="203" w:author="Craig Parker" w:date="2025-08-22T12:44:00Z" w16du:dateUtc="2025-08-22T10:44:00Z">
           <w:pPr>
             <w:pStyle w:val="Heading2"/>
             <w:numPr>
@@ -13502,10 +13001,10 @@
           </w:pPr>
         </w:pPrChange>
       </w:pPr>
-      <w:ins w:id="268" w:author="Craig Parker" w:date="2025-08-22T12:44:00Z">
+      <w:ins w:id="204" w:author="Craig Parker [2]" w:date="2025-09-11T15:07:00Z" w16du:dateUtc="2025-09-11T13:07:00Z">
         <w:r>
           <w:rPr>
-            <w:rPrChange w:id="269" w:author="Craig Parker" w:date="2025-08-22T12:44:00Z" w16du:dateUtc="2025-08-22T10:44:00Z">
+            <w:rPrChange w:id="205" w:author="Craig Parker" w:date="2025-08-22T12:44:00Z" w16du:dateUtc="2025-08-22T10:44:00Z">
               <w:rPr>
                 <w:b/>
                 <w:bCs/>
@@ -13524,9 +13023,9 @@
           <w:numId w:val="27"/>
         </w:numPr>
         <w:rPr>
-          <w:ins w:id="270" w:author="Craig Parker" w:date="2025-08-22T12:44:00Z"/>
-        </w:rPr>
-        <w:pPrChange w:id="271" w:author="Craig Parker" w:date="2025-08-22T12:44:00Z" w16du:dateUtc="2025-08-22T10:44:00Z">
+          <w:ins w:id="206" w:author="Craig Parker [2]" w:date="2025-09-11T15:07:00Z" w16du:dateUtc="2025-09-11T13:07:00Z"/>
+        </w:rPr>
+        <w:pPrChange w:id="207" w:author="Craig Parker" w:date="2025-08-22T12:44:00Z" w16du:dateUtc="2025-08-22T10:44:00Z">
           <w:pPr>
             <w:pStyle w:val="Heading2"/>
             <w:numPr>
@@ -13539,10 +13038,10 @@
           </w:pPr>
         </w:pPrChange>
       </w:pPr>
-      <w:ins w:id="272" w:author="Craig Parker" w:date="2025-08-22T12:44:00Z">
+      <w:ins w:id="208" w:author="Craig Parker [2]" w:date="2025-09-11T15:07:00Z" w16du:dateUtc="2025-09-11T13:07:00Z">
         <w:r>
           <w:rPr>
-            <w:rPrChange w:id="273" w:author="Craig Parker" w:date="2025-08-22T12:44:00Z" w16du:dateUtc="2025-08-22T10:44:00Z">
+            <w:rPrChange w:id="209" w:author="Craig Parker" w:date="2025-08-22T12:44:00Z" w16du:dateUtc="2025-08-22T10:44:00Z">
               <w:rPr>
                 <w:b/>
                 <w:bCs/>
@@ -13561,9 +13060,9 @@
           <w:numId w:val="27"/>
         </w:numPr>
         <w:rPr>
-          <w:ins w:id="274" w:author="Craig Parker" w:date="2025-08-22T12:44:00Z"/>
-        </w:rPr>
-        <w:pPrChange w:id="275" w:author="Craig Parker" w:date="2025-08-22T12:44:00Z" w16du:dateUtc="2025-08-22T10:44:00Z">
+          <w:ins w:id="210" w:author="Craig Parker [2]" w:date="2025-09-11T15:07:00Z" w16du:dateUtc="2025-09-11T13:07:00Z"/>
+        </w:rPr>
+        <w:pPrChange w:id="211" w:author="Craig Parker" w:date="2025-08-22T12:44:00Z" w16du:dateUtc="2025-08-22T10:44:00Z">
           <w:pPr>
             <w:pStyle w:val="Heading2"/>
             <w:numPr>
@@ -13576,10 +13075,10 @@
           </w:pPr>
         </w:pPrChange>
       </w:pPr>
-      <w:ins w:id="276" w:author="Craig Parker" w:date="2025-08-22T12:44:00Z">
+      <w:ins w:id="212" w:author="Craig Parker [2]" w:date="2025-09-11T15:07:00Z" w16du:dateUtc="2025-09-11T13:07:00Z">
         <w:r>
           <w:rPr>
-            <w:rPrChange w:id="277" w:author="Craig Parker" w:date="2025-08-22T12:44:00Z" w16du:dateUtc="2025-08-22T10:44:00Z">
+            <w:rPrChange w:id="213" w:author="Craig Parker" w:date="2025-08-22T12:44:00Z" w16du:dateUtc="2025-08-22T10:44:00Z">
               <w:rPr>
                 <w:b/>
                 <w:bCs/>
@@ -13598,9 +13097,9 @@
           <w:numId w:val="27"/>
         </w:numPr>
         <w:rPr>
-          <w:ins w:id="278" w:author="Craig Parker" w:date="2025-08-22T12:44:00Z"/>
-        </w:rPr>
-        <w:pPrChange w:id="279" w:author="Craig Parker" w:date="2025-08-22T12:44:00Z" w16du:dateUtc="2025-08-22T10:44:00Z">
+          <w:ins w:id="214" w:author="Craig Parker [2]" w:date="2025-09-11T15:07:00Z" w16du:dateUtc="2025-09-11T13:07:00Z"/>
+        </w:rPr>
+        <w:pPrChange w:id="215" w:author="Craig Parker" w:date="2025-08-22T12:44:00Z" w16du:dateUtc="2025-08-22T10:44:00Z">
           <w:pPr>
             <w:pStyle w:val="Heading2"/>
             <w:numPr>
@@ -13613,10 +13112,10 @@
           </w:pPr>
         </w:pPrChange>
       </w:pPr>
-      <w:ins w:id="280" w:author="Craig Parker" w:date="2025-08-22T12:44:00Z">
+      <w:ins w:id="216" w:author="Craig Parker [2]" w:date="2025-09-11T15:07:00Z" w16du:dateUtc="2025-09-11T13:07:00Z">
         <w:r>
           <w:rPr>
-            <w:rPrChange w:id="281" w:author="Craig Parker" w:date="2025-08-22T12:44:00Z" w16du:dateUtc="2025-08-22T10:44:00Z">
+            <w:rPrChange w:id="217" w:author="Craig Parker" w:date="2025-08-22T12:44:00Z" w16du:dateUtc="2025-08-22T10:44:00Z">
               <w:rPr>
                 <w:b/>
                 <w:bCs/>
@@ -13635,9 +13134,9 @@
           <w:numId w:val="27"/>
         </w:numPr>
         <w:rPr>
-          <w:ins w:id="282" w:author="Craig Parker" w:date="2025-08-22T12:44:00Z"/>
-        </w:rPr>
-        <w:pPrChange w:id="283" w:author="Craig Parker" w:date="2025-08-22T12:44:00Z" w16du:dateUtc="2025-08-22T10:44:00Z">
+          <w:ins w:id="218" w:author="Craig Parker [2]" w:date="2025-09-11T15:07:00Z" w16du:dateUtc="2025-09-11T13:07:00Z"/>
+        </w:rPr>
+        <w:pPrChange w:id="219" w:author="Craig Parker" w:date="2025-08-22T12:44:00Z" w16du:dateUtc="2025-08-22T10:44:00Z">
           <w:pPr>
             <w:pStyle w:val="Heading2"/>
             <w:numPr>
@@ -13650,10 +13149,10 @@
           </w:pPr>
         </w:pPrChange>
       </w:pPr>
-      <w:ins w:id="284" w:author="Craig Parker" w:date="2025-08-22T12:44:00Z">
+      <w:ins w:id="220" w:author="Craig Parker [2]" w:date="2025-09-11T15:07:00Z" w16du:dateUtc="2025-09-11T13:07:00Z">
         <w:r>
           <w:rPr>
-            <w:rPrChange w:id="285" w:author="Craig Parker" w:date="2025-08-22T12:44:00Z" w16du:dateUtc="2025-08-22T10:44:00Z">
+            <w:rPrChange w:id="221" w:author="Craig Parker" w:date="2025-08-22T12:44:00Z" w16du:dateUtc="2025-08-22T10:44:00Z">
               <w:rPr>
                 <w:b/>
                 <w:bCs/>
@@ -13681,7 +13180,7 @@
       <w:pPr>
         <w:pStyle w:val="Heading2"/>
       </w:pPr>
-      <w:bookmarkStart w:id="286" w:name="_Toc206760706"/>
+      <w:bookmarkStart w:id="222" w:name="_Toc206760706"/>
       <w:r>
         <w:lastRenderedPageBreak/>
         <w:t>15. Roles and responsibilitie</w:t>
@@ -13689,7 +13188,7 @@
       <w:r>
         <w:t>s</w:t>
       </w:r>
-      <w:bookmarkEnd w:id="286"/>
+      <w:bookmarkEnd w:id="222"/>
     </w:p>
     <w:p>
       <w:r>
@@ -13743,8 +13242,8 @@
                 <w:color w:val="000000"/>
               </w:rPr>
             </w:pPr>
-            <w:bookmarkStart w:id="287" w:name="X2878d8c0a61e4de906e8d0ce3fe7a9adc3709f9"/>
-            <w:bookmarkEnd w:id="257"/>
+            <w:bookmarkStart w:id="223" w:name="X2878d8c0a61e4de906e8d0ce3fe7a9adc3709f9"/>
+            <w:bookmarkEnd w:id="199"/>
             <w:r>
               <w:rPr>
                 <w:rFonts w:ascii="Arial" w:eastAsia="Times New Roman" w:hAnsi="Arial" w:cs="Arial"/>
@@ -13901,35 +13400,28 @@
                 <w:color w:val="000000"/>
               </w:rPr>
             </w:pPr>
-            <w:commentRangeStart w:id="288"/>
-            <w:commentRangeStart w:id="289"/>
+            <w:commentRangeStart w:id="224"/>
+            <w:commentRangeStart w:id="225"/>
             <w:r>
               <w:rPr>
                 <w:rFonts w:ascii="Arial" w:eastAsia="Times New Roman" w:hAnsi="Arial" w:cs="Arial"/>
                 <w:color w:val="000000" w:themeColor="text1"/>
               </w:rPr>
-              <w:t>UCT, IBM</w:t>
-            </w:r>
-            <w:r>
-              <w:rPr>
-                <w:rFonts w:ascii="Arial" w:eastAsia="Times New Roman" w:hAnsi="Arial" w:cs="Arial"/>
-                <w:color w:val="000000" w:themeColor="text1"/>
-              </w:rPr>
-              <w:t>, WHC</w:t>
-            </w:r>
-            <w:commentRangeEnd w:id="288"/>
+              <w:t>UCT, IBM, WHC</w:t>
+            </w:r>
+            <w:commentRangeEnd w:id="224"/>
             <w:r>
               <w:rPr>
                 <w:rStyle w:val="CommentReference"/>
               </w:rPr>
-              <w:commentReference w:id="288"/>
-            </w:r>
-            <w:commentRangeEnd w:id="289"/>
+              <w:commentReference w:id="224"/>
+            </w:r>
+            <w:commentRangeEnd w:id="225"/>
             <w:r>
               <w:rPr>
                 <w:rStyle w:val="CommentReference"/>
               </w:rPr>
-              <w:commentReference w:id="289"/>
+              <w:commentReference w:id="225"/>
             </w:r>
           </w:p>
         </w:tc>
@@ -14499,12 +13991,12 @@
       <w:pPr>
         <w:pStyle w:val="Heading2"/>
       </w:pPr>
-      <w:bookmarkStart w:id="290" w:name="_Toc206760707"/>
+      <w:bookmarkStart w:id="226" w:name="_Toc206760707"/>
       <w:r>
         <w:lastRenderedPageBreak/>
         <w:t>16. Assessment and revision of the Data Management Plan</w:t>
       </w:r>
-      <w:bookmarkEnd w:id="290"/>
+      <w:bookmarkEnd w:id="226"/>
     </w:p>
     <w:p>
       <w:pPr>
@@ -14526,12 +14018,12 @@
       <w:pPr>
         <w:pStyle w:val="Heading3"/>
       </w:pPr>
-      <w:bookmarkStart w:id="291" w:name="_Toc206760708"/>
-      <w:bookmarkStart w:id="292" w:name="assessment-scope"/>
+      <w:bookmarkStart w:id="227" w:name="_Toc206760708"/>
+      <w:bookmarkStart w:id="228" w:name="assessment-scope"/>
       <w:r>
         <w:t>16.1. Assessment scope</w:t>
       </w:r>
-      <w:bookmarkEnd w:id="291"/>
+      <w:bookmarkEnd w:id="227"/>
     </w:p>
     <w:p>
       <w:pPr>
@@ -14690,13 +14182,13 @@
       <w:pPr>
         <w:pStyle w:val="Heading3"/>
       </w:pPr>
-      <w:bookmarkStart w:id="293" w:name="_Toc206760709"/>
-      <w:bookmarkStart w:id="294" w:name="revision-process"/>
-      <w:bookmarkEnd w:id="292"/>
+      <w:bookmarkStart w:id="229" w:name="_Toc206760709"/>
+      <w:bookmarkStart w:id="230" w:name="revision-process"/>
+      <w:bookmarkEnd w:id="228"/>
       <w:r>
         <w:t>16.2. Revision process</w:t>
       </w:r>
-      <w:bookmarkEnd w:id="293"/>
+      <w:bookmarkEnd w:id="229"/>
     </w:p>
     <w:p>
       <w:pPr>
@@ -14777,7 +14269,7 @@
           <w:numId w:val="16"/>
         </w:numPr>
         <w:rPr>
-          <w:ins w:id="295" w:author="Craig Parker" w:date="2025-08-15T08:16:00Z" w16du:dateUtc="2025-08-15T08:16:34Z"/>
+          <w:ins w:id="231" w:author="Craig Parker" w:date="2025-08-15T08:16:00Z" w16du:dateUtc="2025-08-15T08:16:34Z"/>
         </w:rPr>
       </w:pPr>
       <w:r>
@@ -14792,11 +14284,11 @@
           <w:numId w:val="16"/>
         </w:numPr>
         <w:rPr>
-          <w:ins w:id="296" w:author="Craig Parker" w:date="2025-08-15T08:17:00Z" w16du:dateUtc="2025-08-15T08:17:00Z"/>
+          <w:ins w:id="232" w:author="Craig Parker [2]" w:date="2025-09-11T15:08:00Z" w16du:dateUtc="2025-09-11T13:08:00Z"/>
           <w:rFonts w:ascii="Aptos" w:eastAsia="Aptos" w:hAnsi="Aptos"/>
         </w:rPr>
       </w:pPr>
-      <w:ins w:id="297" w:author="Craig Parker" w:date="2025-08-15T08:17:00Z">
+      <w:ins w:id="233" w:author="Craig Parker [2]" w:date="2025-09-11T15:08:00Z" w16du:dateUtc="2025-09-11T13:08:00Z">
         <w:r>
           <w:rPr>
             <w:rFonts w:ascii="Aptos" w:eastAsia="Aptos" w:hAnsi="Aptos"/>
@@ -14809,7 +14301,7 @@
       <w:pPr>
         <w:pStyle w:val="Compact"/>
         <w:ind w:left="720"/>
-        <w:pPrChange w:id="298" w:author="Craig Parker" w:date="2025-08-15T08:17:00Z">
+        <w:pPrChange w:id="234" w:author="Craig Parker" w:date="2025-08-15T08:17:00Z">
           <w:pPr>
             <w:pStyle w:val="Compact"/>
             <w:numPr>
@@ -14863,11 +14355,9 @@
       <w:r>
         <w:t xml:space="preserve">All relevant </w:t>
       </w:r>
-      <w:ins w:id="299" w:author="Lisa van Aardenne" w:date="2025-08-25T18:14:00Z">
-        <w:r>
-          <w:t xml:space="preserve">data providers, HEAT Center members and </w:t>
-        </w:r>
-      </w:ins>
+      <w:r>
+        <w:t xml:space="preserve">data providers, HEAT Center members and </w:t>
+      </w:r>
       <w:r>
         <w:t>stakeholders will be informed of the changes, and any necessary training or guidance will be provided to ensure smooth implementation.</w:t>
       </w:r>
@@ -14893,16 +14383,16 @@
           <w:cols w:space="720"/>
         </w:sectPr>
       </w:pPr>
-      <w:bookmarkStart w:id="300" w:name="cloud-migration-implementation"/>
-      <w:bookmarkEnd w:id="287"/>
-      <w:bookmarkEnd w:id="294"/>
-    </w:p>
-    <w:p>
-      <w:bookmarkStart w:id="301" w:name="migration-strategy"/>
-      <w:bookmarkStart w:id="302" w:name="technical-implementation"/>
-      <w:bookmarkStart w:id="303" w:name="risk-mitigation-and-quality-assurance"/>
-      <w:bookmarkEnd w:id="301"/>
-      <w:bookmarkEnd w:id="302"/>
+      <w:bookmarkStart w:id="235" w:name="cloud-migration-implementation"/>
+      <w:bookmarkEnd w:id="223"/>
+      <w:bookmarkEnd w:id="230"/>
+    </w:p>
+    <w:p>
+      <w:bookmarkStart w:id="236" w:name="migration-strategy"/>
+      <w:bookmarkStart w:id="237" w:name="technical-implementation"/>
+      <w:bookmarkStart w:id="238" w:name="risk-mitigation-and-quality-assurance"/>
+      <w:bookmarkEnd w:id="236"/>
+      <w:bookmarkEnd w:id="237"/>
     </w:p>
     <w:p>
       <w:pPr>
@@ -14916,42 +14406,42 @@
           <w:cols w:space="720"/>
         </w:sectPr>
       </w:pPr>
-      <w:bookmarkStart w:id="304" w:name="annexes"/>
-      <w:bookmarkEnd w:id="300"/>
-      <w:bookmarkEnd w:id="303"/>
+      <w:bookmarkStart w:id="239" w:name="annexes"/>
+      <w:bookmarkEnd w:id="235"/>
+      <w:bookmarkEnd w:id="238"/>
     </w:p>
     <w:p>
       <w:pPr>
         <w:pStyle w:val="Heading2"/>
       </w:pPr>
-      <w:bookmarkStart w:id="305" w:name="_Toc206760710"/>
+      <w:bookmarkStart w:id="240" w:name="_Toc206760710"/>
       <w:r>
         <w:lastRenderedPageBreak/>
         <w:t>Annexes</w:t>
       </w:r>
-      <w:bookmarkEnd w:id="305"/>
+      <w:bookmarkEnd w:id="240"/>
     </w:p>
     <w:p>
       <w:pPr>
         <w:pStyle w:val="Heading3"/>
         <w:rPr>
-          <w:ins w:id="306" w:author="Craig Parker" w:date="2025-08-22T12:50:00Z" w16du:dateUtc="2025-08-22T10:50:00Z"/>
-        </w:rPr>
-      </w:pPr>
-      <w:bookmarkStart w:id="307" w:name="_Toc206760711"/>
-      <w:bookmarkStart w:id="308" w:name="annex-1-key-data-sources"/>
-      <w:ins w:id="309" w:author="Craig Parker" w:date="2025-08-22T12:49:00Z" w16du:dateUtc="2025-08-22T10:49:00Z">
+          <w:ins w:id="241" w:author="Craig Parker [2]" w:date="2025-09-11T15:11:00Z" w16du:dateUtc="2025-09-11T13:11:00Z"/>
+        </w:rPr>
+      </w:pPr>
+      <w:bookmarkStart w:id="242" w:name="annex-1-key-data-sources"/>
+      <w:bookmarkStart w:id="243" w:name="_Toc206760711"/>
+      <w:ins w:id="244" w:author="Craig Parker [2]" w:date="2025-09-11T15:11:00Z" w16du:dateUtc="2025-09-11T13:11:00Z">
         <w:r>
           <w:t>Annex 1: Transition Implementation Details</w:t>
         </w:r>
+        <w:bookmarkEnd w:id="243"/>
       </w:ins>
-      <w:bookmarkEnd w:id="307"/>
     </w:p>
     <w:p>
       <w:pPr>
         <w:pStyle w:val="BodyText"/>
         <w:rPr>
-          <w:ins w:id="310" w:author="Craig Parker" w:date="2025-08-22T12:50:00Z" w16du:dateUtc="2025-08-22T10:50:00Z"/>
+          <w:ins w:id="245" w:author="Craig Parker [2]" w:date="2025-09-11T15:11:00Z" w16du:dateUtc="2025-09-11T13:11:00Z"/>
         </w:rPr>
       </w:pPr>
     </w:p>
@@ -14959,14 +14449,14 @@
       <w:pPr>
         <w:spacing w:before="100" w:beforeAutospacing="1" w:after="100" w:afterAutospacing="1"/>
         <w:rPr>
-          <w:ins w:id="311" w:author="Craig Parker" w:date="2025-08-22T12:50:00Z" w16du:dateUtc="2025-08-22T10:50:00Z"/>
+          <w:ins w:id="246" w:author="Craig Parker [2]" w:date="2025-09-11T15:11:00Z" w16du:dateUtc="2025-09-11T13:11:00Z"/>
           <w:rFonts w:ascii="Arial" w:eastAsia="Times New Roman" w:hAnsi="Arial" w:cs="Arial"/>
           <w:color w:val="000000"/>
           <w:sz w:val="27"/>
           <w:szCs w:val="27"/>
         </w:rPr>
       </w:pPr>
-      <w:ins w:id="312" w:author="Craig Parker" w:date="2025-08-22T12:50:00Z" w16du:dateUtc="2025-08-22T10:50:00Z">
+      <w:ins w:id="247" w:author="Craig Parker [2]" w:date="2025-09-11T15:11:00Z" w16du:dateUtc="2025-09-11T13:11:00Z">
         <w:r>
           <w:rPr>
             <w:rFonts w:ascii="Arial" w:eastAsia="Times New Roman" w:hAnsi="Arial" w:cs="Arial"/>
@@ -15009,7 +14499,7 @@
         <w:spacing w:before="100" w:beforeAutospacing="1" w:after="100" w:afterAutospacing="1"/>
         <w:outlineLvl w:val="3"/>
         <w:rPr>
-          <w:ins w:id="313" w:author="Craig Parker" w:date="2025-08-22T12:50:00Z" w16du:dateUtc="2025-08-22T10:50:00Z"/>
+          <w:ins w:id="248" w:author="Craig Parker [2]" w:date="2025-09-11T15:11:00Z" w16du:dateUtc="2025-09-11T13:11:00Z"/>
           <w:rFonts w:ascii="Arial" w:eastAsia="Times New Roman" w:hAnsi="Arial" w:cs="Arial"/>
           <w:b/>
           <w:bCs/>
@@ -15018,7 +14508,7 @@
           <w:szCs w:val="27"/>
         </w:rPr>
       </w:pPr>
-      <w:ins w:id="314" w:author="Craig Parker" w:date="2025-08-22T12:50:00Z" w16du:dateUtc="2025-08-22T10:50:00Z">
+      <w:ins w:id="249" w:author="Craig Parker [2]" w:date="2025-09-11T15:11:00Z" w16du:dateUtc="2025-09-11T13:11:00Z">
         <w:r>
           <w:rPr>
             <w:rFonts w:ascii="Arial" w:eastAsia="Times New Roman" w:hAnsi="Arial" w:cs="Arial"/>
@@ -15036,14 +14526,14 @@
       <w:pPr>
         <w:spacing w:before="100" w:beforeAutospacing="1" w:after="100" w:afterAutospacing="1"/>
         <w:rPr>
-          <w:ins w:id="315" w:author="Craig Parker" w:date="2025-08-22T12:50:00Z" w16du:dateUtc="2025-08-22T10:50:00Z"/>
+          <w:ins w:id="250" w:author="Craig Parker [2]" w:date="2025-09-11T15:11:00Z" w16du:dateUtc="2025-09-11T13:11:00Z"/>
           <w:rFonts w:ascii="Arial" w:eastAsia="Times New Roman" w:hAnsi="Arial" w:cs="Arial"/>
           <w:color w:val="000000"/>
           <w:sz w:val="27"/>
           <w:szCs w:val="27"/>
         </w:rPr>
       </w:pPr>
-      <w:ins w:id="316" w:author="Craig Parker" w:date="2025-08-22T12:50:00Z" w16du:dateUtc="2025-08-22T10:50:00Z">
+      <w:ins w:id="251" w:author="Craig Parker [2]" w:date="2025-09-11T15:11:00Z" w16du:dateUtc="2025-09-11T13:11:00Z">
         <w:r>
           <w:rPr>
             <w:rFonts w:ascii="Arial" w:eastAsia="Times New Roman" w:hAnsi="Arial" w:cs="Arial"/>
@@ -15061,14 +14551,14 @@
       <w:pPr>
         <w:spacing w:before="100" w:beforeAutospacing="1" w:after="100" w:afterAutospacing="1"/>
         <w:rPr>
-          <w:ins w:id="317" w:author="Craig Parker" w:date="2025-08-22T12:50:00Z" w16du:dateUtc="2025-08-22T10:50:00Z"/>
+          <w:ins w:id="252" w:author="Craig Parker [2]" w:date="2025-09-11T15:11:00Z" w16du:dateUtc="2025-09-11T13:11:00Z"/>
           <w:rFonts w:ascii="Arial" w:eastAsia="Times New Roman" w:hAnsi="Arial" w:cs="Arial"/>
           <w:color w:val="000000"/>
           <w:sz w:val="27"/>
           <w:szCs w:val="27"/>
         </w:rPr>
       </w:pPr>
-      <w:ins w:id="318" w:author="Craig Parker" w:date="2025-08-22T12:50:00Z" w16du:dateUtc="2025-08-22T10:50:00Z">
+      <w:ins w:id="253" w:author="Craig Parker [2]" w:date="2025-09-11T15:11:00Z" w16du:dateUtc="2025-09-11T13:11:00Z">
         <w:r>
           <w:rPr>
             <w:rFonts w:ascii="Arial" w:eastAsia="Times New Roman" w:hAnsi="Arial" w:cs="Arial"/>
@@ -15090,14 +14580,14 @@
         </w:numPr>
         <w:spacing w:before="100" w:beforeAutospacing="1" w:after="100" w:afterAutospacing="1"/>
         <w:rPr>
-          <w:ins w:id="319" w:author="Craig Parker" w:date="2025-08-22T12:50:00Z" w16du:dateUtc="2025-08-22T10:50:00Z"/>
+          <w:ins w:id="254" w:author="Craig Parker [2]" w:date="2025-09-11T15:11:00Z" w16du:dateUtc="2025-09-11T13:11:00Z"/>
           <w:rFonts w:ascii="Arial" w:eastAsia="Times New Roman" w:hAnsi="Arial" w:cs="Arial"/>
           <w:color w:val="000000"/>
           <w:sz w:val="27"/>
           <w:szCs w:val="27"/>
         </w:rPr>
       </w:pPr>
-      <w:ins w:id="320" w:author="Craig Parker" w:date="2025-08-22T12:50:00Z" w16du:dateUtc="2025-08-22T10:50:00Z">
+      <w:ins w:id="255" w:author="Craig Parker [2]" w:date="2025-09-11T15:11:00Z" w16du:dateUtc="2025-09-11T13:11:00Z">
         <w:r>
           <w:rPr>
             <w:rFonts w:ascii="Arial" w:eastAsia="Times New Roman" w:hAnsi="Arial" w:cs="Arial"/>
@@ -15119,14 +14609,14 @@
         </w:numPr>
         <w:spacing w:before="100" w:beforeAutospacing="1" w:after="100" w:afterAutospacing="1"/>
         <w:rPr>
-          <w:ins w:id="321" w:author="Craig Parker" w:date="2025-08-22T12:50:00Z" w16du:dateUtc="2025-08-22T10:50:00Z"/>
+          <w:ins w:id="256" w:author="Craig Parker [2]" w:date="2025-09-11T15:11:00Z" w16du:dateUtc="2025-09-11T13:11:00Z"/>
           <w:rFonts w:ascii="Arial" w:eastAsia="Times New Roman" w:hAnsi="Arial" w:cs="Arial"/>
           <w:color w:val="000000"/>
           <w:sz w:val="27"/>
           <w:szCs w:val="27"/>
         </w:rPr>
       </w:pPr>
-      <w:ins w:id="322" w:author="Craig Parker" w:date="2025-08-22T12:50:00Z" w16du:dateUtc="2025-08-22T10:50:00Z">
+      <w:ins w:id="257" w:author="Craig Parker [2]" w:date="2025-09-11T15:11:00Z" w16du:dateUtc="2025-09-11T13:11:00Z">
         <w:r>
           <w:rPr>
             <w:rFonts w:ascii="Arial" w:eastAsia="Times New Roman" w:hAnsi="Arial" w:cs="Arial"/>
@@ -15148,14 +14638,14 @@
         </w:numPr>
         <w:spacing w:before="100" w:beforeAutospacing="1" w:after="100" w:afterAutospacing="1"/>
         <w:rPr>
-          <w:ins w:id="323" w:author="Craig Parker" w:date="2025-08-22T12:50:00Z" w16du:dateUtc="2025-08-22T10:50:00Z"/>
+          <w:ins w:id="258" w:author="Craig Parker [2]" w:date="2025-09-11T15:11:00Z" w16du:dateUtc="2025-09-11T13:11:00Z"/>
           <w:rFonts w:ascii="Arial" w:eastAsia="Times New Roman" w:hAnsi="Arial" w:cs="Arial"/>
           <w:color w:val="000000"/>
           <w:sz w:val="27"/>
           <w:szCs w:val="27"/>
         </w:rPr>
       </w:pPr>
-      <w:ins w:id="324" w:author="Craig Parker" w:date="2025-08-22T12:50:00Z" w16du:dateUtc="2025-08-22T10:50:00Z">
+      <w:ins w:id="259" w:author="Craig Parker [2]" w:date="2025-09-11T15:11:00Z" w16du:dateUtc="2025-09-11T13:11:00Z">
         <w:r>
           <w:rPr>
             <w:rFonts w:ascii="Arial" w:eastAsia="Times New Roman" w:hAnsi="Arial" w:cs="Arial"/>
@@ -15177,14 +14667,14 @@
         </w:numPr>
         <w:spacing w:before="100" w:beforeAutospacing="1" w:after="100" w:afterAutospacing="1"/>
         <w:rPr>
-          <w:ins w:id="325" w:author="Craig Parker" w:date="2025-08-22T12:50:00Z" w16du:dateUtc="2025-08-22T10:50:00Z"/>
+          <w:ins w:id="260" w:author="Craig Parker [2]" w:date="2025-09-11T15:11:00Z" w16du:dateUtc="2025-09-11T13:11:00Z"/>
           <w:rFonts w:ascii="Arial" w:eastAsia="Times New Roman" w:hAnsi="Arial" w:cs="Arial"/>
           <w:color w:val="000000"/>
           <w:sz w:val="27"/>
           <w:szCs w:val="27"/>
         </w:rPr>
       </w:pPr>
-      <w:ins w:id="326" w:author="Craig Parker" w:date="2025-08-22T12:50:00Z" w16du:dateUtc="2025-08-22T10:50:00Z">
+      <w:ins w:id="261" w:author="Craig Parker [2]" w:date="2025-09-11T15:11:00Z" w16du:dateUtc="2025-09-11T13:11:00Z">
         <w:r>
           <w:rPr>
             <w:rFonts w:ascii="Arial" w:eastAsia="Times New Roman" w:hAnsi="Arial" w:cs="Arial"/>
@@ -15202,14 +14692,14 @@
       <w:pPr>
         <w:spacing w:before="100" w:beforeAutospacing="1" w:after="100" w:afterAutospacing="1"/>
         <w:rPr>
-          <w:ins w:id="327" w:author="Craig Parker" w:date="2025-08-22T12:50:00Z" w16du:dateUtc="2025-08-22T10:50:00Z"/>
+          <w:ins w:id="262" w:author="Craig Parker [2]" w:date="2025-09-11T15:11:00Z" w16du:dateUtc="2025-09-11T13:11:00Z"/>
           <w:rFonts w:ascii="Arial" w:eastAsia="Times New Roman" w:hAnsi="Arial" w:cs="Arial"/>
           <w:color w:val="000000"/>
           <w:sz w:val="27"/>
           <w:szCs w:val="27"/>
         </w:rPr>
       </w:pPr>
-      <w:ins w:id="328" w:author="Craig Parker" w:date="2025-08-22T12:50:00Z" w16du:dateUtc="2025-08-22T10:50:00Z">
+      <w:ins w:id="263" w:author="Craig Parker [2]" w:date="2025-09-11T15:11:00Z" w16du:dateUtc="2025-09-11T13:11:00Z">
         <w:r>
           <w:rPr>
             <w:rFonts w:ascii="Arial" w:eastAsia="Times New Roman" w:hAnsi="Arial" w:cs="Arial"/>
@@ -15231,14 +14721,14 @@
         </w:numPr>
         <w:spacing w:before="100" w:beforeAutospacing="1" w:after="100" w:afterAutospacing="1"/>
         <w:rPr>
-          <w:ins w:id="329" w:author="Craig Parker" w:date="2025-08-22T12:50:00Z" w16du:dateUtc="2025-08-22T10:50:00Z"/>
+          <w:ins w:id="264" w:author="Craig Parker [2]" w:date="2025-09-11T15:11:00Z" w16du:dateUtc="2025-09-11T13:11:00Z"/>
           <w:rFonts w:ascii="Arial" w:eastAsia="Times New Roman" w:hAnsi="Arial" w:cs="Arial"/>
           <w:color w:val="000000"/>
           <w:sz w:val="27"/>
           <w:szCs w:val="27"/>
         </w:rPr>
       </w:pPr>
-      <w:ins w:id="330" w:author="Craig Parker" w:date="2025-08-22T12:50:00Z" w16du:dateUtc="2025-08-22T10:50:00Z">
+      <w:ins w:id="265" w:author="Craig Parker [2]" w:date="2025-09-11T15:11:00Z" w16du:dateUtc="2025-09-11T13:11:00Z">
         <w:r>
           <w:rPr>
             <w:rFonts w:ascii="Arial" w:eastAsia="Times New Roman" w:hAnsi="Arial" w:cs="Arial"/>
@@ -15260,14 +14750,14 @@
         </w:numPr>
         <w:spacing w:before="100" w:beforeAutospacing="1" w:after="100" w:afterAutospacing="1"/>
         <w:rPr>
-          <w:ins w:id="331" w:author="Craig Parker" w:date="2025-08-22T12:50:00Z" w16du:dateUtc="2025-08-22T10:50:00Z"/>
+          <w:ins w:id="266" w:author="Craig Parker [2]" w:date="2025-09-11T15:11:00Z" w16du:dateUtc="2025-09-11T13:11:00Z"/>
           <w:rFonts w:ascii="Arial" w:eastAsia="Times New Roman" w:hAnsi="Arial" w:cs="Arial"/>
           <w:color w:val="000000"/>
           <w:sz w:val="27"/>
           <w:szCs w:val="27"/>
         </w:rPr>
       </w:pPr>
-      <w:ins w:id="332" w:author="Craig Parker" w:date="2025-08-22T12:50:00Z" w16du:dateUtc="2025-08-22T10:50:00Z">
+      <w:ins w:id="267" w:author="Craig Parker [2]" w:date="2025-09-11T15:11:00Z" w16du:dateUtc="2025-09-11T13:11:00Z">
         <w:r>
           <w:rPr>
             <w:rFonts w:ascii="Arial" w:eastAsia="Times New Roman" w:hAnsi="Arial" w:cs="Arial"/>
@@ -15302,14 +14792,14 @@
         </w:numPr>
         <w:spacing w:before="100" w:beforeAutospacing="1" w:after="100" w:afterAutospacing="1"/>
         <w:rPr>
-          <w:ins w:id="333" w:author="Craig Parker" w:date="2025-08-22T12:50:00Z" w16du:dateUtc="2025-08-22T10:50:00Z"/>
+          <w:ins w:id="268" w:author="Craig Parker [2]" w:date="2025-09-11T15:11:00Z" w16du:dateUtc="2025-09-11T13:11:00Z"/>
           <w:rFonts w:ascii="Arial" w:eastAsia="Times New Roman" w:hAnsi="Arial" w:cs="Arial"/>
           <w:color w:val="000000"/>
           <w:sz w:val="27"/>
           <w:szCs w:val="27"/>
         </w:rPr>
       </w:pPr>
-      <w:ins w:id="334" w:author="Craig Parker" w:date="2025-08-22T12:50:00Z" w16du:dateUtc="2025-08-22T10:50:00Z">
+      <w:ins w:id="269" w:author="Craig Parker [2]" w:date="2025-09-11T15:11:00Z" w16du:dateUtc="2025-09-11T13:11:00Z">
         <w:r>
           <w:rPr>
             <w:rFonts w:ascii="Arial" w:eastAsia="Times New Roman" w:hAnsi="Arial" w:cs="Arial"/>
@@ -15331,14 +14821,14 @@
         </w:numPr>
         <w:spacing w:before="100" w:beforeAutospacing="1" w:after="100" w:afterAutospacing="1"/>
         <w:rPr>
-          <w:ins w:id="335" w:author="Craig Parker" w:date="2025-08-22T12:50:00Z" w16du:dateUtc="2025-08-22T10:50:00Z"/>
+          <w:ins w:id="270" w:author="Craig Parker [2]" w:date="2025-09-11T15:11:00Z" w16du:dateUtc="2025-09-11T13:11:00Z"/>
           <w:rFonts w:ascii="Arial" w:eastAsia="Times New Roman" w:hAnsi="Arial" w:cs="Arial"/>
           <w:color w:val="000000"/>
           <w:sz w:val="27"/>
           <w:szCs w:val="27"/>
         </w:rPr>
       </w:pPr>
-      <w:ins w:id="336" w:author="Craig Parker" w:date="2025-08-22T12:50:00Z" w16du:dateUtc="2025-08-22T10:50:00Z">
+      <w:ins w:id="271" w:author="Craig Parker [2]" w:date="2025-09-11T15:11:00Z" w16du:dateUtc="2025-09-11T13:11:00Z">
         <w:r>
           <w:rPr>
             <w:rFonts w:ascii="Arial" w:eastAsia="Times New Roman" w:hAnsi="Arial" w:cs="Arial"/>
@@ -15356,14 +14846,14 @@
       <w:pPr>
         <w:spacing w:before="100" w:beforeAutospacing="1" w:after="100" w:afterAutospacing="1"/>
         <w:rPr>
-          <w:ins w:id="337" w:author="Craig Parker" w:date="2025-08-22T12:50:00Z" w16du:dateUtc="2025-08-22T10:50:00Z"/>
+          <w:ins w:id="272" w:author="Craig Parker [2]" w:date="2025-09-11T15:11:00Z" w16du:dateUtc="2025-09-11T13:11:00Z"/>
           <w:rFonts w:ascii="Arial" w:eastAsia="Times New Roman" w:hAnsi="Arial" w:cs="Arial"/>
           <w:color w:val="000000"/>
           <w:sz w:val="27"/>
           <w:szCs w:val="27"/>
         </w:rPr>
       </w:pPr>
-      <w:ins w:id="338" w:author="Craig Parker" w:date="2025-08-22T12:50:00Z" w16du:dateUtc="2025-08-22T10:50:00Z">
+      <w:ins w:id="273" w:author="Craig Parker [2]" w:date="2025-09-11T15:11:00Z" w16du:dateUtc="2025-09-11T13:11:00Z">
         <w:r>
           <w:rPr>
             <w:rFonts w:ascii="Arial" w:eastAsia="Times New Roman" w:hAnsi="Arial" w:cs="Arial"/>
@@ -15385,14 +14875,14 @@
         </w:numPr>
         <w:spacing w:before="100" w:beforeAutospacing="1" w:after="100" w:afterAutospacing="1"/>
         <w:rPr>
-          <w:ins w:id="339" w:author="Craig Parker" w:date="2025-08-22T12:50:00Z" w16du:dateUtc="2025-08-22T10:50:00Z"/>
+          <w:ins w:id="274" w:author="Craig Parker [2]" w:date="2025-09-11T15:11:00Z" w16du:dateUtc="2025-09-11T13:11:00Z"/>
           <w:rFonts w:ascii="Arial" w:eastAsia="Times New Roman" w:hAnsi="Arial" w:cs="Arial"/>
           <w:color w:val="000000"/>
           <w:sz w:val="27"/>
           <w:szCs w:val="27"/>
         </w:rPr>
       </w:pPr>
-      <w:ins w:id="340" w:author="Craig Parker" w:date="2025-08-22T12:50:00Z">
+      <w:ins w:id="275" w:author="Craig Parker [2]" w:date="2025-09-11T15:11:00Z" w16du:dateUtc="2025-09-11T13:11:00Z">
         <w:r>
           <w:rPr>
             <w:rFonts w:ascii="Arial" w:eastAsia="Times New Roman" w:hAnsi="Arial" w:cs="Arial"/>
@@ -15405,80 +14895,6 @@
           <w:lastRenderedPageBreak/>
           <w:t xml:space="preserve">Phased transfer of data categories starting with </w:t>
         </w:r>
-      </w:ins>
-      <w:del w:id="341" w:author="Craig Parker [2]" w:date="2025-09-09T11:51:00Z" w16du:dateUtc="2025-09-09T09:51:00Z">
-        <w:r>
-          <w:rPr>
-            <w:rFonts w:ascii="Arial" w:eastAsia="Times New Roman" w:hAnsi="Arial" w:cs="Arial"/>
-            <w:b/>
-            <w:bCs/>
-            <w:color w:val="FF0000"/>
-            <w:sz w:val="27"/>
-            <w:szCs w:val="27"/>
-          </w:rPr>
-          <w:delText>socio-econo</w:delText>
-        </w:r>
-        <w:r>
-          <w:rPr>
-            <w:rFonts w:ascii="Arial" w:eastAsia="Times New Roman" w:hAnsi="Arial" w:cs="Arial"/>
-            <w:b/>
-            <w:bCs/>
-            <w:color w:val="FF0000"/>
-            <w:sz w:val="27"/>
-            <w:szCs w:val="27"/>
-          </w:rPr>
-          <w:delText>m</w:delText>
-        </w:r>
-        <w:r>
-          <w:rPr>
-            <w:rFonts w:ascii="Arial" w:eastAsia="Times New Roman" w:hAnsi="Arial" w:cs="Arial"/>
-            <w:b/>
-            <w:bCs/>
-            <w:color w:val="FF0000"/>
-            <w:sz w:val="27"/>
-            <w:szCs w:val="27"/>
-          </w:rPr>
-          <w:delText>ic data</w:delText>
-        </w:r>
-        <w:r>
-          <w:rPr>
-            <w:rFonts w:ascii="Arial" w:eastAsia="Times New Roman" w:hAnsi="Arial" w:cs="Arial"/>
-            <w:b/>
-            <w:bCs/>
-            <w:color w:val="FF0000"/>
-            <w:sz w:val="27"/>
-            <w:szCs w:val="27"/>
-          </w:rPr>
-          <w:delText xml:space="preserve">, climate data and then health data subsets as </w:delText>
-        </w:r>
-        <w:r>
-          <w:rPr>
-            <w:rFonts w:ascii="Arial" w:eastAsia="Times New Roman" w:hAnsi="Arial" w:cs="Arial"/>
-            <w:b/>
-            <w:bCs/>
-            <w:color w:val="FF0000"/>
-            <w:sz w:val="27"/>
-            <w:szCs w:val="27"/>
-          </w:rPr>
-          <w:delText>they are approved by each provider</w:delText>
-        </w:r>
-      </w:del>
-      <w:ins w:id="342" w:author="Craig Parker" w:date="2025-08-22T12:50:00Z">
-        <w:del w:id="343" w:author="Craig Parker [2]" w:date="2025-09-09T11:51:00Z" w16du:dateUtc="2025-09-09T09:51:00Z">
-          <w:r>
-            <w:rPr>
-              <w:rFonts w:ascii="Arial" w:eastAsia="Times New Roman" w:hAnsi="Arial" w:cs="Arial"/>
-              <w:b/>
-              <w:bCs/>
-              <w:color w:val="FF0000"/>
-              <w:sz w:val="27"/>
-              <w:szCs w:val="27"/>
-            </w:rPr>
-            <w:delText xml:space="preserve"> </w:delText>
-          </w:r>
-        </w:del>
-      </w:ins>
-      <w:ins w:id="344" w:author="Craig Parker [2]" w:date="2025-09-09T11:51:00Z" w16du:dateUtc="2025-09-09T09:51:00Z">
         <w:r>
           <w:rPr>
             <w:rFonts w:ascii="Arial" w:eastAsia="Times New Roman" w:hAnsi="Arial" w:cs="Arial"/>
@@ -15500,14 +14916,14 @@
         </w:numPr>
         <w:spacing w:before="100" w:beforeAutospacing="1" w:after="100" w:afterAutospacing="1"/>
         <w:rPr>
-          <w:ins w:id="345" w:author="Craig Parker" w:date="2025-08-22T12:50:00Z" w16du:dateUtc="2025-08-22T10:50:00Z"/>
+          <w:ins w:id="276" w:author="Craig Parker [2]" w:date="2025-09-11T15:11:00Z" w16du:dateUtc="2025-09-11T13:11:00Z"/>
           <w:rFonts w:ascii="Arial" w:eastAsia="Times New Roman" w:hAnsi="Arial" w:cs="Arial"/>
           <w:color w:val="000000"/>
           <w:sz w:val="27"/>
           <w:szCs w:val="27"/>
         </w:rPr>
       </w:pPr>
-      <w:ins w:id="346" w:author="Craig Parker" w:date="2025-08-22T12:50:00Z" w16du:dateUtc="2025-08-22T10:50:00Z">
+      <w:ins w:id="277" w:author="Craig Parker [2]" w:date="2025-09-11T15:11:00Z" w16du:dateUtc="2025-09-11T13:11:00Z">
         <w:r>
           <w:rPr>
             <w:rFonts w:ascii="Arial" w:eastAsia="Times New Roman" w:hAnsi="Arial" w:cs="Arial"/>
@@ -15529,14 +14945,14 @@
         </w:numPr>
         <w:spacing w:before="100" w:beforeAutospacing="1" w:after="100" w:afterAutospacing="1"/>
         <w:rPr>
-          <w:ins w:id="347" w:author="Craig Parker" w:date="2025-08-22T12:50:00Z" w16du:dateUtc="2025-08-22T10:50:00Z"/>
+          <w:ins w:id="278" w:author="Craig Parker [2]" w:date="2025-09-11T15:11:00Z" w16du:dateUtc="2025-09-11T13:11:00Z"/>
           <w:rFonts w:ascii="Arial" w:eastAsia="Times New Roman" w:hAnsi="Arial" w:cs="Arial"/>
           <w:color w:val="000000"/>
           <w:sz w:val="27"/>
           <w:szCs w:val="27"/>
         </w:rPr>
       </w:pPr>
-      <w:ins w:id="348" w:author="Craig Parker" w:date="2025-08-22T12:50:00Z" w16du:dateUtc="2025-08-22T10:50:00Z">
+      <w:ins w:id="279" w:author="Craig Parker [2]" w:date="2025-09-11T15:11:00Z" w16du:dateUtc="2025-09-11T13:11:00Z">
         <w:r>
           <w:rPr>
             <w:rFonts w:ascii="Arial" w:eastAsia="Times New Roman" w:hAnsi="Arial" w:cs="Arial"/>
@@ -15558,14 +14974,14 @@
         </w:numPr>
         <w:spacing w:before="100" w:beforeAutospacing="1" w:after="100" w:afterAutospacing="1"/>
         <w:rPr>
-          <w:ins w:id="349" w:author="Craig Parker" w:date="2025-08-22T12:50:00Z" w16du:dateUtc="2025-08-22T10:50:00Z"/>
+          <w:ins w:id="280" w:author="Craig Parker [2]" w:date="2025-09-11T15:11:00Z" w16du:dateUtc="2025-09-11T13:11:00Z"/>
           <w:rFonts w:ascii="Arial" w:eastAsia="Times New Roman" w:hAnsi="Arial" w:cs="Arial"/>
           <w:color w:val="000000"/>
           <w:sz w:val="27"/>
           <w:szCs w:val="27"/>
         </w:rPr>
       </w:pPr>
-      <w:ins w:id="350" w:author="Craig Parker" w:date="2025-08-22T12:50:00Z" w16du:dateUtc="2025-08-22T10:50:00Z">
+      <w:ins w:id="281" w:author="Craig Parker [2]" w:date="2025-09-11T15:11:00Z" w16du:dateUtc="2025-09-11T13:11:00Z">
         <w:r>
           <w:rPr>
             <w:rFonts w:ascii="Arial" w:eastAsia="Times New Roman" w:hAnsi="Arial" w:cs="Arial"/>
@@ -15583,14 +14999,14 @@
       <w:pPr>
         <w:spacing w:before="100" w:beforeAutospacing="1" w:after="100" w:afterAutospacing="1"/>
         <w:rPr>
-          <w:ins w:id="351" w:author="Craig Parker" w:date="2025-08-22T12:50:00Z" w16du:dateUtc="2025-08-22T10:50:00Z"/>
+          <w:ins w:id="282" w:author="Craig Parker [2]" w:date="2025-09-11T15:11:00Z" w16du:dateUtc="2025-09-11T13:11:00Z"/>
           <w:rFonts w:ascii="Arial" w:eastAsia="Times New Roman" w:hAnsi="Arial" w:cs="Arial"/>
           <w:color w:val="000000"/>
           <w:sz w:val="27"/>
           <w:szCs w:val="27"/>
         </w:rPr>
       </w:pPr>
-      <w:ins w:id="352" w:author="Craig Parker" w:date="2025-08-22T12:50:00Z" w16du:dateUtc="2025-08-22T10:50:00Z">
+      <w:ins w:id="283" w:author="Craig Parker [2]" w:date="2025-09-11T15:11:00Z" w16du:dateUtc="2025-09-11T13:11:00Z">
         <w:r>
           <w:rPr>
             <w:rFonts w:ascii="Arial" w:eastAsia="Times New Roman" w:hAnsi="Arial" w:cs="Arial"/>
@@ -15612,14 +15028,14 @@
         </w:numPr>
         <w:spacing w:before="100" w:beforeAutospacing="1" w:after="100" w:afterAutospacing="1"/>
         <w:rPr>
-          <w:ins w:id="353" w:author="Craig Parker" w:date="2025-08-22T12:50:00Z" w16du:dateUtc="2025-08-22T10:50:00Z"/>
+          <w:ins w:id="284" w:author="Craig Parker [2]" w:date="2025-09-11T15:11:00Z" w16du:dateUtc="2025-09-11T13:11:00Z"/>
           <w:rFonts w:ascii="Arial" w:eastAsia="Times New Roman" w:hAnsi="Arial" w:cs="Arial"/>
           <w:color w:val="000000"/>
           <w:sz w:val="27"/>
           <w:szCs w:val="27"/>
         </w:rPr>
       </w:pPr>
-      <w:ins w:id="354" w:author="Craig Parker" w:date="2025-08-22T12:50:00Z" w16du:dateUtc="2025-08-22T10:50:00Z">
+      <w:ins w:id="285" w:author="Craig Parker [2]" w:date="2025-09-11T15:11:00Z" w16du:dateUtc="2025-09-11T13:11:00Z">
         <w:r>
           <w:rPr>
             <w:rFonts w:ascii="Arial" w:eastAsia="Times New Roman" w:hAnsi="Arial" w:cs="Arial"/>
@@ -15641,14 +15057,14 @@
         </w:numPr>
         <w:spacing w:before="100" w:beforeAutospacing="1" w:after="100" w:afterAutospacing="1"/>
         <w:rPr>
-          <w:ins w:id="355" w:author="Craig Parker" w:date="2025-08-22T12:50:00Z" w16du:dateUtc="2025-08-22T10:50:00Z"/>
+          <w:ins w:id="286" w:author="Craig Parker [2]" w:date="2025-09-11T15:11:00Z" w16du:dateUtc="2025-09-11T13:11:00Z"/>
           <w:rFonts w:ascii="Arial" w:eastAsia="Times New Roman" w:hAnsi="Arial" w:cs="Arial"/>
           <w:color w:val="000000"/>
           <w:sz w:val="27"/>
           <w:szCs w:val="27"/>
         </w:rPr>
       </w:pPr>
-      <w:ins w:id="356" w:author="Craig Parker" w:date="2025-08-22T12:50:00Z" w16du:dateUtc="2025-08-22T10:50:00Z">
+      <w:ins w:id="287" w:author="Craig Parker [2]" w:date="2025-09-11T15:11:00Z" w16du:dateUtc="2025-09-11T13:11:00Z">
         <w:r>
           <w:rPr>
             <w:rFonts w:ascii="Arial" w:eastAsia="Times New Roman" w:hAnsi="Arial" w:cs="Arial"/>
@@ -15670,14 +15086,14 @@
         </w:numPr>
         <w:spacing w:before="100" w:beforeAutospacing="1" w:after="100" w:afterAutospacing="1"/>
         <w:rPr>
-          <w:ins w:id="357" w:author="Craig Parker" w:date="2025-08-22T12:50:00Z" w16du:dateUtc="2025-08-22T10:50:00Z"/>
+          <w:ins w:id="288" w:author="Craig Parker [2]" w:date="2025-09-11T15:11:00Z" w16du:dateUtc="2025-09-11T13:11:00Z"/>
           <w:rFonts w:ascii="Arial" w:eastAsia="Times New Roman" w:hAnsi="Arial" w:cs="Arial"/>
           <w:color w:val="000000"/>
           <w:sz w:val="27"/>
           <w:szCs w:val="27"/>
         </w:rPr>
       </w:pPr>
-      <w:ins w:id="358" w:author="Craig Parker" w:date="2025-08-22T12:50:00Z" w16du:dateUtc="2025-08-22T10:50:00Z">
+      <w:ins w:id="289" w:author="Craig Parker [2]" w:date="2025-09-11T15:11:00Z" w16du:dateUtc="2025-09-11T13:11:00Z">
         <w:r>
           <w:rPr>
             <w:rFonts w:ascii="Arial" w:eastAsia="Times New Roman" w:hAnsi="Arial" w:cs="Arial"/>
@@ -15699,14 +15115,14 @@
         </w:numPr>
         <w:spacing w:before="100" w:beforeAutospacing="1" w:after="100" w:afterAutospacing="1"/>
         <w:rPr>
-          <w:ins w:id="359" w:author="Craig Parker" w:date="2025-08-22T12:50:00Z" w16du:dateUtc="2025-08-22T10:50:00Z"/>
+          <w:ins w:id="290" w:author="Craig Parker [2]" w:date="2025-09-11T15:11:00Z" w16du:dateUtc="2025-09-11T13:11:00Z"/>
           <w:rFonts w:ascii="Arial" w:eastAsia="Times New Roman" w:hAnsi="Arial" w:cs="Arial"/>
           <w:color w:val="000000"/>
           <w:sz w:val="27"/>
           <w:szCs w:val="27"/>
         </w:rPr>
       </w:pPr>
-      <w:ins w:id="360" w:author="Craig Parker" w:date="2025-08-22T12:50:00Z" w16du:dateUtc="2025-08-22T10:50:00Z">
+      <w:ins w:id="291" w:author="Craig Parker [2]" w:date="2025-09-11T15:11:00Z" w16du:dateUtc="2025-09-11T13:11:00Z">
         <w:r>
           <w:rPr>
             <w:rFonts w:ascii="Arial" w:eastAsia="Times New Roman" w:hAnsi="Arial" w:cs="Arial"/>
@@ -15725,7 +15141,7 @@
         <w:spacing w:before="100" w:beforeAutospacing="1" w:after="100" w:afterAutospacing="1"/>
         <w:outlineLvl w:val="3"/>
         <w:rPr>
-          <w:ins w:id="361" w:author="Craig Parker" w:date="2025-08-22T12:50:00Z" w16du:dateUtc="2025-08-22T10:50:00Z"/>
+          <w:ins w:id="292" w:author="Craig Parker [2]" w:date="2025-09-11T15:11:00Z" w16du:dateUtc="2025-09-11T13:11:00Z"/>
           <w:rFonts w:ascii="Arial" w:eastAsia="Times New Roman" w:hAnsi="Arial" w:cs="Arial"/>
           <w:b/>
           <w:bCs/>
@@ -15734,7 +15150,7 @@
           <w:szCs w:val="27"/>
         </w:rPr>
       </w:pPr>
-      <w:ins w:id="362" w:author="Craig Parker" w:date="2025-08-22T12:50:00Z" w16du:dateUtc="2025-08-22T10:50:00Z">
+      <w:ins w:id="293" w:author="Craig Parker [2]" w:date="2025-09-11T15:11:00Z" w16du:dateUtc="2025-09-11T13:11:00Z">
         <w:r>
           <w:rPr>
             <w:rFonts w:ascii="Arial" w:eastAsia="Times New Roman" w:hAnsi="Arial" w:cs="Arial"/>
@@ -15752,14 +15168,14 @@
       <w:pPr>
         <w:spacing w:before="100" w:beforeAutospacing="1" w:after="100" w:afterAutospacing="1"/>
         <w:rPr>
-          <w:ins w:id="363" w:author="Craig Parker" w:date="2025-08-22T12:50:00Z" w16du:dateUtc="2025-08-22T10:50:00Z"/>
+          <w:ins w:id="294" w:author="Craig Parker [2]" w:date="2025-09-11T15:11:00Z" w16du:dateUtc="2025-09-11T13:11:00Z"/>
           <w:rFonts w:ascii="Arial" w:eastAsia="Times New Roman" w:hAnsi="Arial" w:cs="Arial"/>
           <w:color w:val="000000"/>
           <w:sz w:val="27"/>
           <w:szCs w:val="27"/>
         </w:rPr>
       </w:pPr>
-      <w:ins w:id="364" w:author="Craig Parker" w:date="2025-08-22T12:50:00Z" w16du:dateUtc="2025-08-22T10:50:00Z">
+      <w:ins w:id="295" w:author="Craig Parker [2]" w:date="2025-09-11T15:11:00Z" w16du:dateUtc="2025-09-11T13:11:00Z">
         <w:r>
           <w:rPr>
             <w:rFonts w:ascii="Arial" w:eastAsia="Times New Roman" w:hAnsi="Arial" w:cs="Arial"/>
@@ -15777,14 +15193,14 @@
       <w:pPr>
         <w:spacing w:before="100" w:beforeAutospacing="1" w:after="100" w:afterAutospacing="1"/>
         <w:rPr>
-          <w:ins w:id="365" w:author="Craig Parker" w:date="2025-08-22T12:50:00Z" w16du:dateUtc="2025-08-22T10:50:00Z"/>
+          <w:ins w:id="296" w:author="Craig Parker [2]" w:date="2025-09-11T15:11:00Z" w16du:dateUtc="2025-09-11T13:11:00Z"/>
           <w:rFonts w:ascii="Arial" w:eastAsia="Times New Roman" w:hAnsi="Arial" w:cs="Arial"/>
           <w:color w:val="000000"/>
           <w:sz w:val="27"/>
           <w:szCs w:val="27"/>
         </w:rPr>
       </w:pPr>
-      <w:ins w:id="366" w:author="Craig Parker" w:date="2025-08-22T12:50:00Z" w16du:dateUtc="2025-08-22T10:50:00Z">
+      <w:ins w:id="297" w:author="Craig Parker [2]" w:date="2025-09-11T15:11:00Z" w16du:dateUtc="2025-09-11T13:11:00Z">
         <w:r>
           <w:rPr>
             <w:rFonts w:ascii="Arial" w:eastAsia="Times New Roman" w:hAnsi="Arial" w:cs="Arial"/>
@@ -15802,14 +15218,14 @@
       <w:pPr>
         <w:spacing w:before="100" w:beforeAutospacing="1" w:after="100" w:afterAutospacing="1"/>
         <w:rPr>
-          <w:ins w:id="367" w:author="Craig Parker" w:date="2025-08-22T12:50:00Z" w16du:dateUtc="2025-08-22T10:50:00Z"/>
+          <w:ins w:id="298" w:author="Craig Parker [2]" w:date="2025-09-11T15:11:00Z" w16du:dateUtc="2025-09-11T13:11:00Z"/>
           <w:rFonts w:ascii="Arial" w:eastAsia="Times New Roman" w:hAnsi="Arial" w:cs="Arial"/>
           <w:color w:val="000000"/>
           <w:sz w:val="27"/>
           <w:szCs w:val="27"/>
         </w:rPr>
       </w:pPr>
-      <w:ins w:id="368" w:author="Craig Parker" w:date="2025-08-22T12:50:00Z" w16du:dateUtc="2025-08-22T10:50:00Z">
+      <w:ins w:id="299" w:author="Craig Parker [2]" w:date="2025-09-11T15:11:00Z" w16du:dateUtc="2025-09-11T13:11:00Z">
         <w:r>
           <w:rPr>
             <w:rFonts w:ascii="Arial" w:eastAsia="Times New Roman" w:hAnsi="Arial" w:cs="Arial"/>
@@ -15827,14 +15243,14 @@
       <w:pPr>
         <w:spacing w:before="100" w:beforeAutospacing="1" w:after="100" w:afterAutospacing="1"/>
         <w:rPr>
-          <w:ins w:id="369" w:author="Craig Parker" w:date="2025-08-22T12:50:00Z" w16du:dateUtc="2025-08-22T10:50:00Z"/>
+          <w:ins w:id="300" w:author="Craig Parker [2]" w:date="2025-09-11T15:11:00Z" w16du:dateUtc="2025-09-11T13:11:00Z"/>
           <w:rFonts w:ascii="Arial" w:eastAsia="Times New Roman" w:hAnsi="Arial" w:cs="Arial"/>
           <w:color w:val="000000"/>
           <w:sz w:val="27"/>
           <w:szCs w:val="27"/>
         </w:rPr>
       </w:pPr>
-      <w:ins w:id="370" w:author="Craig Parker" w:date="2025-08-22T12:50:00Z" w16du:dateUtc="2025-08-22T10:50:00Z">
+      <w:ins w:id="301" w:author="Craig Parker [2]" w:date="2025-09-11T15:11:00Z" w16du:dateUtc="2025-09-11T13:11:00Z">
         <w:r>
           <w:rPr>
             <w:rFonts w:ascii="Arial" w:eastAsia="Times New Roman" w:hAnsi="Arial" w:cs="Arial"/>
@@ -15876,14 +15292,14 @@
       <w:pPr>
         <w:spacing w:before="100" w:beforeAutospacing="1" w:after="100" w:afterAutospacing="1"/>
         <w:rPr>
-          <w:ins w:id="371" w:author="Craig Parker" w:date="2025-08-22T12:50:00Z" w16du:dateUtc="2025-08-22T10:50:00Z"/>
+          <w:ins w:id="302" w:author="Craig Parker [2]" w:date="2025-09-11T15:11:00Z" w16du:dateUtc="2025-09-11T13:11:00Z"/>
           <w:rFonts w:ascii="Arial" w:eastAsia="Times New Roman" w:hAnsi="Arial" w:cs="Arial"/>
           <w:color w:val="000000"/>
           <w:sz w:val="27"/>
           <w:szCs w:val="27"/>
         </w:rPr>
       </w:pPr>
-      <w:ins w:id="372" w:author="Craig Parker" w:date="2025-08-22T12:50:00Z" w16du:dateUtc="2025-08-22T10:50:00Z">
+      <w:ins w:id="303" w:author="Craig Parker [2]" w:date="2025-09-11T15:11:00Z" w16du:dateUtc="2025-09-11T13:11:00Z">
         <w:r>
           <w:rPr>
             <w:rFonts w:ascii="Arial" w:eastAsia="Times New Roman" w:hAnsi="Arial" w:cs="Arial"/>
@@ -15905,14 +15321,14 @@
         </w:numPr>
         <w:spacing w:before="100" w:beforeAutospacing="1" w:after="100" w:afterAutospacing="1"/>
         <w:rPr>
-          <w:ins w:id="373" w:author="Craig Parker" w:date="2025-08-22T12:50:00Z" w16du:dateUtc="2025-08-22T10:50:00Z"/>
+          <w:ins w:id="304" w:author="Craig Parker [2]" w:date="2025-09-11T15:11:00Z" w16du:dateUtc="2025-09-11T13:11:00Z"/>
           <w:rFonts w:ascii="Arial" w:eastAsia="Times New Roman" w:hAnsi="Arial" w:cs="Arial"/>
           <w:color w:val="000000"/>
           <w:sz w:val="27"/>
           <w:szCs w:val="27"/>
         </w:rPr>
       </w:pPr>
-      <w:ins w:id="374" w:author="Craig Parker" w:date="2025-08-22T12:50:00Z" w16du:dateUtc="2025-08-22T10:50:00Z">
+      <w:ins w:id="305" w:author="Craig Parker [2]" w:date="2025-09-11T15:11:00Z" w16du:dateUtc="2025-09-11T13:11:00Z">
         <w:r>
           <w:rPr>
             <w:rFonts w:ascii="Arial" w:eastAsia="Times New Roman" w:hAnsi="Arial" w:cs="Arial"/>
@@ -15934,14 +15350,14 @@
         </w:numPr>
         <w:spacing w:before="100" w:beforeAutospacing="1" w:after="100" w:afterAutospacing="1"/>
         <w:rPr>
-          <w:ins w:id="375" w:author="Craig Parker" w:date="2025-08-22T12:50:00Z" w16du:dateUtc="2025-08-22T10:50:00Z"/>
+          <w:ins w:id="306" w:author="Craig Parker [2]" w:date="2025-09-11T15:11:00Z" w16du:dateUtc="2025-09-11T13:11:00Z"/>
           <w:rFonts w:ascii="Arial" w:eastAsia="Times New Roman" w:hAnsi="Arial" w:cs="Arial"/>
           <w:color w:val="000000"/>
           <w:sz w:val="27"/>
           <w:szCs w:val="27"/>
         </w:rPr>
       </w:pPr>
-      <w:ins w:id="376" w:author="Craig Parker" w:date="2025-08-22T12:50:00Z" w16du:dateUtc="2025-08-22T10:50:00Z">
+      <w:ins w:id="307" w:author="Craig Parker [2]" w:date="2025-09-11T15:11:00Z" w16du:dateUtc="2025-09-11T13:11:00Z">
         <w:r>
           <w:rPr>
             <w:rFonts w:ascii="Arial" w:eastAsia="Times New Roman" w:hAnsi="Arial" w:cs="Arial"/>
@@ -15963,14 +15379,14 @@
         </w:numPr>
         <w:spacing w:before="100" w:beforeAutospacing="1" w:after="100" w:afterAutospacing="1"/>
         <w:rPr>
-          <w:ins w:id="377" w:author="Craig Parker" w:date="2025-08-22T12:50:00Z" w16du:dateUtc="2025-08-22T10:50:00Z"/>
+          <w:ins w:id="308" w:author="Craig Parker [2]" w:date="2025-09-11T15:11:00Z" w16du:dateUtc="2025-09-11T13:11:00Z"/>
           <w:rFonts w:ascii="Arial" w:eastAsia="Times New Roman" w:hAnsi="Arial" w:cs="Arial"/>
           <w:color w:val="000000"/>
           <w:sz w:val="27"/>
           <w:szCs w:val="27"/>
         </w:rPr>
       </w:pPr>
-      <w:ins w:id="378" w:author="Craig Parker" w:date="2025-08-22T12:50:00Z" w16du:dateUtc="2025-08-22T10:50:00Z">
+      <w:ins w:id="309" w:author="Craig Parker [2]" w:date="2025-09-11T15:11:00Z" w16du:dateUtc="2025-09-11T13:11:00Z">
         <w:r>
           <w:rPr>
             <w:rFonts w:ascii="Arial" w:eastAsia="Times New Roman" w:hAnsi="Arial" w:cs="Arial"/>
@@ -15992,14 +15408,14 @@
         </w:numPr>
         <w:spacing w:before="100" w:beforeAutospacing="1" w:after="100" w:afterAutospacing="1"/>
         <w:rPr>
-          <w:ins w:id="379" w:author="Craig Parker" w:date="2025-08-22T12:50:00Z" w16du:dateUtc="2025-08-22T10:50:00Z"/>
+          <w:ins w:id="310" w:author="Craig Parker [2]" w:date="2025-09-11T15:11:00Z" w16du:dateUtc="2025-09-11T13:11:00Z"/>
           <w:rFonts w:ascii="Arial" w:eastAsia="Times New Roman" w:hAnsi="Arial" w:cs="Arial"/>
           <w:color w:val="000000"/>
           <w:sz w:val="27"/>
           <w:szCs w:val="27"/>
         </w:rPr>
       </w:pPr>
-      <w:ins w:id="380" w:author="Craig Parker" w:date="2025-08-22T12:50:00Z" w16du:dateUtc="2025-08-22T10:50:00Z">
+      <w:ins w:id="311" w:author="Craig Parker [2]" w:date="2025-09-11T15:11:00Z" w16du:dateUtc="2025-09-11T13:11:00Z">
         <w:r>
           <w:rPr>
             <w:rFonts w:ascii="Arial" w:eastAsia="Times New Roman" w:hAnsi="Arial" w:cs="Arial"/>
@@ -16017,14 +15433,14 @@
       <w:pPr>
         <w:spacing w:before="100" w:beforeAutospacing="1" w:after="100" w:afterAutospacing="1"/>
         <w:rPr>
-          <w:ins w:id="381" w:author="Craig Parker" w:date="2025-08-22T12:50:00Z" w16du:dateUtc="2025-08-22T10:50:00Z"/>
+          <w:ins w:id="312" w:author="Craig Parker [2]" w:date="2025-09-11T15:11:00Z" w16du:dateUtc="2025-09-11T13:11:00Z"/>
           <w:rFonts w:ascii="Arial" w:eastAsia="Times New Roman" w:hAnsi="Arial" w:cs="Arial"/>
           <w:color w:val="000000"/>
           <w:sz w:val="27"/>
           <w:szCs w:val="27"/>
         </w:rPr>
       </w:pPr>
-      <w:ins w:id="382" w:author="Craig Parker" w:date="2025-08-22T12:50:00Z" w16du:dateUtc="2025-08-22T10:50:00Z">
+      <w:ins w:id="313" w:author="Craig Parker [2]" w:date="2025-09-11T15:11:00Z" w16du:dateUtc="2025-09-11T13:11:00Z">
         <w:r>
           <w:rPr>
             <w:rFonts w:ascii="Arial" w:eastAsia="Times New Roman" w:hAnsi="Arial" w:cs="Arial"/>
@@ -16043,14 +15459,14 @@
       <w:pPr>
         <w:spacing w:before="100" w:beforeAutospacing="1" w:after="100" w:afterAutospacing="1"/>
         <w:rPr>
-          <w:ins w:id="383" w:author="Craig Parker" w:date="2025-08-22T12:50:00Z" w16du:dateUtc="2025-08-22T10:50:00Z"/>
+          <w:ins w:id="314" w:author="Craig Parker [2]" w:date="2025-09-11T15:11:00Z" w16du:dateUtc="2025-09-11T13:11:00Z"/>
           <w:rFonts w:ascii="Arial" w:eastAsia="Times New Roman" w:hAnsi="Arial" w:cs="Arial"/>
           <w:color w:val="000000"/>
           <w:sz w:val="27"/>
           <w:szCs w:val="27"/>
         </w:rPr>
       </w:pPr>
-      <w:ins w:id="384" w:author="Craig Parker" w:date="2025-08-22T12:50:00Z" w16du:dateUtc="2025-08-22T10:50:00Z">
+      <w:ins w:id="315" w:author="Craig Parker [2]" w:date="2025-09-11T15:11:00Z" w16du:dateUtc="2025-09-11T13:11:00Z">
         <w:r>
           <w:rPr>
             <w:rFonts w:ascii="Arial" w:eastAsia="Times New Roman" w:hAnsi="Arial" w:cs="Arial"/>
@@ -16068,14 +15484,14 @@
       <w:pPr>
         <w:spacing w:before="100" w:beforeAutospacing="1" w:after="100" w:afterAutospacing="1"/>
         <w:rPr>
-          <w:ins w:id="385" w:author="Craig Parker" w:date="2025-08-22T12:50:00Z" w16du:dateUtc="2025-08-22T10:50:00Z"/>
+          <w:ins w:id="316" w:author="Craig Parker [2]" w:date="2025-09-11T15:11:00Z" w16du:dateUtc="2025-09-11T13:11:00Z"/>
           <w:rFonts w:ascii="Arial" w:eastAsia="Times New Roman" w:hAnsi="Arial" w:cs="Arial"/>
           <w:color w:val="000000"/>
           <w:sz w:val="27"/>
           <w:szCs w:val="27"/>
         </w:rPr>
       </w:pPr>
-      <w:ins w:id="386" w:author="Craig Parker" w:date="2025-08-22T12:50:00Z" w16du:dateUtc="2025-08-22T10:50:00Z">
+      <w:ins w:id="317" w:author="Craig Parker [2]" w:date="2025-09-11T15:11:00Z" w16du:dateUtc="2025-09-11T13:11:00Z">
         <w:r>
           <w:rPr>
             <w:rFonts w:ascii="Arial" w:eastAsia="Times New Roman" w:hAnsi="Arial" w:cs="Arial"/>
@@ -16093,24 +15509,24 @@
       <w:pPr>
         <w:spacing w:before="100" w:beforeAutospacing="1" w:after="100" w:afterAutospacing="1"/>
         <w:rPr>
-          <w:ins w:id="387" w:author="Craig Parker" w:date="2025-08-22T12:49:00Z" w16du:dateUtc="2025-08-22T10:49:00Z"/>
+          <w:ins w:id="318" w:author="Craig Parker [2]" w:date="2025-09-11T15:11:00Z" w16du:dateUtc="2025-09-11T13:11:00Z"/>
           <w:rFonts w:ascii="Arial" w:eastAsia="Times New Roman" w:hAnsi="Arial" w:cs="Arial"/>
           <w:color w:val="000000"/>
           <w:sz w:val="27"/>
           <w:szCs w:val="27"/>
-          <w:rPrChange w:id="388" w:author="Craig Parker" w:date="2025-08-22T12:51:00Z" w16du:dateUtc="2025-08-22T10:51:00Z">
+          <w:rPrChange w:id="319" w:author="Craig Parker" w:date="2025-08-22T12:51:00Z" w16du:dateUtc="2025-08-22T10:51:00Z">
             <w:rPr>
-              <w:ins w:id="389" w:author="Craig Parker" w:date="2025-08-22T12:49:00Z" w16du:dateUtc="2025-08-22T10:49:00Z"/>
+              <w:ins w:id="320" w:author="Craig Parker [2]" w:date="2025-09-11T15:11:00Z" w16du:dateUtc="2025-09-11T13:11:00Z"/>
             </w:rPr>
           </w:rPrChange>
         </w:rPr>
-        <w:pPrChange w:id="390" w:author="Craig Parker" w:date="2025-08-22T12:51:00Z" w16du:dateUtc="2025-08-22T10:51:00Z">
+        <w:pPrChange w:id="321" w:author="Craig Parker" w:date="2025-08-22T12:51:00Z" w16du:dateUtc="2025-08-22T10:51:00Z">
           <w:pPr>
             <w:pStyle w:val="Heading3"/>
           </w:pPr>
         </w:pPrChange>
       </w:pPr>
-      <w:ins w:id="391" w:author="Craig Parker" w:date="2025-08-22T12:50:00Z" w16du:dateUtc="2025-08-22T10:50:00Z">
+      <w:ins w:id="322" w:author="Craig Parker [2]" w:date="2025-09-11T15:11:00Z" w16du:dateUtc="2025-09-11T13:11:00Z">
         <w:r>
           <w:rPr>
             <w:rFonts w:ascii="Arial" w:eastAsia="Times New Roman" w:hAnsi="Arial" w:cs="Arial"/>
@@ -16139,7 +15555,7 @@
     <w:p>
       <w:pPr>
         <w:pStyle w:val="BodyText"/>
-        <w:pPrChange w:id="392" w:author="Craig Parker" w:date="2025-08-22T12:49:00Z" w16du:dateUtc="2025-08-22T10:49:00Z">
+        <w:pPrChange w:id="323" w:author="Craig Parker" w:date="2025-08-22T12:49:00Z" w16du:dateUtc="2025-08-22T10:49:00Z">
           <w:pPr>
             <w:pStyle w:val="Heading3"/>
           </w:pPr>
@@ -16150,16 +15566,16 @@
       <w:pPr>
         <w:pStyle w:val="Heading3"/>
       </w:pPr>
-      <w:bookmarkStart w:id="393" w:name="_Toc206760712"/>
+      <w:bookmarkStart w:id="324" w:name="_Toc206760712"/>
       <w:r>
         <w:t xml:space="preserve">Annex </w:t>
       </w:r>
-      <w:ins w:id="394" w:author="Craig Parker" w:date="2025-08-22T12:51:00Z" w16du:dateUtc="2025-08-22T10:51:00Z">
+      <w:ins w:id="325" w:author="Craig Parker" w:date="2025-08-22T12:51:00Z" w16du:dateUtc="2025-08-22T10:51:00Z">
         <w:r>
           <w:t>2</w:t>
         </w:r>
       </w:ins>
-      <w:del w:id="395" w:author="Craig Parker" w:date="2025-08-22T12:51:00Z" w16du:dateUtc="2025-08-22T10:51:00Z">
+      <w:del w:id="326" w:author="Craig Parker" w:date="2025-08-22T12:51:00Z" w16du:dateUtc="2025-08-22T10:51:00Z">
         <w:r>
           <w:delText>1</w:delText>
         </w:r>
@@ -16167,7 +15583,7 @@
       <w:r>
         <w:t>: Key data sources</w:t>
       </w:r>
-      <w:bookmarkEnd w:id="393"/>
+      <w:bookmarkEnd w:id="324"/>
     </w:p>
     <w:tbl>
       <w:tblPr>
@@ -17380,8 +16796,8 @@
           <w:docGrid w:linePitch="326"/>
         </w:sectPr>
       </w:pPr>
-      <w:bookmarkStart w:id="396" w:name="Xa849b79b1dd2b5d94d7497064e6cba4d629a369"/>
-      <w:bookmarkEnd w:id="308"/>
+      <w:bookmarkStart w:id="327" w:name="Xa849b79b1dd2b5d94d7497064e6cba4d629a369"/>
+      <w:bookmarkEnd w:id="242"/>
     </w:p>
     <w:p>
       <w:pPr>
@@ -17391,23 +16807,23 @@
           <w:bCs/>
         </w:rPr>
       </w:pPr>
-      <w:bookmarkStart w:id="397" w:name="_Toc206760713"/>
+      <w:bookmarkStart w:id="328" w:name="_Toc206760713"/>
       <w:r>
         <w:lastRenderedPageBreak/>
         <w:t xml:space="preserve">Annex </w:t>
       </w:r>
-      <w:ins w:id="398" w:author="Craig Parker" w:date="2025-08-22T12:52:00Z" w16du:dateUtc="2025-08-22T10:52:00Z">
+      <w:ins w:id="329" w:author="Craig Parker" w:date="2025-08-22T12:52:00Z" w16du:dateUtc="2025-08-22T10:52:00Z">
         <w:r>
           <w:t>3</w:t>
         </w:r>
       </w:ins>
-      <w:del w:id="399" w:author="Craig Parker" w:date="2025-08-22T12:52:00Z" w16du:dateUtc="2025-08-22T10:52:00Z">
+      <w:del w:id="330" w:author="Craig Parker" w:date="2025-08-22T12:52:00Z" w16du:dateUtc="2025-08-22T10:52:00Z">
         <w:r>
           <w:delText>2</w:delText>
         </w:r>
       </w:del>
-      <w:bookmarkStart w:id="400" w:name="Xd3aeb4927b3c85f518871109bed5817377321d2"/>
-      <w:bookmarkEnd w:id="396"/>
+      <w:bookmarkStart w:id="331" w:name="Xd3aeb4927b3c85f518871109bed5817377321d2"/>
+      <w:bookmarkEnd w:id="327"/>
       <w:r>
         <w:t xml:space="preserve">: </w:t>
       </w:r>
@@ -17417,7 +16833,7 @@
         </w:rPr>
         <w:t>Personal information processing agreement</w:t>
       </w:r>
-      <w:bookmarkEnd w:id="397"/>
+      <w:bookmarkEnd w:id="328"/>
       <w:r>
         <w:rPr>
           <w:b/>
@@ -17588,7 +17004,7 @@
         <w:rPr>
           <w:sz w:val="22"/>
           <w:szCs w:val="22"/>
-          <w:rPrChange w:id="401" w:author="Craig Parker [2]" w:date="2025-09-09T12:00:00Z" w16du:dateUtc="2025-09-09T10:00:00Z">
+          <w:rPrChange w:id="332" w:author="Craig Parker [2]" w:date="2025-09-09T12:00:00Z" w16du:dateUtc="2025-09-09T10:00:00Z">
             <w:rPr/>
           </w:rPrChange>
         </w:rPr>
@@ -17598,7 +17014,7 @@
           <w:sz w:val="22"/>
           <w:szCs w:val="22"/>
           <w:lang w:val="en-ZA"/>
-          <w:rPrChange w:id="402" w:author="Craig Parker [2]" w:date="2025-09-09T12:00:00Z" w16du:dateUtc="2025-09-09T10:00:00Z">
+          <w:rPrChange w:id="333" w:author="Craig Parker [2]" w:date="2025-09-09T12:00:00Z" w16du:dateUtc="2025-09-09T10:00:00Z">
             <w:rPr>
               <w:lang w:val="en-ZA"/>
             </w:rPr>
@@ -17610,7 +17026,7 @@
         <w:rPr>
           <w:sz w:val="22"/>
           <w:szCs w:val="22"/>
-          <w:rPrChange w:id="403" w:author="Craig Parker [2]" w:date="2025-09-09T12:00:00Z" w16du:dateUtc="2025-09-09T10:00:00Z">
+          <w:rPrChange w:id="334" w:author="Craig Parker [2]" w:date="2025-09-09T12:00:00Z" w16du:dateUtc="2025-09-09T10:00:00Z">
             <w:rPr/>
           </w:rPrChange>
         </w:rPr>
@@ -17622,7 +17038,7 @@
           <w:color w:val="0F4761" w:themeColor="accent1" w:themeShade="BF"/>
           <w:sz w:val="22"/>
           <w:szCs w:val="22"/>
-          <w:rPrChange w:id="404" w:author="Craig Parker [2]" w:date="2025-09-09T12:00:00Z" w16du:dateUtc="2025-09-09T10:00:00Z">
+          <w:rPrChange w:id="335" w:author="Craig Parker [2]" w:date="2025-09-09T12:00:00Z" w16du:dateUtc="2025-09-09T10:00:00Z">
             <w:rPr>
               <w:rFonts w:eastAsiaTheme="majorEastAsia" w:cstheme="majorBidi"/>
               <w:color w:val="0F4761" w:themeColor="accent1" w:themeShade="BF"/>
@@ -17652,17 +17068,17 @@
       <w:pPr>
         <w:pStyle w:val="Heading3"/>
       </w:pPr>
-      <w:bookmarkStart w:id="405" w:name="_Toc206760714"/>
+      <w:bookmarkStart w:id="336" w:name="_Toc206760714"/>
       <w:r>
         <w:lastRenderedPageBreak/>
         <w:t xml:space="preserve">Annex </w:t>
       </w:r>
-      <w:ins w:id="406" w:author="Craig Parker" w:date="2025-08-22T12:52:00Z" w16du:dateUtc="2025-08-22T10:52:00Z">
+      <w:ins w:id="337" w:author="Craig Parker" w:date="2025-08-22T12:52:00Z" w16du:dateUtc="2025-08-22T10:52:00Z">
         <w:r>
           <w:t>4</w:t>
         </w:r>
       </w:ins>
-      <w:del w:id="407" w:author="Craig Parker" w:date="2025-08-22T12:52:00Z" w16du:dateUtc="2025-08-22T10:52:00Z">
+      <w:del w:id="338" w:author="Craig Parker" w:date="2025-08-22T12:52:00Z" w16du:dateUtc="2025-08-22T10:52:00Z">
         <w:r>
           <w:delText>3</w:delText>
         </w:r>
@@ -17670,7 +17086,7 @@
       <w:r>
         <w:t>: Ethics notification letter template</w:t>
       </w:r>
-      <w:bookmarkEnd w:id="405"/>
+      <w:bookmarkEnd w:id="336"/>
     </w:p>
     <w:p>
       <w:pPr>
@@ -17685,8 +17101,8 @@
           <w:szCs w:val="18"/>
         </w:rPr>
       </w:pPr>
-      <w:bookmarkStart w:id="408" w:name="Xf6ffab845a425d734eb08b22a51ddefff17a61a"/>
-      <w:bookmarkEnd w:id="400"/>
+      <w:bookmarkStart w:id="339" w:name="Xf6ffab845a425d734eb08b22a51ddefff17a61a"/>
+      <w:bookmarkEnd w:id="331"/>
       <w:r>
         <w:rPr>
           <w:rFonts w:ascii="Nunito" w:eastAsia="Times New Roman" w:hAnsi="Nunito" w:cs="Segoe UI"/>
@@ -19561,6 +18977,7 @@
           <w:sz w:val="20"/>
           <w:szCs w:val="20"/>
         </w:rPr>
+        <w:lastRenderedPageBreak/>
         <w:t> </w:t>
       </w:r>
     </w:p>
@@ -19602,17 +19019,17 @@
       <w:pPr>
         <w:pStyle w:val="Heading3"/>
       </w:pPr>
-      <w:bookmarkStart w:id="409" w:name="_Toc206760715"/>
+      <w:bookmarkStart w:id="340" w:name="_Toc206760715"/>
       <w:r>
         <w:lastRenderedPageBreak/>
         <w:t xml:space="preserve">Annex </w:t>
       </w:r>
-      <w:ins w:id="410" w:author="Craig Parker" w:date="2025-08-22T12:52:00Z" w16du:dateUtc="2025-08-22T10:52:00Z">
+      <w:ins w:id="341" w:author="Craig Parker" w:date="2025-08-22T12:52:00Z" w16du:dateUtc="2025-08-22T10:52:00Z">
         <w:r>
           <w:t>5</w:t>
         </w:r>
       </w:ins>
-      <w:del w:id="411" w:author="Craig Parker" w:date="2025-08-22T12:52:00Z" w16du:dateUtc="2025-08-22T10:52:00Z">
+      <w:del w:id="342" w:author="Craig Parker" w:date="2025-08-22T12:52:00Z" w16du:dateUtc="2025-08-22T10:52:00Z">
         <w:r>
           <w:delText>4</w:delText>
         </w:r>
@@ -19620,7 +19037,7 @@
       <w:r>
         <w:t>: Data Access Committee Terms of Reference</w:t>
       </w:r>
-      <w:bookmarkEnd w:id="409"/>
+      <w:bookmarkEnd w:id="340"/>
     </w:p>
     <w:p>
       <w:pPr>
@@ -19635,8 +19052,8 @@
           <w:bCs/>
         </w:rPr>
       </w:pPr>
-      <w:bookmarkStart w:id="412" w:name="annex-5-data-request-form"/>
-      <w:bookmarkEnd w:id="408"/>
+      <w:bookmarkStart w:id="343" w:name="annex-5-data-request-form"/>
+      <w:bookmarkEnd w:id="339"/>
       <w:r>
         <w:rPr>
           <w:rStyle w:val="normaltextrun"/>
@@ -19732,39 +19149,6 @@
         </w:rPr>
         <w:t xml:space="preserve"> DAC oversees and governs access to health-related data in Research Project 1 (RP1) and Research Project 2 (RP2) that has been de-identified</w:t>
       </w:r>
-      <w:ins w:id="413" w:author="Lisa van Aardenne" w:date="2025-08-25T14:00:00Z">
-        <w:r>
-          <w:rPr>
-            <w:rStyle w:val="normaltextrun"/>
-            <w:rFonts w:ascii="Nunito" w:hAnsi="Nunito"/>
-            <w:color w:val="000000" w:themeColor="text1"/>
-            <w:lang w:val="en-ZA"/>
-          </w:rPr>
-          <w:t xml:space="preserve"> and where the data provider has given </w:t>
-        </w:r>
-      </w:ins>
-      <w:ins w:id="414" w:author="Lisa van Aardenne" w:date="2025-08-25T14:01:00Z">
-        <w:r>
-          <w:rPr>
-            <w:rStyle w:val="normaltextrun"/>
-            <w:rFonts w:ascii="Nunito" w:hAnsi="Nunito"/>
-            <w:color w:val="000000" w:themeColor="text1"/>
-            <w:lang w:val="en-ZA"/>
-          </w:rPr>
-          <w:t xml:space="preserve">legal </w:t>
-        </w:r>
-      </w:ins>
-      <w:ins w:id="415" w:author="Lisa van Aardenne" w:date="2025-08-25T14:00:00Z">
-        <w:r>
-          <w:rPr>
-            <w:rStyle w:val="normaltextrun"/>
-            <w:rFonts w:ascii="Nunito" w:hAnsi="Nunito"/>
-            <w:color w:val="000000" w:themeColor="text1"/>
-            <w:lang w:val="en-ZA"/>
-          </w:rPr>
-          <w:t>permission</w:t>
-        </w:r>
-      </w:ins>
       <w:r>
         <w:rPr>
           <w:rStyle w:val="normaltextrun"/>
@@ -19772,7 +19156,16 @@
           <w:color w:val="000000" w:themeColor="text1"/>
           <w:lang w:val="en-ZA"/>
         </w:rPr>
-        <w:t>. The DAC ensures that all data requests are reviewed and approved based on scientific merit, ethical considerations, feasibility, and compliance with legal and institutional requirements. The goal is to facilitate high-quality research, while maintaining the integrity, confidentiality, and security of the data, and ensuring compliance with relevant ethical and legal standards.</w:t>
+        <w:t xml:space="preserve"> and where the data provider has given legal permission. </w:t>
+      </w:r>
+      <w:r>
+        <w:rPr>
+          <w:rStyle w:val="normaltextrun"/>
+          <w:rFonts w:ascii="Nunito" w:hAnsi="Nunito"/>
+          <w:color w:val="000000" w:themeColor="text1"/>
+          <w:lang w:val="en-ZA"/>
+        </w:rPr>
+        <w:t>The DAC ensures that all data requests are reviewed and approved based on scientific merit, ethical considerations, feasibility, and compliance with legal and institutional requirements. The goal is to facilitate high-quality research, while maintaining the integrity, confidentiality, and security of the data, and ensuring compliance with relevant ethical and legal standards.</w:t>
       </w:r>
       <w:r>
         <w:rPr>
@@ -20203,17 +19596,17 @@
       <w:pPr>
         <w:pStyle w:val="Heading3"/>
       </w:pPr>
-      <w:bookmarkStart w:id="416" w:name="_Toc206760716"/>
+      <w:bookmarkStart w:id="344" w:name="_Toc206760716"/>
       <w:r>
         <w:lastRenderedPageBreak/>
         <w:t xml:space="preserve">Annex </w:t>
       </w:r>
-      <w:ins w:id="417" w:author="Craig Parker" w:date="2025-08-22T12:52:00Z" w16du:dateUtc="2025-08-22T10:52:00Z">
+      <w:ins w:id="345" w:author="Craig Parker" w:date="2025-08-22T12:52:00Z" w16du:dateUtc="2025-08-22T10:52:00Z">
         <w:r>
           <w:t>6</w:t>
         </w:r>
       </w:ins>
-      <w:del w:id="418" w:author="Craig Parker" w:date="2025-08-22T12:52:00Z" w16du:dateUtc="2025-08-22T10:52:00Z">
+      <w:del w:id="346" w:author="Craig Parker" w:date="2025-08-22T12:52:00Z" w16du:dateUtc="2025-08-22T10:52:00Z">
         <w:r>
           <w:delText>5</w:delText>
         </w:r>
@@ -20221,11 +19614,11 @@
       <w:r>
         <w:t>: Data Request Form</w:t>
       </w:r>
-      <w:bookmarkEnd w:id="416"/>
+      <w:bookmarkEnd w:id="344"/>
     </w:p>
     <w:bookmarkEnd w:id="0"/>
-    <w:bookmarkEnd w:id="304"/>
-    <w:bookmarkEnd w:id="412"/>
+    <w:bookmarkEnd w:id="239"/>
+    <w:bookmarkEnd w:id="343"/>
     <w:p>
       <w:pPr>
         <w:pStyle w:val="paragraph"/>
@@ -20278,7 +19671,7 @@
         </w:rPr>
         <w:t xml:space="preserve">Proposals for new studies that utilize data collected in the HE²AT Center may be submitted by </w:t>
       </w:r>
-      <w:ins w:id="419" w:author="Lisa van Aardenne" w:date="2025-08-25T14:02:00Z">
+      <w:ins w:id="347" w:author="Lisa van Aardenne" w:date="2025-08-25T14:02:00Z">
         <w:r>
           <w:rPr>
             <w:rStyle w:val="normaltextrun"/>
@@ -24149,7 +23542,7 @@
 
 <file path=word/comments.xml><?xml version="1.0" encoding="utf-8"?>
 <w:comments xmlns:wpc="http://schemas.microsoft.com/office/word/2010/wordprocessingCanvas" xmlns:cx="http://schemas.microsoft.com/office/drawing/2014/chartex" xmlns:cx1="http://schemas.microsoft.com/office/drawing/2015/9/8/chartex" xmlns:cx2="http://schemas.microsoft.com/office/drawing/2015/10/21/chartex" xmlns:cx3="http://schemas.microsoft.com/office/drawing/2016/5/9/chartex" xmlns:cx4="http://schemas.microsoft.com/office/drawing/2016/5/10/chartex" xmlns:cx5="http://schemas.microsoft.com/office/drawing/2016/5/11/chartex" xmlns:cx6="http://schemas.microsoft.com/office/drawing/2016/5/12/chartex" xmlns:cx7="http://schemas.microsoft.com/office/drawing/2016/5/13/chartex" xmlns:cx8="http://schemas.microsoft.com/office/drawing/2016/5/14/chartex" xmlns:mc="http://schemas.openxmlformats.org/markup-compatibility/2006" xmlns:aink="http://schemas.microsoft.com/office/drawing/2016/ink" xmlns:am3d="http://schemas.microsoft.com/office/drawing/2017/model3d" xmlns:o="urn:schemas-microsoft-com:office:office" xmlns:oel="http://schemas.microsoft.com/office/2019/extlst" xmlns:r="http://schemas.openxmlformats.org/officeDocument/2006/relationships" xmlns:m="http://schemas.openxmlformats.org/officeDocument/2006/math" xmlns:v="urn:schemas-microsoft-com:vml" xmlns:wp14="http://schemas.microsoft.com/office/word/2010/wordprocessingDrawing" xmlns:wp="http://schemas.openxmlformats.org/drawingml/2006/wordprocessingDrawing" xmlns:w10="urn:schemas-microsoft-com:office:word" xmlns:w="http://schemas.openxmlformats.org/wordprocessingml/2006/main" xmlns:w14="http://schemas.microsoft.com/office/word/2010/wordml" xmlns:w15="http://schemas.microsoft.com/office/word/2012/wordml" xmlns:w16cex="http://schemas.microsoft.com/office/word/2018/wordml/cex" xmlns:w16cid="http://schemas.microsoft.com/office/word/2016/wordml/cid" xmlns:w16="http://schemas.microsoft.com/office/word/2018/wordml" xmlns:w16du="http://schemas.microsoft.com/office/word/2023/wordml/word16du" xmlns:w16sdtdh="http://schemas.microsoft.com/office/word/2020/wordml/sdtdatahash" xmlns:w16sdtfl="http://schemas.microsoft.com/office/word/2024/wordml/sdtformatlock" xmlns:w16se="http://schemas.microsoft.com/office/word/2015/wordml/symex" xmlns:wpg="http://schemas.microsoft.com/office/word/2010/wordprocessingGroup" xmlns:wpi="http://schemas.microsoft.com/office/word/2010/wordprocessingInk" xmlns:wne="http://schemas.microsoft.com/office/word/2006/wordml" xmlns:wps="http://schemas.microsoft.com/office/word/2010/wordprocessingShape" mc:Ignorable="w14 w15 w16se w16cid w16 w16cex w16sdtdh w16sdtfl w16du wp14">
-  <w:comment w:id="47" w:author="Lisa van Aardenne" w:date="2025-08-25T16:23:00Z" w:initials="LA">
+  <w:comment w:id="45" w:author="Lisa van Aardenne" w:date="2025-08-25T16:23:00Z" w:initials="LA">
     <w:p>
       <w:pPr>
         <w:pStyle w:val="CommentText"/>
@@ -24219,7 +23612,7 @@
       </w:pPr>
     </w:p>
   </w:comment>
-  <w:comment w:id="55" w:author="Lisa van Aardenne" w:date="2025-08-25T16:31:00Z" w:initials="LA">
+  <w:comment w:id="53" w:author="Lisa van Aardenne" w:date="2025-08-25T16:31:00Z" w:initials="LA">
     <w:p>
       <w:pPr>
         <w:pStyle w:val="CommentText"/>
@@ -24235,7 +23628,7 @@
       </w:r>
     </w:p>
   </w:comment>
-  <w:comment w:id="57" w:author="Lisa van Aardenne" w:date="2025-08-25T20:06:00Z" w:initials="LA">
+  <w:comment w:id="55" w:author="Lisa van Aardenne" w:date="2025-08-25T20:06:00Z" w:initials="LA">
     <w:p>
       <w:pPr>
         <w:pStyle w:val="CommentText"/>
@@ -24251,7 +23644,7 @@
       </w:r>
     </w:p>
   </w:comment>
-  <w:comment w:id="72" w:author="Lisa van Aardenne" w:date="2025-08-25T20:06:00Z" w:initials="LA">
+  <w:comment w:id="70" w:author="Lisa van Aardenne" w:date="2025-08-25T20:06:00Z" w:initials="LA">
     <w:p>
       <w:pPr>
         <w:pStyle w:val="CommentText"/>
@@ -24267,7 +23660,7 @@
       </w:r>
     </w:p>
   </w:comment>
-  <w:comment w:id="74" w:author="Lisa van Aardenne" w:date="2025-08-25T16:33:00Z" w:initials="LA">
+  <w:comment w:id="224" w:author="Lisa van Aardenne" w:date="2025-08-25T20:15:00Z" w:initials="LA">
     <w:p>
       <w:pPr>
         <w:pStyle w:val="CommentText"/>
@@ -24279,27 +23672,11 @@
         <w:annotationRef/>
       </w:r>
       <w:r>
-        <w:t>transfer or sharing on the cloud?</w:t>
+        <w:t>Should we add WHC since they are not taking on much of the responsibility?</w:t>
       </w:r>
     </w:p>
   </w:comment>
-  <w:comment w:id="288" w:author="Lisa van Aardenne" w:date="2025-08-25T20:15:00Z" w:initials="LA">
-    <w:p>
-      <w:pPr>
-        <w:pStyle w:val="CommentText"/>
-      </w:pPr>
-      <w:r>
-        <w:rPr>
-          <w:rStyle w:val="CommentReference"/>
-        </w:rPr>
-        <w:annotationRef/>
-      </w:r>
-      <w:r>
-        <w:t>Should we add WHC since they are not taking on much of the responsibility?</w:t>
-      </w:r>
-    </w:p>
-  </w:comment>
-  <w:comment w:id="289" w:author="Craig Parker [2]" w:date="2025-09-09T11:42:00Z" w:initials="CP">
+  <w:comment w:id="225" w:author="Craig Parker [2]" w:date="2025-09-09T11:42:00Z" w:initials="CP">
     <w:p>
       <w:r>
         <w:rPr>
@@ -24325,7 +23702,6 @@
   <w15:commentEx w15:paraId="327740A3" w15:done="1"/>
   <w15:commentEx w15:paraId="6E0E663D" w15:done="1"/>
   <w15:commentEx w15:paraId="519BBE55" w15:done="1"/>
-  <w15:commentEx w15:paraId="2FA5B0C3" w15:done="1"/>
   <w15:commentEx w15:paraId="3C17BB70" w15:done="1"/>
   <w15:commentEx w15:paraId="79DBC26F" w15:paraIdParent="3C17BB70" w15:done="1"/>
 </w15:commentsEx>
@@ -24385,7 +23761,6 @@
       </w16:ext>
     </w16cex:extLst>
   </w16cex:commentExtensible>
-  <w16cex:commentExtensible w16cex:durableId="29F37CDF" w16cex:dateUtc="2025-08-25T14:33:00Z"/>
   <w16cex:commentExtensible w16cex:durableId="42957774" w16cex:dateUtc="2025-08-25T18:15:00Z">
     <w16cex:extLst>
       <w16:ext w16:uri="{CE6994B0-6A32-4C9F-8C6B-6E91EDA988CE}">
@@ -24409,7 +23784,6 @@
   <w16cid:commentId w16cid:paraId="327740A3" w16cid:durableId="5DCD7B0F"/>
   <w16cid:commentId w16cid:paraId="6E0E663D" w16cid:durableId="731A8B62"/>
   <w16cid:commentId w16cid:paraId="519BBE55" w16cid:durableId="3D86D916"/>
-  <w16cid:commentId w16cid:paraId="2FA5B0C3" w16cid:durableId="29F37CDF"/>
   <w16cid:commentId w16cid:paraId="3C17BB70" w16cid:durableId="42957774"/>
   <w16cid:commentId w16cid:paraId="79DBC26F" w16cid:durableId="7C7B4DEA"/>
 </w16cid:commentsIds>

</xml_diff>

<commit_message>
docs: streamline HREC submission documents for DMP v2.2
- Create simplified changes summary table with consolidated rationale
- Generate streamlined HTML version removing repetitive content
- Archive previous HTML versions to Version_2.2_HREC_Submission
- Update submission letter and supporting documents
- Maintain single clear rationale across all 14 changes
- Remove unnecessary complexity for ethics committee review

🤖 Generated with [Claude Code](https://claude.ai/code)

Co-Authored-By: Claude <noreply@anthropic.com>
</commit_message>
<xml_diff>
--- a/HE2AT_DMP_v2.2_COMPLETE_with_figures_09092025_TRACKED_CHANGES.docx
+++ b/HE2AT_DMP_v2.2_COMPLETE_with_figures_09092025_TRACKED_CHANGES.docx
@@ -754,8 +754,13 @@
         <w:rPr>
           <w:noProof/>
         </w:rPr>
+      </w:r>
+      <w:r>
+        <w:rPr>
+          <w:noProof/>
+        </w:rPr>
         <w:pict w14:anchorId="3DC4B031">
-          <v:rect id="_x0000_i1031" alt="" style="width:468pt;height:.05pt;mso-width-percent:0;mso-height-percent:0;mso-width-percent:0;mso-height-percent:0" o:hralign="center" o:hrstd="t" o:hr="t"/>
+          <v:rect id="_x0000_i1025" alt="" style="width:468pt;height:.05pt;mso-width-percent:0;mso-height-percent:0;mso-width-percent:0;mso-height-percent:0" o:hralign="center" o:hrstd="t" o:hr="t"/>
         </w:pict>
       </w:r>
     </w:p>
@@ -768,7 +773,14 @@
           <w:i/>
           <w:iCs/>
         </w:rPr>
-        <w:t>Document version 2.2 | August 2024</w:t>
+        <w:t>Document version 2.2 | August 202</w:t>
+      </w:r>
+      <w:r>
+        <w:rPr>
+          <w:i/>
+          <w:iCs/>
+        </w:rPr>
+        <w:t>5</w:t>
       </w:r>
     </w:p>
     <w:p>
@@ -799,7 +811,7 @@
     <w:sdt>
       <w:sdtPr>
         <w:rPr>
-          <w:rFonts w:asciiTheme="minorHAnsi" w:eastAsiaTheme="minorHAnsi" w:hAnsiTheme="minorHAnsi" w:cstheme="minorBidi"/>
+          <w:rFonts w:asciiTheme="minorHAnsi" w:eastAsiaTheme="minorEastAsia" w:hAnsiTheme="minorHAnsi" w:cstheme="minorBidi"/>
           <w:color w:val="auto"/>
           <w:sz w:val="24"/>
           <w:szCs w:val="24"/>
@@ -812,7 +824,6 @@
       </w:sdtPr>
       <w:sdtEndPr>
         <w:rPr>
-          <w:rFonts w:eastAsiaTheme="minorEastAsia"/>
           <w:b/>
           <w:bCs/>
           <w:noProof/>
@@ -5160,8 +5171,13 @@
         <w:rPr>
           <w:noProof/>
         </w:rPr>
+      </w:r>
+      <w:r>
+        <w:rPr>
+          <w:noProof/>
+        </w:rPr>
         <w:pict w14:anchorId="183CBD10">
-          <v:rect id="_x0000_i1030" alt="" style="width:468pt;height:.05pt;mso-width-percent:0;mso-height-percent:0;mso-width-percent:0;mso-height-percent:0" o:hralign="center" o:hrstd="t" o:hr="t"/>
+          <v:rect id="_x0000_i1026" alt="" style="width:468pt;height:.05pt;mso-width-percent:0;mso-height-percent:0;mso-width-percent:0;mso-height-percent:0" o:hralign="center" o:hrstd="t" o:hr="t"/>
         </w:pict>
       </w:r>
     </w:p>
@@ -6260,8 +6276,13 @@
         <w:rPr>
           <w:noProof/>
         </w:rPr>
+      </w:r>
+      <w:r>
+        <w:rPr>
+          <w:noProof/>
+        </w:rPr>
         <w:pict w14:anchorId="2BD5C3A9">
-          <v:rect id="_x0000_i1029" alt="" style="width:468pt;height:.05pt;mso-width-percent:0;mso-height-percent:0;mso-width-percent:0;mso-height-percent:0" o:hralign="center" o:hrstd="t" o:hr="t"/>
+          <v:rect id="_x0000_i1027" alt="" style="width:468pt;height:.05pt;mso-width-percent:0;mso-height-percent:0;mso-width-percent:0;mso-height-percent:0" o:hralign="center" o:hrstd="t" o:hr="t"/>
         </w:pict>
       </w:r>
     </w:p>
@@ -7875,6 +7896,11 @@
       </w:tr>
     </w:tbl>
     <w:p>
+      <w:r>
+        <w:rPr>
+          <w:noProof/>
+        </w:rPr>
+      </w:r>
       <w:r>
         <w:rPr>
           <w:noProof/>
@@ -8799,14 +8825,24 @@
       <w:r>
         <w:t xml:space="preserve">Figure </w:t>
       </w:r>
-      <w:fldSimple w:instr=" SEQ Figure \* ARABIC ">
-        <w:r>
-          <w:rPr>
-            <w:noProof/>
-          </w:rPr>
-          <w:t>1</w:t>
-        </w:r>
-      </w:fldSimple>
+      <w:r>
+        <w:fldChar w:fldCharType="begin"/>
+      </w:r>
+      <w:r>
+        <w:instrText>SEQ Figure \* ARABIC</w:instrText>
+      </w:r>
+      <w:r>
+        <w:fldChar w:fldCharType="separate"/>
+      </w:r>
+      <w:r>
+        <w:rPr>
+          <w:noProof/>
+        </w:rPr>
+        <w:t>1</w:t>
+      </w:r>
+      <w:r>
+        <w:fldChar w:fldCharType="end"/>
+      </w:r>
       <w:r>
         <w:t>: HE²AT Center Data Management Workflow</w:t>
       </w:r>
@@ -9088,10 +9124,18 @@
         <w:t xml:space="preserve"> </w:t>
       </w:r>
       <w:r>
-        <w:t xml:space="preserve">sharing on the cloud with  </w:t>
-      </w:r>
-      <w:r>
-        <w:t>the remainder of the HE²AT Center Consortium (e.g., names and contact numbers</w:t>
+        <w:t xml:space="preserve">sharing on the cloud </w:t>
+      </w:r>
+      <w:proofErr w:type="gramStart"/>
+      <w:r>
+        <w:t xml:space="preserve">with  </w:t>
+      </w:r>
+      <w:r>
+        <w:t>the</w:t>
+      </w:r>
+      <w:proofErr w:type="gramEnd"/>
+      <w:r>
+        <w:t xml:space="preserve"> remainder of the HE²AT Center Consortium (e.g., names and contact numbers</w:t>
       </w:r>
       <w:proofErr w:type="gramStart"/>
       <w:r>
@@ -9512,24 +9556,10 @@
           <w:t>.</w:t>
         </w:r>
       </w:ins>
-      <w:ins w:id="79" w:author="Craig Parker" w:date="2025-08-22T12:32:00Z">
-        <w:r>
-          <w:t xml:space="preserve"> </w:t>
-        </w:r>
-      </w:ins>
-      <w:del w:id="80" w:author="Craig Parker" w:date="2025-08-05T12:02:00Z">
-        <w:r>
-          <w:delText xml:space="preserve"> </w:delText>
-        </w:r>
-        <w:r>
-          <w:rPr>
-            <w:b/>
-            <w:bCs/>
-          </w:rPr>
-          <w:delText>[TRACKED CHANGE] and WHC-managed cloud services with auto-scaling capabilities for handling variable seasonal data volumes and improved accessibility for authorised researchers</w:delText>
-        </w:r>
-      </w:del>
-      <w:ins w:id="81" w:author="Lisa van Aardenne" w:date="2025-08-25T16:37:00Z">
+      <w:r>
+        <w:t xml:space="preserve"> </w:t>
+      </w:r>
+      <w:ins w:id="79" w:author="Lisa van Aardenne" w:date="2025-08-25T16:37:00Z">
         <w:r>
           <w:rPr>
             <w:b/>
@@ -9538,7 +9568,7 @@
           <w:t xml:space="preserve"> </w:t>
         </w:r>
       </w:ins>
-      <w:ins w:id="82" w:author="Craig Parker [2]" w:date="2025-09-09T11:52:00Z" w16du:dateUtc="2025-09-09T09:52:00Z">
+      <w:ins w:id="80" w:author="Craig Parker [2]" w:date="2025-09-09T11:52:00Z">
         <w:r>
           <w:rPr>
             <w:b/>
@@ -9564,27 +9594,21 @@
         </w:r>
       </w:ins>
       <w:r>
-        <w:t xml:space="preserve"> </w:t>
-      </w:r>
-      <w:r>
-        <w:t>CSAG/UCT will be responsible for managing and updating the relevant data indexes during this period</w:t>
-      </w:r>
-      <w:r>
-        <w:t>. These datasets also follow open data policies, typically requiring citation when used for non-commercial research.</w:t>
+        <w:t xml:space="preserve"> CSAG/UCT will be responsible for managing and updating the relevant data indexes during this period. These datasets also follow open data policies, typically requiring citation when used for non-commercial research.</w:t>
       </w:r>
     </w:p>
     <w:p>
       <w:pPr>
         <w:pStyle w:val="Heading3"/>
       </w:pPr>
-      <w:bookmarkStart w:id="83" w:name="_Toc206760666"/>
-      <w:bookmarkStart w:id="84" w:name="arealgeospatial-socio-economic-data"/>
+      <w:bookmarkStart w:id="81" w:name="_Toc206760666"/>
+      <w:bookmarkStart w:id="82" w:name="arealgeospatial-socio-economic-data"/>
       <w:bookmarkEnd w:id="77"/>
       <w:r>
         <w:lastRenderedPageBreak/>
         <w:t>4.3. Areal/geospatial socio-economic data</w:t>
       </w:r>
-      <w:bookmarkEnd w:id="83"/>
+      <w:bookmarkEnd w:id="81"/>
     </w:p>
     <w:p>
       <w:pPr>
@@ -9599,35 +9623,15 @@
         <w:pStyle w:val="BodyText"/>
       </w:pPr>
       <w:r>
-        <w:t>Socio-economic data will be sourced from open and restricted-access repositories (e.g., South African census data and GCRO Quality of Life Surveys). Primary copies will be indexed and stored on CSAG/UCT data storage</w:t>
-      </w:r>
-      <w:del w:id="85" w:author="Craig Parker [2]" w:date="2025-09-11T14:50:00Z" w16du:dateUtc="2025-09-11T12:50:00Z">
+        <w:t xml:space="preserve">Socio-economic data will be sourced from open and restricted-access repositories (e.g., South African census data and GCRO Quality of Life Surveys). Primary copies will be indexed and stored on CSAG/UCT data storage, </w:t>
+      </w:r>
+      <w:ins w:id="83" w:author="Darshnika Lakhoo" w:date="2025-09-25T12:15:00Z">
         <w:r>
-          <w:delText>, while a copy will be stored on the WHC-managed cloud services</w:delText>
-        </w:r>
-      </w:del>
-      <w:ins w:id="86" w:author="Craig Parker [2]" w:date="2025-09-11T14:50:00Z" w16du:dateUtc="2025-09-11T12:50:00Z">
-        <w:r>
-          <w:t xml:space="preserve"> </w:t>
-        </w:r>
-        <w:r>
-          <w:t>, while a copy will be stored on the WHC-managed cloud services</w:t>
+          <w:t>while a copy will be stored on the WHC-managed cloud services.</w:t>
         </w:r>
       </w:ins>
       <w:r>
-        <w:t>. The IBM Research Africa team will acquire and have access to some of the geo-reference Quality of Life survey data from the GCRO</w:t>
-      </w:r>
-      <w:r>
-        <w:t>.</w:t>
-      </w:r>
-      <w:r>
-        <w:t xml:space="preserve"> </w:t>
-      </w:r>
-      <w:r>
-        <w:t>It</w:t>
-      </w:r>
-      <w:r>
-        <w:t xml:space="preserve"> will undertake processing of this data from their own internal computing systems. Outputs and indices calculated from the data by IBM Research Africa will be shared with the rest of the HE²AT Center Consortium through the HE²AT Center’s DAC.</w:t>
+        <w:t xml:space="preserve"> The IBM Research Africa team will acquire and have access to some of the geo-reference Quality of Life survey data from the GCRO. It will undertake processing of this data from their own internal computing systems. Outputs and indices calculated from the data by IBM Research Africa will be shared with the rest of the HE²AT Center Consortium through the HE²AT Center’s DAC.</w:t>
       </w:r>
     </w:p>
     <w:p>
@@ -9667,78 +9671,78 @@
           <w:cols w:space="720"/>
         </w:sectPr>
       </w:pPr>
-      <w:bookmarkStart w:id="87" w:name="Xfc9d5062703af22053e042226c9b85f6cfdea68"/>
+      <w:bookmarkStart w:id="84" w:name="Xfc9d5062703af22053e042226c9b85f6cfdea68"/>
       <w:bookmarkEnd w:id="47"/>
-      <w:bookmarkEnd w:id="84"/>
+      <w:bookmarkEnd w:id="82"/>
     </w:p>
     <w:p>
       <w:pPr>
         <w:pStyle w:val="Heading2"/>
       </w:pPr>
-      <w:bookmarkStart w:id="88" w:name="_Toc206760667"/>
+      <w:bookmarkStart w:id="85" w:name="_Toc206760667"/>
       <w:r>
         <w:lastRenderedPageBreak/>
         <w:t>5. Data transfer, and ethics approvals and notification</w:t>
       </w:r>
+      <w:bookmarkEnd w:id="85"/>
+    </w:p>
+    <w:p>
+      <w:pPr>
+        <w:pStyle w:val="FirstParagraph"/>
+      </w:pPr>
+      <w:r>
+        <w:t>In alignment with the HE²AT Center’s commitment to ethical conduct across all research activities, the ethics approval and notification process, and Data Transfer Agreement (DTA) are essential for securing and maintaining oversight of studies that contribute data to the HE²AT Center Project.</w:t>
+      </w:r>
+    </w:p>
+    <w:p>
+      <w:pPr>
+        <w:pStyle w:val="BodyText"/>
+      </w:pPr>
+      <w:r>
+        <w:t>The RP1 and RP2 study activities have been reviewed and approved by the Wits Human Ethics Committee, with Ethics Reference Numbers of 220605 for RP1 and 220606 for RP2. As data from additional studies are received, the HE²AT Center notifies the relevant Ethics Committee of such and notes any concerns with a study, if relevant.</w:t>
+      </w:r>
+    </w:p>
+    <w:p>
+      <w:pPr>
+        <w:pStyle w:val="Heading3"/>
+      </w:pPr>
+      <w:bookmarkStart w:id="86" w:name="_Toc206760668"/>
+      <w:bookmarkStart w:id="87" w:name="data-transfer-agreement"/>
+      <w:r>
+        <w:t>5.1. Data Transfer Agreement:</w:t>
+      </w:r>
+      <w:bookmarkEnd w:id="86"/>
+    </w:p>
+    <w:p>
+      <w:pPr>
+        <w:pStyle w:val="FirstParagraph"/>
+      </w:pPr>
+      <w:r>
+        <w:t>The DTA between each Data Provider and UCT or WHC will outline the terms for transferring and processing health data. Where WHC is the Data Recipient, the Original Study Data is transferred and received from the Data Provider directly by the Core Data Team on UCT Data servers. The DTA must align with applicable national or international health data-sharing legislation. The DTA aims primarily to ensure that the handling, storage, and transfer of data adhere to relevant legislation and ethical standards and protects the rights of study participants and Data Providers.</w:t>
+      </w:r>
+    </w:p>
+    <w:p>
+      <w:pPr>
+        <w:pStyle w:val="BodyText"/>
+      </w:pPr>
+      <w:r>
+        <w:t>The Wits Human Research Ethics Committee (HREC) (Medical) is notified of each new study that contributes health data. The HE²AT Center team reviews the consent and ethic approvals of each of the studies that agree to share data. This section below outlines the steps and considerations relating to ethical procedures and these notifications</w:t>
+      </w:r>
+      <w:r>
+        <w:t xml:space="preserve">. </w:t>
+      </w:r>
+    </w:p>
+    <w:p>
+      <w:pPr>
+        <w:pStyle w:val="Heading3"/>
+      </w:pPr>
+      <w:bookmarkStart w:id="88" w:name="_Toc206760669"/>
+      <w:bookmarkStart w:id="89" w:name="X36f2f6f938b086ff6c1f45029638f55711fc1ea"/>
+      <w:bookmarkEnd w:id="87"/>
+      <w:r>
+        <w:t>5.2. Ethics committee notification for new studies:</w:t>
+      </w:r>
       <w:bookmarkEnd w:id="88"/>
-    </w:p>
-    <w:p>
-      <w:pPr>
-        <w:pStyle w:val="FirstParagraph"/>
-      </w:pPr>
-      <w:r>
-        <w:t>In alignment with the HE²AT Center’s commitment to ethical conduct across all research activities, the ethics approval and notification process, and Data Transfer Agreement (DTA) are essential for securing and maintaining oversight of studies that contribute data to the HE²AT Center Project.</w:t>
-      </w:r>
-    </w:p>
-    <w:p>
-      <w:pPr>
-        <w:pStyle w:val="BodyText"/>
-      </w:pPr>
-      <w:r>
-        <w:t>The RP1 and RP2 study activities have been reviewed and approved by the Wits Human Ethics Committee, with Ethics Reference Numbers of 220605 for RP1 and 220606 for RP2. As data from additional studies are received, the HE²AT Center notifies the relevant Ethics Committee of such and notes any concerns with a study, if relevant.</w:t>
-      </w:r>
-    </w:p>
-    <w:p>
-      <w:pPr>
-        <w:pStyle w:val="Heading3"/>
-      </w:pPr>
-      <w:bookmarkStart w:id="89" w:name="_Toc206760668"/>
-      <w:bookmarkStart w:id="90" w:name="data-transfer-agreement"/>
-      <w:r>
-        <w:t>5.1. Data Transfer Agreement:</w:t>
-      </w:r>
-      <w:bookmarkEnd w:id="89"/>
-    </w:p>
-    <w:p>
-      <w:pPr>
-        <w:pStyle w:val="FirstParagraph"/>
-      </w:pPr>
-      <w:r>
-        <w:t>The DTA between each Data Provider and UCT or WHC will outline the terms for transferring and processing health data. Where WHC is the Data Recipient, the Original Study Data is transferred and received from the Data Provider directly by the Core Data Team on UCT Data servers. The DTA must align with applicable national or international health data-sharing legislation. The DTA aims primarily to ensure that the handling, storage, and transfer of data adhere to relevant legislation and ethical standards and protects the rights of study participants and Data Providers.</w:t>
-      </w:r>
-    </w:p>
-    <w:p>
-      <w:pPr>
-        <w:pStyle w:val="BodyText"/>
-      </w:pPr>
-      <w:r>
-        <w:t>The Wits Human Research Ethics Committee (HREC) (Medical) is notified of each new study that contributes health data. The HE²AT Center team reviews the consent and ethic approvals of each of the studies that agree to share data. This section below outlines the steps and considerations relating to ethical procedures and these notifications</w:t>
-      </w:r>
-      <w:r>
-        <w:t xml:space="preserve">. </w:t>
-      </w:r>
-    </w:p>
-    <w:p>
-      <w:pPr>
-        <w:pStyle w:val="Heading3"/>
-      </w:pPr>
-      <w:bookmarkStart w:id="91" w:name="_Toc206760669"/>
-      <w:bookmarkStart w:id="92" w:name="X36f2f6f938b086ff6c1f45029638f55711fc1ea"/>
-      <w:bookmarkEnd w:id="90"/>
-      <w:r>
-        <w:t>5.2. Ethics committee notification for new studies:</w:t>
-      </w:r>
-      <w:bookmarkEnd w:id="91"/>
     </w:p>
     <w:p>
       <w:pPr>
@@ -9789,15 +9793,15 @@
           <w:cols w:space="720"/>
         </w:sectPr>
       </w:pPr>
-      <w:bookmarkStart w:id="93" w:name="Xc2b56e42c4a0cc1f5f67fe2de97181bc59bd9b5"/>
-      <w:bookmarkEnd w:id="87"/>
-      <w:bookmarkEnd w:id="92"/>
+      <w:bookmarkStart w:id="90" w:name="Xc2b56e42c4a0cc1f5f67fe2de97181bc59bd9b5"/>
+      <w:bookmarkEnd w:id="84"/>
+      <w:bookmarkEnd w:id="89"/>
     </w:p>
     <w:p>
       <w:pPr>
         <w:pStyle w:val="Heading2"/>
       </w:pPr>
-      <w:bookmarkStart w:id="94" w:name="_Toc206760670"/>
+      <w:bookmarkStart w:id="91" w:name="_Toc206760670"/>
       <w:r>
         <w:lastRenderedPageBreak/>
         <w:t xml:space="preserve">6. Pre-processing and </w:t>
@@ -9810,7 +9814,7 @@
       <w:r>
         <w:t xml:space="preserve"> of health data</w:t>
       </w:r>
-      <w:bookmarkEnd w:id="94"/>
+      <w:bookmarkEnd w:id="91"/>
     </w:p>
     <w:p>
       <w:pPr>
@@ -9832,12 +9836,12 @@
       <w:pPr>
         <w:pStyle w:val="Heading3"/>
       </w:pPr>
-      <w:bookmarkStart w:id="95" w:name="_Toc206760671"/>
-      <w:bookmarkStart w:id="96" w:name="pre-processing"/>
+      <w:bookmarkStart w:id="92" w:name="_Toc206760671"/>
+      <w:bookmarkStart w:id="93" w:name="pre-processing"/>
       <w:r>
         <w:t>6.1. Pre-processing</w:t>
       </w:r>
-      <w:bookmarkEnd w:id="95"/>
+      <w:bookmarkEnd w:id="92"/>
     </w:p>
     <w:p>
       <w:pPr>
@@ -9854,22 +9858,7 @@
       <w:r>
         <w:t xml:space="preserve"> to access incoming data securely stored on UCT data servers</w:t>
       </w:r>
-      <w:del w:id="97" w:author="Craig Parker" w:date="2025-08-15T07:37:00Z">
-        <w:r>
-          <w:delText xml:space="preserve"> </w:delText>
-        </w:r>
-        <w:r>
-          <w:rPr>
-            <w:b/>
-            <w:bCs/>
-          </w:rPr>
-          <w:delText>[TRACKED CHANGE] and WHC-managed cloud infrastructure with enhanced security and automated backup systems</w:delText>
-        </w:r>
-        <w:r>
-          <w:delText>.</w:delText>
-        </w:r>
-      </w:del>
-      <w:ins w:id="98" w:author="Craig Parker [2]" w:date="2025-09-09T11:57:00Z" w16du:dateUtc="2025-09-09T09:57:00Z">
+      <w:ins w:id="94" w:author="Craig Parker [2]" w:date="2025-09-09T11:57:00Z">
         <w:r>
           <w:t xml:space="preserve"> </w:t>
         </w:r>
@@ -9972,13 +9961,13 @@
       <w:pPr>
         <w:pStyle w:val="Heading3"/>
       </w:pPr>
-      <w:bookmarkStart w:id="99" w:name="_Toc206760672"/>
-      <w:bookmarkStart w:id="100" w:name="variable-mapping"/>
-      <w:bookmarkEnd w:id="96"/>
+      <w:bookmarkStart w:id="95" w:name="_Toc206760672"/>
+      <w:bookmarkStart w:id="96" w:name="variable-mapping"/>
+      <w:bookmarkEnd w:id="93"/>
       <w:r>
         <w:t>6.2. Variable mapping</w:t>
       </w:r>
-      <w:bookmarkEnd w:id="99"/>
+      <w:bookmarkEnd w:id="95"/>
     </w:p>
     <w:p>
       <w:pPr>
@@ -10076,13 +10065,13 @@
       <w:pPr>
         <w:pStyle w:val="Heading3"/>
       </w:pPr>
-      <w:bookmarkStart w:id="101" w:name="_Toc206760673"/>
-      <w:bookmarkStart w:id="102" w:name="mapping-validation"/>
-      <w:bookmarkEnd w:id="100"/>
+      <w:bookmarkStart w:id="97" w:name="_Toc206760673"/>
+      <w:bookmarkStart w:id="98" w:name="mapping-validation"/>
+      <w:bookmarkEnd w:id="96"/>
       <w:r>
         <w:t>6.3. Mapping validation</w:t>
       </w:r>
-      <w:bookmarkEnd w:id="101"/>
+      <w:bookmarkEnd w:id="97"/>
     </w:p>
     <w:p>
       <w:pPr>
@@ -10144,13 +10133,13 @@
       <w:pPr>
         <w:pStyle w:val="Heading3"/>
       </w:pPr>
-      <w:bookmarkStart w:id="103" w:name="_Toc206760674"/>
-      <w:bookmarkStart w:id="104" w:name="database-population"/>
-      <w:bookmarkEnd w:id="102"/>
+      <w:bookmarkStart w:id="99" w:name="_Toc206760674"/>
+      <w:bookmarkStart w:id="100" w:name="database-population"/>
+      <w:bookmarkEnd w:id="98"/>
       <w:r>
         <w:t>6.4. Database population</w:t>
       </w:r>
-      <w:bookmarkEnd w:id="103"/>
+      <w:bookmarkEnd w:id="99"/>
     </w:p>
     <w:p>
       <w:pPr>
@@ -10172,12 +10161,12 @@
       <w:pPr>
         <w:pStyle w:val="BodyText"/>
         <w:rPr>
-          <w:ins w:id="105" w:author="Craig Parker [2]" w:date="2025-09-11T14:53:00Z" w16du:dateUtc="2025-09-11T12:53:00Z"/>
+          <w:ins w:id="101" w:author="Craig Parker [2]" w:date="2025-09-11T14:53:00Z" w16du:dateUtc="2025-09-11T12:53:00Z"/>
           <w:b/>
           <w:bCs/>
         </w:rPr>
       </w:pPr>
-      <w:ins w:id="106" w:author="Craig Parker [2]" w:date="2025-09-11T14:53:00Z" w16du:dateUtc="2025-09-11T12:53:00Z">
+      <w:ins w:id="102" w:author="Craig Parker [2]" w:date="2025-09-11T14:53:00Z" w16du:dateUtc="2025-09-11T12:53:00Z">
         <w:r>
           <w:rPr>
             <w:b/>
@@ -10256,13 +10245,13 @@
       <w:pPr>
         <w:pStyle w:val="Heading3"/>
       </w:pPr>
-      <w:bookmarkStart w:id="107" w:name="_Toc206760675"/>
-      <w:bookmarkStart w:id="108" w:name="rp1rp2-de-identified-dataset-creation"/>
-      <w:bookmarkEnd w:id="104"/>
+      <w:bookmarkStart w:id="103" w:name="_Toc206760675"/>
+      <w:bookmarkStart w:id="104" w:name="rp1rp2-de-identified-dataset-creation"/>
+      <w:bookmarkEnd w:id="100"/>
       <w:r>
         <w:t>6.5. RP1/RP2 De-Identified Dataset Creation</w:t>
       </w:r>
-      <w:bookmarkEnd w:id="107"/>
+      <w:bookmarkEnd w:id="103"/>
     </w:p>
     <w:p>
       <w:r>
@@ -10289,172 +10278,172 @@
           <w:cols w:space="720"/>
         </w:sectPr>
       </w:pPr>
-      <w:bookmarkStart w:id="109" w:name="integration-and-analysis-interfaces"/>
-      <w:bookmarkEnd w:id="93"/>
-      <w:bookmarkEnd w:id="108"/>
+      <w:bookmarkStart w:id="105" w:name="integration-and-analysis-interfaces"/>
+      <w:bookmarkEnd w:id="90"/>
+      <w:bookmarkEnd w:id="104"/>
     </w:p>
     <w:p>
       <w:pPr>
         <w:pStyle w:val="Heading2"/>
       </w:pPr>
-      <w:bookmarkStart w:id="110" w:name="_Toc206760676"/>
+      <w:bookmarkStart w:id="106" w:name="_Toc206760676"/>
       <w:r>
         <w:lastRenderedPageBreak/>
         <w:t>7. Integration and analysis interfaces</w:t>
       </w:r>
+      <w:bookmarkEnd w:id="106"/>
+    </w:p>
+    <w:p>
+      <w:pPr>
+        <w:pStyle w:val="Heading3"/>
+      </w:pPr>
+      <w:bookmarkStart w:id="107" w:name="_Toc206760677"/>
+      <w:bookmarkStart w:id="108" w:name="X27a7b84d115bffc8b02a1ebae6595fb5946ef7a"/>
+      <w:r>
+        <w:t>7.1. Integration of climate and socio-economic variables</w:t>
+      </w:r>
+      <w:bookmarkEnd w:id="107"/>
+    </w:p>
+    <w:p>
+      <w:pPr>
+        <w:pStyle w:val="FirstParagraph"/>
+      </w:pPr>
+      <w:r>
+        <w:t>Integrating climate and socio-economic variables within the HE²AT Center’s data management workflow pulls relevant variables and indices from pre-existing non-health related datasets for the analysis period. The steps involved are as follows:</w:t>
+      </w:r>
+    </w:p>
+    <w:p>
+      <w:pPr>
+        <w:pStyle w:val="Heading3"/>
+      </w:pPr>
+      <w:bookmarkStart w:id="109" w:name="_Toc206760678"/>
+      <w:bookmarkStart w:id="110" w:name="sourcing-pre-processed-data"/>
+      <w:bookmarkEnd w:id="108"/>
+      <w:r>
+        <w:t>7.2. Sourcing pre-processed data</w:t>
+      </w:r>
+      <w:bookmarkEnd w:id="109"/>
+    </w:p>
+    <w:p>
+      <w:pPr>
+        <w:pStyle w:val="FirstParagraph"/>
+      </w:pPr>
+      <w:r>
+        <w:t xml:space="preserve">Climate and socio-economic data are sourced from previously cleaned and </w:t>
+      </w:r>
+      <w:proofErr w:type="spellStart"/>
+      <w:r>
+        <w:t>harmonised</w:t>
+      </w:r>
+      <w:proofErr w:type="spellEnd"/>
+      <w:r>
+        <w:t xml:space="preserve"> datasets, such as those available through the Climate System Analysis Group (CSAG) at UCT and national data repositories (e.g., census data, GCRO Quality of Life Surveys). These datasets have already undergone rigorous quality checks, reducing the need for extensive pre-processing at this stage.</w:t>
+      </w:r>
+    </w:p>
+    <w:p>
+      <w:pPr>
+        <w:pStyle w:val="Heading3"/>
+      </w:pPr>
+      <w:bookmarkStart w:id="111" w:name="_Toc206760679"/>
+      <w:bookmarkStart w:id="112" w:name="automated-data-retrieval"/>
       <w:bookmarkEnd w:id="110"/>
+      <w:r>
+        <w:t>7.3. Automated data retrieval</w:t>
+      </w:r>
+      <w:bookmarkEnd w:id="111"/>
+    </w:p>
+    <w:p>
+      <w:pPr>
+        <w:pStyle w:val="FirstParagraph"/>
+      </w:pPr>
+      <w:r>
+        <w:t>For climate data, a script-based system automates the retrieval of relevant variables and indices from the CSAG system. These scripts are designed to pull data specific to the analysis period, ensuring the dataset is tailored to the study’s needs. The retrieval process may include variables such as temperature, precipitation, humidity, and indices like heat waves or drought conditions.</w:t>
+      </w:r>
+    </w:p>
+    <w:p>
+      <w:pPr>
+        <w:pStyle w:val="BodyText"/>
+      </w:pPr>
+      <w:r>
+        <w:t>Similarly, socio-economic data is accessed through predefined queries that extract relevant indicators for the analysis period. These indicators may include household economic status, access to services, and other socio-demographic factors.</w:t>
+      </w:r>
     </w:p>
     <w:p>
       <w:pPr>
         <w:pStyle w:val="Heading3"/>
       </w:pPr>
-      <w:bookmarkStart w:id="111" w:name="_Toc206760677"/>
-      <w:bookmarkStart w:id="112" w:name="X27a7b84d115bffc8b02a1ebae6595fb5946ef7a"/>
-      <w:r>
-        <w:t>7.1. Integration of climate and socio-economic variables</w:t>
-      </w:r>
-      <w:bookmarkEnd w:id="111"/>
+      <w:bookmarkStart w:id="113" w:name="_Toc206760680"/>
+      <w:bookmarkStart w:id="114" w:name="integration-into-broader-dataset"/>
+      <w:bookmarkEnd w:id="112"/>
+      <w:r>
+        <w:t>7.4. Integration into broader dataset</w:t>
+      </w:r>
+      <w:bookmarkEnd w:id="113"/>
     </w:p>
     <w:p>
       <w:pPr>
         <w:pStyle w:val="FirstParagraph"/>
       </w:pPr>
       <w:r>
-        <w:t>Integrating climate and socio-economic variables within the HE²AT Center’s data management workflow pulls relevant variables and indices from pre-existing non-health related datasets for the analysis period. The steps involved are as follows:</w:t>
+        <w:t xml:space="preserve">Once retrieved, the climate, socio-economic variables, and health data are integrated into the broader dataset. This integration occurs during the Integration and Analysis step, where the different data types are aligned, based on common temporal and spatial attributes. The integration process is relatively straightforward, leveraging the pre-existing alignment of these datasets to </w:t>
+      </w:r>
+      <w:proofErr w:type="spellStart"/>
+      <w:r>
+        <w:t>minimise</w:t>
+      </w:r>
+      <w:proofErr w:type="spellEnd"/>
+      <w:r>
+        <w:t xml:space="preserve"> the need for additional </w:t>
+      </w:r>
+      <w:proofErr w:type="spellStart"/>
+      <w:r>
+        <w:t>harmonisation</w:t>
+      </w:r>
+      <w:proofErr w:type="spellEnd"/>
+      <w:r>
+        <w:t xml:space="preserve">. Integration requires the use of indirect identifiers in the Consortium Shared Data, in particular geolocation information and dates (e.g. date of birth) </w:t>
+      </w:r>
+      <w:proofErr w:type="gramStart"/>
+      <w:r>
+        <w:t>in order to</w:t>
+      </w:r>
+      <w:proofErr w:type="gramEnd"/>
+      <w:r>
+        <w:t xml:space="preserve"> align the non-health data temporally and spatially with the health data. These indirect identifiers are not carried through into the de-identified dataset ensuring that it is fully de-identified.</w:t>
       </w:r>
     </w:p>
     <w:p>
       <w:pPr>
         <w:pStyle w:val="Heading3"/>
       </w:pPr>
-      <w:bookmarkStart w:id="113" w:name="_Toc206760678"/>
-      <w:bookmarkStart w:id="114" w:name="sourcing-pre-processed-data"/>
-      <w:bookmarkEnd w:id="112"/>
-      <w:r>
-        <w:t>7.2. Sourcing pre-processed data</w:t>
-      </w:r>
-      <w:bookmarkEnd w:id="113"/>
+      <w:bookmarkStart w:id="115" w:name="_Toc206760681"/>
+      <w:bookmarkStart w:id="116" w:name="collaboration-with-csaguct"/>
+      <w:bookmarkEnd w:id="114"/>
+      <w:r>
+        <w:t>7.5. Collaboration with CSAG/UCT</w:t>
+      </w:r>
+      <w:bookmarkEnd w:id="115"/>
     </w:p>
     <w:p>
       <w:pPr>
         <w:pStyle w:val="FirstParagraph"/>
       </w:pPr>
       <w:r>
-        <w:t xml:space="preserve">Climate and socio-economic data are sourced from previously cleaned and </w:t>
-      </w:r>
-      <w:proofErr w:type="spellStart"/>
-      <w:r>
-        <w:t>harmonised</w:t>
-      </w:r>
-      <w:proofErr w:type="spellEnd"/>
-      <w:r>
-        <w:t xml:space="preserve"> datasets, such as those available through the Climate System Analysis Group (CSAG) at UCT and national data repositories (e.g., census data, GCRO Quality of Life Surveys). These datasets have already undergone rigorous quality checks, reducing the need for extensive pre-processing at this stage.</w:t>
+        <w:t>The CSAG team at UCT plays a crucial role in managing and updating the climate data system, ensuring that the variables and indices used in the analysis are up-to-date and relevant. This collaboration aims to ensure that the data retrieval process is seamless and that the analysis is grounded in the latest climate science.</w:t>
       </w:r>
     </w:p>
     <w:p>
       <w:pPr>
         <w:pStyle w:val="Heading3"/>
       </w:pPr>
-      <w:bookmarkStart w:id="115" w:name="_Toc206760679"/>
-      <w:bookmarkStart w:id="116" w:name="automated-data-retrieval"/>
-      <w:bookmarkEnd w:id="114"/>
-      <w:r>
-        <w:t>7.3. Automated data retrieval</w:t>
-      </w:r>
-      <w:bookmarkEnd w:id="115"/>
-    </w:p>
-    <w:p>
-      <w:pPr>
-        <w:pStyle w:val="FirstParagraph"/>
-      </w:pPr>
-      <w:r>
-        <w:t>For climate data, a script-based system automates the retrieval of relevant variables and indices from the CSAG system. These scripts are designed to pull data specific to the analysis period, ensuring the dataset is tailored to the study’s needs. The retrieval process may include variables such as temperature, precipitation, humidity, and indices like heat waves or drought conditions.</w:t>
-      </w:r>
-    </w:p>
-    <w:p>
-      <w:pPr>
-        <w:pStyle w:val="BodyText"/>
-      </w:pPr>
-      <w:r>
-        <w:t>Similarly, socio-economic data is accessed through predefined queries that extract relevant indicators for the analysis period. These indicators may include household economic status, access to services, and other socio-demographic factors.</w:t>
-      </w:r>
-    </w:p>
-    <w:p>
-      <w:pPr>
-        <w:pStyle w:val="Heading3"/>
-      </w:pPr>
-      <w:bookmarkStart w:id="117" w:name="_Toc206760680"/>
-      <w:bookmarkStart w:id="118" w:name="integration-into-broader-dataset"/>
+      <w:bookmarkStart w:id="117" w:name="_Toc206760682"/>
+      <w:bookmarkStart w:id="118" w:name="alignment-with-analysis-objectives"/>
       <w:bookmarkEnd w:id="116"/>
-      <w:r>
-        <w:t>7.4. Integration into broader dataset</w:t>
-      </w:r>
-      <w:bookmarkEnd w:id="117"/>
-    </w:p>
-    <w:p>
-      <w:pPr>
-        <w:pStyle w:val="FirstParagraph"/>
-      </w:pPr>
-      <w:r>
-        <w:t xml:space="preserve">Once retrieved, the climate, socio-economic variables, and health data are integrated into the broader dataset. This integration occurs during the Integration and Analysis step, where the different data types are aligned, based on common temporal and spatial attributes. The integration process is relatively straightforward, leveraging the pre-existing alignment of these datasets to </w:t>
-      </w:r>
-      <w:proofErr w:type="spellStart"/>
-      <w:r>
-        <w:t>minimise</w:t>
-      </w:r>
-      <w:proofErr w:type="spellEnd"/>
-      <w:r>
-        <w:t xml:space="preserve"> the need for additional </w:t>
-      </w:r>
-      <w:proofErr w:type="spellStart"/>
-      <w:r>
-        <w:t>harmonisation</w:t>
-      </w:r>
-      <w:proofErr w:type="spellEnd"/>
-      <w:r>
-        <w:t xml:space="preserve">. Integration requires the use of indirect identifiers in the Consortium Shared Data, in particular geolocation information and dates (e.g. date of birth) </w:t>
-      </w:r>
-      <w:proofErr w:type="gramStart"/>
-      <w:r>
-        <w:t>in order to</w:t>
-      </w:r>
-      <w:proofErr w:type="gramEnd"/>
-      <w:r>
-        <w:t xml:space="preserve"> align the non-health data temporally and spatially with the health data. These indirect identifiers are not carried through into the de-identified dataset ensuring that it is fully de-identified.</w:t>
-      </w:r>
-    </w:p>
-    <w:p>
-      <w:pPr>
-        <w:pStyle w:val="Heading3"/>
-      </w:pPr>
-      <w:bookmarkStart w:id="119" w:name="_Toc206760681"/>
-      <w:bookmarkStart w:id="120" w:name="collaboration-with-csaguct"/>
-      <w:bookmarkEnd w:id="118"/>
-      <w:r>
-        <w:t>7.5. Collaboration with CSAG/UCT</w:t>
-      </w:r>
-      <w:bookmarkEnd w:id="119"/>
-    </w:p>
-    <w:p>
-      <w:pPr>
-        <w:pStyle w:val="FirstParagraph"/>
-      </w:pPr>
-      <w:r>
-        <w:t>The CSAG team at UCT plays a crucial role in managing and updating the climate data system, ensuring that the variables and indices used in the analysis are up-to-date and relevant. This collaboration aims to ensure that the data retrieval process is seamless and that the analysis is grounded in the latest climate science.</w:t>
-      </w:r>
-    </w:p>
-    <w:p>
-      <w:pPr>
-        <w:pStyle w:val="Heading3"/>
-      </w:pPr>
-      <w:bookmarkStart w:id="121" w:name="_Toc206760682"/>
-      <w:bookmarkStart w:id="122" w:name="alignment-with-analysis-objectives"/>
-      <w:bookmarkEnd w:id="120"/>
       <w:r>
         <w:lastRenderedPageBreak/>
         <w:t>7.6. Alignment with analysis objectives</w:t>
       </w:r>
-      <w:bookmarkEnd w:id="121"/>
+      <w:bookmarkEnd w:id="117"/>
     </w:p>
     <w:p>
       <w:pPr>
@@ -10477,20 +10466,20 @@
           <w:cols w:space="720"/>
         </w:sectPr>
       </w:pPr>
-      <w:bookmarkStart w:id="123" w:name="data-analysis-platform"/>
-      <w:bookmarkEnd w:id="109"/>
-      <w:bookmarkEnd w:id="122"/>
+      <w:bookmarkStart w:id="119" w:name="data-analysis-platform"/>
+      <w:bookmarkEnd w:id="105"/>
+      <w:bookmarkEnd w:id="118"/>
     </w:p>
     <w:p>
       <w:pPr>
         <w:pStyle w:val="Heading2"/>
       </w:pPr>
-      <w:bookmarkStart w:id="124" w:name="_Toc206760683"/>
+      <w:bookmarkStart w:id="120" w:name="_Toc206760683"/>
       <w:r>
         <w:lastRenderedPageBreak/>
         <w:t>8. Data analysis platform</w:t>
       </w:r>
-      <w:bookmarkEnd w:id="124"/>
+      <w:bookmarkEnd w:id="120"/>
     </w:p>
     <w:p>
       <w:pPr>
@@ -10516,7 +10505,7 @@
       <w:r>
         <w:t xml:space="preserve"> </w:t>
       </w:r>
-      <w:del w:id="125" w:author="Craig Parker" w:date="2025-08-05T12:16:00Z">
+      <w:del w:id="121" w:author="Craig Parker" w:date="2025-08-05T12:16:00Z">
         <w:r>
           <w:delText xml:space="preserve"> </w:delText>
         </w:r>
@@ -10528,7 +10517,7 @@
           <w:delText>[TRACKED CHANGE] and cloud-based computational resources with GPU acceleration for complex analyses, improved processing times, and enhanced analytical capabilities</w:delText>
         </w:r>
       </w:del>
-      <w:ins w:id="126" w:author="Craig Parker [2]" w:date="2025-09-11T14:57:00Z" w16du:dateUtc="2025-09-11T12:57:00Z">
+      <w:ins w:id="122" w:author="Craig Parker [2]" w:date="2025-09-11T14:57:00Z" w16du:dateUtc="2025-09-11T12:57:00Z">
         <w:r>
           <w:rPr>
             <w:b/>
@@ -10697,19 +10686,19 @@
           <w:cols w:space="720"/>
         </w:sectPr>
       </w:pPr>
-      <w:bookmarkStart w:id="127" w:name="de-identification"/>
-      <w:bookmarkEnd w:id="123"/>
+      <w:bookmarkStart w:id="123" w:name="de-identification"/>
+      <w:bookmarkEnd w:id="119"/>
     </w:p>
     <w:p>
       <w:pPr>
         <w:pStyle w:val="Heading2"/>
       </w:pPr>
-      <w:bookmarkStart w:id="128" w:name="_Toc206760684"/>
+      <w:bookmarkStart w:id="124" w:name="_Toc206760684"/>
       <w:r>
         <w:lastRenderedPageBreak/>
         <w:t>9. De-identification</w:t>
       </w:r>
-      <w:bookmarkEnd w:id="128"/>
+      <w:bookmarkEnd w:id="124"/>
     </w:p>
     <w:p>
       <w:pPr>
@@ -10780,8 +10769,8 @@
       <w:pPr>
         <w:pStyle w:val="Heading3"/>
       </w:pPr>
-      <w:bookmarkStart w:id="129" w:name="_Toc206760685"/>
-      <w:bookmarkStart w:id="130" w:name="safe-harbour-andor-expert-determination"/>
+      <w:bookmarkStart w:id="125" w:name="_Toc206760685"/>
+      <w:bookmarkStart w:id="126" w:name="safe-harbour-andor-expert-determination"/>
       <w:r>
         <w:t xml:space="preserve">9.1. Safe </w:t>
       </w:r>
@@ -10793,7 +10782,7 @@
       <w:r>
         <w:t xml:space="preserve"> and/or expert determination</w:t>
       </w:r>
-      <w:bookmarkEnd w:id="129"/>
+      <w:bookmarkEnd w:id="125"/>
     </w:p>
     <w:p>
       <w:pPr>
@@ -10831,14 +10820,14 @@
       <w:pPr>
         <w:pStyle w:val="Heading3"/>
       </w:pPr>
-      <w:bookmarkStart w:id="131" w:name="_Toc206760686"/>
-      <w:bookmarkStart w:id="132" w:name="geographic-aggregation"/>
-      <w:bookmarkEnd w:id="130"/>
+      <w:bookmarkStart w:id="127" w:name="_Toc206760686"/>
+      <w:bookmarkStart w:id="128" w:name="geographic-aggregation"/>
+      <w:bookmarkEnd w:id="126"/>
       <w:r>
         <w:lastRenderedPageBreak/>
         <w:t>9.2. Geographic aggregation</w:t>
       </w:r>
-      <w:bookmarkEnd w:id="131"/>
+      <w:bookmarkEnd w:id="127"/>
     </w:p>
     <w:p>
       <w:pPr>
@@ -10860,13 +10849,13 @@
       <w:pPr>
         <w:pStyle w:val="Heading3"/>
       </w:pPr>
-      <w:bookmarkStart w:id="133" w:name="_Toc206760687"/>
-      <w:bookmarkStart w:id="134" w:name="location-jittering"/>
-      <w:bookmarkEnd w:id="132"/>
+      <w:bookmarkStart w:id="129" w:name="_Toc206760687"/>
+      <w:bookmarkStart w:id="130" w:name="location-jittering"/>
+      <w:bookmarkEnd w:id="128"/>
       <w:r>
         <w:t>9.3. Location jittering</w:t>
       </w:r>
-      <w:bookmarkEnd w:id="133"/>
+      <w:bookmarkEnd w:id="129"/>
     </w:p>
     <w:p>
       <w:pPr>
@@ -10965,24 +10954,34 @@
       <w:r>
         <w:t xml:space="preserve">Figure </w:t>
       </w:r>
-      <w:fldSimple w:instr=" SEQ Figure \* ARABIC ">
-        <w:ins w:id="135" w:author="Craig Parker [2]" w:date="2025-09-05T08:59:00Z" w16du:dateUtc="2025-09-05T06:59:00Z">
-          <w:r>
-            <w:rPr>
-              <w:noProof/>
-            </w:rPr>
-            <w:t>2</w:t>
-          </w:r>
-        </w:ins>
-        <w:del w:id="136" w:author="Craig Parker [2]" w:date="2025-09-05T08:59:00Z" w16du:dateUtc="2025-09-05T06:59:00Z">
-          <w:r>
-            <w:rPr>
-              <w:noProof/>
-            </w:rPr>
-            <w:delText>3</w:delText>
-          </w:r>
-        </w:del>
-      </w:fldSimple>
+      <w:r>
+        <w:fldChar w:fldCharType="begin"/>
+      </w:r>
+      <w:r>
+        <w:instrText>SEQ Figure \* ARABIC</w:instrText>
+      </w:r>
+      <w:r>
+        <w:fldChar w:fldCharType="separate"/>
+      </w:r>
+      <w:ins w:id="131" w:author="Craig Parker [2]" w:date="2025-09-05T08:59:00Z" w16du:dateUtc="2025-09-05T06:59:00Z">
+        <w:r>
+          <w:rPr>
+            <w:noProof/>
+          </w:rPr>
+          <w:t>2</w:t>
+        </w:r>
+      </w:ins>
+      <w:del w:id="132" w:author="Craig Parker [2]" w:date="2025-09-05T08:59:00Z" w16du:dateUtc="2025-09-05T06:59:00Z">
+        <w:r>
+          <w:rPr>
+            <w:noProof/>
+          </w:rPr>
+          <w:delText>3</w:delText>
+        </w:r>
+      </w:del>
+      <w:r>
+        <w:fldChar w:fldCharType="end"/>
+      </w:r>
       <w:r>
         <w:t>:</w:t>
       </w:r>
@@ -11040,13 +11039,13 @@
       <w:pPr>
         <w:pStyle w:val="Heading3"/>
       </w:pPr>
-      <w:bookmarkStart w:id="137" w:name="_Toc206760688"/>
-      <w:bookmarkStart w:id="138" w:name="expert-review-and-risk-assessment"/>
-      <w:bookmarkEnd w:id="134"/>
+      <w:bookmarkStart w:id="133" w:name="_Toc206760688"/>
+      <w:bookmarkStart w:id="134" w:name="expert-review-and-risk-assessment"/>
+      <w:bookmarkEnd w:id="130"/>
       <w:r>
         <w:t>9.4. Expert review and risk assessment</w:t>
       </w:r>
-      <w:bookmarkEnd w:id="137"/>
+      <w:bookmarkEnd w:id="133"/>
     </w:p>
     <w:p>
       <w:pPr>
@@ -11066,13 +11065,18 @@
       </w:r>
     </w:p>
     <w:p>
-      <w:del w:id="139" w:author="Craig Parker" w:date="2025-08-05T12:16:00Z" w16du:dateUtc="2025-08-05T10:16:00Z">
+      <w:del w:id="135" w:author="Craig Parker" w:date="2025-08-05T12:16:00Z" w16du:dateUtc="2025-08-05T10:16:00Z">
+        <w:r>
+          <w:rPr>
+            <w:noProof/>
+          </w:rPr>
+        </w:r>
         <w:r>
           <w:rPr>
             <w:noProof/>
           </w:rPr>
           <w:pict w14:anchorId="329B3CD2">
-            <v:rect id="_x0000_i1027" alt="" style="width:468pt;height:.05pt;mso-width-percent:0;mso-height-percent:0;mso-width-percent:0;mso-height-percent:0" o:hralign="center" o:hrstd="t" o:hr="t"/>
+            <v:rect id="_x0000_i1029" alt="" style="width:468pt;height:.05pt;mso-width-percent:0;mso-height-percent:0;mso-width-percent:0;mso-height-percent:0" o:hralign="center" o:hrstd="t" o:hr="t"/>
           </w:pict>
         </w:r>
       </w:del>
@@ -11089,20 +11093,20 @@
           <w:cols w:space="720"/>
         </w:sectPr>
       </w:pPr>
-      <w:bookmarkStart w:id="140" w:name="data-sharing"/>
-      <w:bookmarkEnd w:id="127"/>
-      <w:bookmarkEnd w:id="138"/>
+      <w:bookmarkStart w:id="136" w:name="data-sharing"/>
+      <w:bookmarkEnd w:id="123"/>
+      <w:bookmarkEnd w:id="134"/>
     </w:p>
     <w:p>
       <w:pPr>
         <w:pStyle w:val="Heading2"/>
       </w:pPr>
-      <w:bookmarkStart w:id="141" w:name="_Toc206760689"/>
+      <w:bookmarkStart w:id="137" w:name="_Toc206760689"/>
       <w:r>
         <w:lastRenderedPageBreak/>
         <w:t>10. Data sharing</w:t>
       </w:r>
-      <w:bookmarkEnd w:id="141"/>
+      <w:bookmarkEnd w:id="137"/>
     </w:p>
     <w:p>
       <w:pPr>
@@ -11124,12 +11128,12 @@
       <w:pPr>
         <w:pStyle w:val="Heading3"/>
       </w:pPr>
-      <w:bookmarkStart w:id="142" w:name="_Toc206760690"/>
-      <w:bookmarkStart w:id="143" w:name="restrictions-to-data-sharing"/>
+      <w:bookmarkStart w:id="138" w:name="_Toc206760690"/>
+      <w:bookmarkStart w:id="139" w:name="restrictions-to-data-sharing"/>
       <w:r>
         <w:t>10.1. Restrictions to Data Sharing</w:t>
       </w:r>
-      <w:bookmarkEnd w:id="142"/>
+      <w:bookmarkEnd w:id="138"/>
     </w:p>
     <w:p>
       <w:pPr>
@@ -11151,13 +11155,13 @@
       <w:pPr>
         <w:pStyle w:val="Heading3"/>
       </w:pPr>
-      <w:bookmarkStart w:id="144" w:name="_Toc206760691"/>
-      <w:bookmarkStart w:id="145" w:name="discoverability"/>
-      <w:bookmarkEnd w:id="143"/>
+      <w:bookmarkStart w:id="140" w:name="_Toc206760691"/>
+      <w:bookmarkStart w:id="141" w:name="discoverability"/>
+      <w:bookmarkEnd w:id="139"/>
       <w:r>
         <w:t>10.2. Discoverability</w:t>
       </w:r>
-      <w:bookmarkEnd w:id="144"/>
+      <w:bookmarkEnd w:id="140"/>
     </w:p>
     <w:p>
       <w:pPr>
@@ -11251,13 +11255,13 @@
       <w:pPr>
         <w:pStyle w:val="Heading3"/>
       </w:pPr>
-      <w:bookmarkStart w:id="146" w:name="_Toc206760692"/>
-      <w:bookmarkStart w:id="147" w:name="levels-of-data-access"/>
-      <w:bookmarkEnd w:id="145"/>
+      <w:bookmarkStart w:id="142" w:name="_Toc206760692"/>
+      <w:bookmarkStart w:id="143" w:name="levels-of-data-access"/>
+      <w:bookmarkEnd w:id="141"/>
       <w:r>
         <w:t>10.3. Levels of Data Access</w:t>
       </w:r>
-      <w:bookmarkEnd w:id="146"/>
+      <w:bookmarkEnd w:id="142"/>
     </w:p>
     <w:p>
       <w:pPr>
@@ -11376,27 +11380,27 @@
       <w:pPr>
         <w:pStyle w:val="Heading3"/>
         <w:rPr>
-          <w:ins w:id="148" w:author="Craig Parker" w:date="2025-08-22T12:37:00Z" w16du:dateUtc="2025-08-22T10:37:00Z"/>
-        </w:rPr>
-      </w:pPr>
-      <w:bookmarkStart w:id="149" w:name="_Toc206760693"/>
-      <w:bookmarkStart w:id="150" w:name="X9cdf1622c40d1ef45648b54535984369e341b58"/>
-      <w:bookmarkEnd w:id="147"/>
+          <w:ins w:id="144" w:author="Craig Parker" w:date="2025-08-22T12:37:00Z" w16du:dateUtc="2025-08-22T10:37:00Z"/>
+        </w:rPr>
+      </w:pPr>
+      <w:bookmarkStart w:id="145" w:name="_Toc206760693"/>
+      <w:bookmarkStart w:id="146" w:name="X9cdf1622c40d1ef45648b54535984369e341b58"/>
+      <w:bookmarkEnd w:id="143"/>
       <w:r>
         <w:t>10.4. Procedure for Making RP1/RP2 De-identified Data Available to Bona Fide Researchers</w:t>
       </w:r>
-      <w:bookmarkEnd w:id="149"/>
+      <w:bookmarkEnd w:id="145"/>
     </w:p>
     <w:p>
       <w:pPr>
         <w:pStyle w:val="BodyText"/>
-        <w:pPrChange w:id="151" w:author="Craig Parker" w:date="2025-08-22T12:37:00Z" w16du:dateUtc="2025-08-22T10:37:00Z">
+        <w:pPrChange w:id="147" w:author="Craig Parker" w:date="2025-08-22T12:37:00Z" w16du:dateUtc="2025-08-22T10:37:00Z">
           <w:pPr>
             <w:pStyle w:val="Heading3"/>
           </w:pPr>
         </w:pPrChange>
       </w:pPr>
-      <w:ins w:id="152" w:author="Craig Parker" w:date="2025-08-22T12:37:00Z">
+      <w:ins w:id="148" w:author="Craig Parker" w:date="2025-08-22T12:37:00Z">
         <w:r>
           <w:rPr>
             <w:b/>
@@ -11662,13 +11666,18 @@
       </w:r>
     </w:p>
     <w:p>
-      <w:del w:id="153" w:author="Craig Parker" w:date="2025-08-05T12:16:00Z" w16du:dateUtc="2025-08-05T10:16:00Z">
+      <w:del w:id="149" w:author="Craig Parker" w:date="2025-08-05T12:16:00Z" w16du:dateUtc="2025-08-05T10:16:00Z">
+        <w:r>
+          <w:rPr>
+            <w:noProof/>
+          </w:rPr>
+        </w:r>
         <w:r>
           <w:rPr>
             <w:noProof/>
           </w:rPr>
           <w:pict w14:anchorId="2307DE28">
-            <v:rect id="_x0000_i1026" alt="" style="width:468pt;height:.05pt;mso-width-percent:0;mso-height-percent:0;mso-width-percent:0;mso-height-percent:0" o:hralign="center" o:hrstd="t" o:hr="t"/>
+            <v:rect id="_x0000_i1030" alt="" style="width:468pt;height:.05pt;mso-width-percent:0;mso-height-percent:0;mso-width-percent:0;mso-height-percent:0" o:hralign="center" o:hrstd="t" o:hr="t"/>
           </w:pict>
         </w:r>
       </w:del>
@@ -11685,20 +11694,20 @@
           <w:cols w:space="720"/>
         </w:sectPr>
       </w:pPr>
-      <w:bookmarkStart w:id="154" w:name="X2db6ef8ae2f5832aef8e8b4c0bcb654737aa512"/>
-      <w:bookmarkEnd w:id="140"/>
-      <w:bookmarkEnd w:id="150"/>
+      <w:bookmarkStart w:id="150" w:name="X2db6ef8ae2f5832aef8e8b4c0bcb654737aa512"/>
+      <w:bookmarkEnd w:id="136"/>
+      <w:bookmarkEnd w:id="146"/>
     </w:p>
     <w:p>
       <w:pPr>
         <w:pStyle w:val="Heading2"/>
       </w:pPr>
-      <w:bookmarkStart w:id="155" w:name="_Toc206760694"/>
+      <w:bookmarkStart w:id="151" w:name="_Toc206760694"/>
       <w:r>
         <w:lastRenderedPageBreak/>
         <w:t>11. POPIA compliance and protection of personal information</w:t>
       </w:r>
-      <w:bookmarkEnd w:id="155"/>
+      <w:bookmarkEnd w:id="151"/>
     </w:p>
     <w:p>
       <w:pPr>
@@ -11960,19 +11969,19 @@
           <w:cols w:space="720"/>
         </w:sectPr>
       </w:pPr>
-      <w:bookmarkStart w:id="156" w:name="governance-and-compliance"/>
-      <w:bookmarkEnd w:id="154"/>
+      <w:bookmarkStart w:id="152" w:name="governance-and-compliance"/>
+      <w:bookmarkEnd w:id="150"/>
     </w:p>
     <w:p>
       <w:pPr>
         <w:pStyle w:val="Heading2"/>
       </w:pPr>
-      <w:bookmarkStart w:id="157" w:name="_Toc206760695"/>
+      <w:bookmarkStart w:id="153" w:name="_Toc206760695"/>
       <w:r>
         <w:lastRenderedPageBreak/>
         <w:t>12. Governance and compliance</w:t>
       </w:r>
-      <w:bookmarkEnd w:id="157"/>
+      <w:bookmarkEnd w:id="153"/>
     </w:p>
     <w:p>
       <w:pPr>
@@ -11986,12 +11995,12 @@
       <w:pPr>
         <w:pStyle w:val="Heading3"/>
       </w:pPr>
-      <w:bookmarkStart w:id="158" w:name="_Toc206760696"/>
-      <w:bookmarkStart w:id="159" w:name="data-governance"/>
+      <w:bookmarkStart w:id="154" w:name="_Toc206760696"/>
+      <w:bookmarkStart w:id="155" w:name="data-governance"/>
       <w:r>
         <w:t>12.1. Data Governance</w:t>
       </w:r>
-      <w:bookmarkEnd w:id="158"/>
+      <w:bookmarkEnd w:id="154"/>
     </w:p>
     <w:p>
       <w:pPr>
@@ -12013,13 +12022,13 @@
       <w:pPr>
         <w:pStyle w:val="Heading3"/>
       </w:pPr>
-      <w:bookmarkStart w:id="160" w:name="_Toc206760697"/>
-      <w:bookmarkStart w:id="161" w:name="data-indexing-and-metadata-management"/>
-      <w:bookmarkEnd w:id="159"/>
+      <w:bookmarkStart w:id="156" w:name="_Toc206760697"/>
+      <w:bookmarkStart w:id="157" w:name="data-indexing-and-metadata-management"/>
+      <w:bookmarkEnd w:id="155"/>
       <w:r>
         <w:t>12.2. Data Indexing and Metadata Management</w:t>
       </w:r>
-      <w:bookmarkEnd w:id="160"/>
+      <w:bookmarkEnd w:id="156"/>
     </w:p>
     <w:p>
       <w:pPr>
@@ -12154,13 +12163,13 @@
       <w:pPr>
         <w:pStyle w:val="Heading3"/>
       </w:pPr>
-      <w:bookmarkStart w:id="162" w:name="_Toc206760698"/>
-      <w:bookmarkStart w:id="163" w:name="data-access-committee"/>
-      <w:bookmarkEnd w:id="161"/>
+      <w:bookmarkStart w:id="158" w:name="_Toc206760698"/>
+      <w:bookmarkStart w:id="159" w:name="data-access-committee"/>
+      <w:bookmarkEnd w:id="157"/>
       <w:r>
         <w:t>12.3. Data Access Committee</w:t>
       </w:r>
-      <w:bookmarkEnd w:id="162"/>
+      <w:bookmarkEnd w:id="158"/>
     </w:p>
     <w:p>
       <w:pPr>
@@ -12178,7 +12187,7 @@
       <w:pPr>
         <w:pStyle w:val="BodyText"/>
         <w:rPr>
-          <w:ins w:id="164" w:author="Craig Parker" w:date="2025-08-22T12:39:00Z" w16du:dateUtc="2025-08-22T10:39:00Z"/>
+          <w:ins w:id="160" w:author="Craig Parker" w:date="2025-08-22T12:39:00Z" w16du:dateUtc="2025-08-22T10:39:00Z"/>
         </w:rPr>
       </w:pPr>
     </w:p>
@@ -12312,20 +12321,20 @@
           <w:cols w:space="720"/>
         </w:sectPr>
       </w:pPr>
-      <w:bookmarkStart w:id="165" w:name="data-retention"/>
-      <w:bookmarkEnd w:id="156"/>
-      <w:bookmarkEnd w:id="163"/>
+      <w:bookmarkStart w:id="161" w:name="data-retention"/>
+      <w:bookmarkEnd w:id="152"/>
+      <w:bookmarkEnd w:id="159"/>
     </w:p>
     <w:p>
       <w:pPr>
         <w:pStyle w:val="Heading2"/>
       </w:pPr>
-      <w:bookmarkStart w:id="166" w:name="_Toc206760699"/>
+      <w:bookmarkStart w:id="162" w:name="_Toc206760699"/>
       <w:r>
         <w:lastRenderedPageBreak/>
         <w:t>13. Data retention</w:t>
       </w:r>
-      <w:bookmarkEnd w:id="166"/>
+      <w:bookmarkEnd w:id="162"/>
     </w:p>
     <w:p>
       <w:pPr>
@@ -12347,12 +12356,12 @@
       <w:pPr>
         <w:pStyle w:val="Heading3"/>
       </w:pPr>
-      <w:bookmarkStart w:id="167" w:name="_Toc206760700"/>
-      <w:bookmarkStart w:id="168" w:name="retention-periods"/>
+      <w:bookmarkStart w:id="163" w:name="_Toc206760700"/>
+      <w:bookmarkStart w:id="164" w:name="retention-periods"/>
       <w:r>
         <w:t>13.1. Retention Periods:</w:t>
       </w:r>
-      <w:bookmarkEnd w:id="167"/>
+      <w:bookmarkEnd w:id="163"/>
     </w:p>
     <w:p>
       <w:pPr>
@@ -12430,13 +12439,13 @@
       <w:pPr>
         <w:pStyle w:val="Heading3"/>
       </w:pPr>
-      <w:bookmarkStart w:id="169" w:name="_Toc206760701"/>
-      <w:bookmarkStart w:id="170" w:name="X8930c258198720edd7181ea182bae298f76f11e"/>
-      <w:bookmarkEnd w:id="168"/>
+      <w:bookmarkStart w:id="165" w:name="_Toc206760701"/>
+      <w:bookmarkStart w:id="166" w:name="X8930c258198720edd7181ea182bae298f76f11e"/>
+      <w:bookmarkEnd w:id="164"/>
       <w:r>
         <w:t>13.2. Ongoing Monitoring of Data Transfer Agreements</w:t>
       </w:r>
-      <w:bookmarkEnd w:id="169"/>
+      <w:bookmarkEnd w:id="165"/>
     </w:p>
     <w:p>
       <w:pPr>
@@ -12467,20 +12476,20 @@
           <w:cols w:space="720"/>
         </w:sectPr>
       </w:pPr>
-      <w:bookmarkStart w:id="171" w:name="restricted-data-access"/>
-      <w:bookmarkEnd w:id="165"/>
-      <w:bookmarkEnd w:id="170"/>
+      <w:bookmarkStart w:id="167" w:name="restricted-data-access"/>
+      <w:bookmarkEnd w:id="161"/>
+      <w:bookmarkEnd w:id="166"/>
     </w:p>
     <w:p>
       <w:pPr>
         <w:pStyle w:val="Heading2"/>
       </w:pPr>
-      <w:bookmarkStart w:id="172" w:name="_Toc206760702"/>
+      <w:bookmarkStart w:id="168" w:name="_Toc206760702"/>
       <w:r>
         <w:lastRenderedPageBreak/>
         <w:t>14. Restricted data access</w:t>
       </w:r>
-      <w:bookmarkEnd w:id="172"/>
+      <w:bookmarkEnd w:id="168"/>
     </w:p>
     <w:p>
       <w:pPr>
@@ -12494,12 +12503,12 @@
       <w:pPr>
         <w:pStyle w:val="Heading3"/>
       </w:pPr>
-      <w:bookmarkStart w:id="173" w:name="_Toc206760703"/>
-      <w:bookmarkStart w:id="174" w:name="data-transfer-storage-and-encryption"/>
+      <w:bookmarkStart w:id="169" w:name="_Toc206760703"/>
+      <w:bookmarkStart w:id="170" w:name="data-transfer-storage-and-encryption"/>
       <w:r>
         <w:t>14.1. Data transfer, storage and encryption</w:t>
       </w:r>
-      <w:bookmarkEnd w:id="173"/>
+      <w:bookmarkEnd w:id="169"/>
     </w:p>
     <w:p>
       <w:pPr>
@@ -12514,75 +12523,36 @@
       </w:r>
       <w:proofErr w:type="spellEnd"/>
       <w:r>
-        <w:t xml:space="preserve"> </w:t>
-      </w:r>
-      <w:r>
-        <w:t xml:space="preserve">modality, which is encrypted. Once transferred to UCT </w:t>
-      </w:r>
-      <w:del w:id="175" w:author="Craig Parker" w:date="2025-08-05T12:02:00Z">
+        <w:t xml:space="preserve"> modality, which is encrypted. Once transferred to UCT </w:t>
+      </w:r>
+      <w:del w:id="171" w:author="Craig Parker" w:date="2025-08-05T12:02:00Z">
         <w:r>
-          <w:rPr>
-            <w:b/>
-            <w:bCs/>
-          </w:rPr>
-          <w:delText>[TRACKED CHANGE] and WHC-managed cloud infrastructure</w:delText>
-        </w:r>
-        <w:r>
-          <w:delText xml:space="preserve">, </w:delText>
+          <w:delText xml:space="preserve">[TRACKED CHANGE] and WHC-managed cloud infrastructure, </w:delText>
         </w:r>
       </w:del>
-      <w:ins w:id="176" w:author="Craig Parker [2]" w:date="2025-09-11T15:04:00Z" w16du:dateUtc="2025-09-11T13:04:00Z">
+      <w:ins w:id="172" w:author="Craig Parker [2]" w:date="2025-09-11T15:04:00Z">
         <w:r>
-          <w:rPr>
-            <w:b/>
-            <w:bCs/>
-          </w:rPr>
           <w:t>or the WHC-managed cloud infrastructure</w:t>
         </w:r>
       </w:ins>
       <w:r>
-        <w:rPr>
-          <w:b/>
-          <w:bCs/>
-        </w:rPr>
         <w:t>,</w:t>
       </w:r>
-      <w:ins w:id="177" w:author="Craig Parker [2]" w:date="2025-09-11T15:04:00Z" w16du:dateUtc="2025-09-11T13:04:00Z">
+      <w:ins w:id="173" w:author="Craig Parker [2]" w:date="2025-09-11T15:04:00Z">
         <w:r>
-          <w:rPr>
-            <w:b/>
-            <w:bCs/>
-          </w:rPr>
-          <w:t xml:space="preserve"> </w:t>
+          <w:t xml:space="preserve"> any data identified as containing Personal Identifiers or specified by the DTA is encrypted for storage using</w:t>
         </w:r>
-        <w:r>
-          <w:t>any data identified as containing Personal Identifiers or specified by the DTA is encrypted for storage using</w:t>
-        </w:r>
-        <w:del w:id="178" w:author="Craig Parker" w:date="2025-08-05T12:02:00Z">
+        <w:del w:id="174" w:author="Craig Parker" w:date="2025-08-05T12:02:00Z">
           <w:r>
-            <w:delText xml:space="preserve"> </w:delText>
-          </w:r>
-          <w:r>
-            <w:rPr>
-              <w:b/>
-              <w:bCs/>
-            </w:rPr>
-            <w:delText>[TRACKED CHANGE] AES-256 encryption standard for both UCT servers and cloud storage</w:delText>
+            <w:delText xml:space="preserve"> [TRACKED CHANGE] AES-256 encryption standard for both UCT servers and cloud storage</w:delText>
           </w:r>
         </w:del>
         <w:r>
-          <w:rPr>
-            <w:b/>
-            <w:bCs/>
-          </w:rPr>
           <w:t xml:space="preserve"> </w:t>
         </w:r>
       </w:ins>
       <w:r>
-        <w:t xml:space="preserve">the </w:t>
-      </w:r>
-      <w:r>
-        <w:t xml:space="preserve">AES-256 encryption standard for both UCT servers and cloud storage. Encryption key access is restricted to </w:t>
+        <w:t xml:space="preserve">the AES-256 encryption standard for both UCT servers and cloud storage. Encryption key access is restricted to </w:t>
       </w:r>
       <w:proofErr w:type="spellStart"/>
       <w:r>
@@ -12590,26 +12560,20 @@
       </w:r>
       <w:proofErr w:type="spellEnd"/>
       <w:r>
-        <w:t xml:space="preserve"> personnel, ensuring data security and preventing re-identification attempts</w:t>
-      </w:r>
-      <w:r>
-        <w:t xml:space="preserve">. </w:t>
-      </w:r>
-      <w:r>
-        <w:t>This complies with privacy and data protection legislation, including the Protection of Personal Information Act (POPIA). Metadata, however, is stored separately to facilitate indexing and software development whilst maintaining security.</w:t>
+        <w:t xml:space="preserve"> personnel, ensuring data security and preventing re-identification attempts. This complies with privacy and data protection legislation, including the Protection of Personal Information Act (POPIA). Metadata, however, is stored separately to facilitate indexing and software development whilst maintaining security.</w:t>
       </w:r>
     </w:p>
     <w:p>
       <w:pPr>
         <w:pStyle w:val="Heading3"/>
       </w:pPr>
-      <w:bookmarkStart w:id="179" w:name="_Toc206760704"/>
-      <w:bookmarkStart w:id="180" w:name="network-security"/>
-      <w:bookmarkEnd w:id="174"/>
+      <w:bookmarkStart w:id="175" w:name="_Toc206760704"/>
+      <w:bookmarkStart w:id="176" w:name="network-security"/>
+      <w:bookmarkEnd w:id="170"/>
       <w:r>
         <w:t>14.2. Network security</w:t>
       </w:r>
-      <w:bookmarkEnd w:id="179"/>
+      <w:bookmarkEnd w:id="175"/>
     </w:p>
     <w:p>
       <w:pPr>
@@ -12618,7 +12582,7 @@
       <w:r>
         <w:t>The CSAG compute infrastructure benefits from UCT’s comprehensive security policies</w:t>
       </w:r>
-      <w:del w:id="181" w:author="Craig Parker" w:date="2025-08-05T12:03:00Z">
+      <w:del w:id="177" w:author="Craig Parker" w:date="2025-08-05T12:03:00Z">
         <w:r>
           <w:delText xml:space="preserve"> </w:delText>
         </w:r>
@@ -12630,7 +12594,7 @@
           <w:delText>[TRACKED CHANGE] and WHC-managed cloud security architecture with 24/7 Security Operations Centre (SOC) monitoring and advanced threat detection systems for improved security posture and compliance</w:delText>
         </w:r>
       </w:del>
-      <w:ins w:id="182" w:author="Lisa van Aardenne" w:date="2025-08-25T18:08:00Z">
+      <w:ins w:id="178" w:author="Lisa van Aardenne" w:date="2025-08-25T18:08:00Z">
         <w:r>
           <w:rPr>
             <w:b/>
@@ -12639,7 +12603,7 @@
           <w:t>,</w:t>
         </w:r>
       </w:ins>
-      <w:ins w:id="183" w:author="Craig Parker" w:date="2025-08-22T12:41:00Z">
+      <w:ins w:id="179" w:author="Craig Parker" w:date="2025-08-22T12:41:00Z">
         <w:r>
           <w:rPr>
             <w:rFonts w:ascii="Arial" w:hAnsi="Arial" w:cs="Arial"/>
@@ -12650,7 +12614,7 @@
           <w:t> </w:t>
         </w:r>
       </w:ins>
-      <w:ins w:id="184" w:author="Craig Parker [2]" w:date="2025-09-11T15:05:00Z" w16du:dateUtc="2025-09-11T13:05:00Z">
+      <w:ins w:id="180" w:author="Craig Parker [2]" w:date="2025-09-11T15:05:00Z" w16du:dateUtc="2025-09-11T13:05:00Z">
         <w:r>
           <w:rPr>
             <w:rStyle w:val="addition"/>
@@ -12658,7 +12622,7 @@
             <w:b/>
             <w:bCs/>
             <w:color w:val="FF0000"/>
-            <w:rPrChange w:id="185" w:author="Craig Parker" w:date="2025-08-22T12:42:00Z">
+            <w:rPrChange w:id="181" w:author="Craig Parker" w:date="2025-08-22T12:42:00Z">
               <w:rPr>
                 <w:rStyle w:val="addition"/>
                 <w:rFonts w:ascii="Arial" w:hAnsi="Arial" w:cs="Arial"/>
@@ -12689,7 +12653,7 @@
             <w:b/>
             <w:bCs/>
             <w:color w:val="FF0000"/>
-            <w:rPrChange w:id="186" w:author="Craig Parker" w:date="2025-08-22T12:42:00Z">
+            <w:rPrChange w:id="182" w:author="Craig Parker" w:date="2025-08-22T12:42:00Z">
               <w:rPr>
                 <w:rStyle w:val="addition"/>
                 <w:rFonts w:ascii="Arial" w:hAnsi="Arial" w:cs="Arial"/>
@@ -12709,7 +12673,7 @@
             <w:b/>
             <w:bCs/>
             <w:color w:val="FF0000"/>
-            <w:rPrChange w:id="187" w:author="Craig Parker" w:date="2025-08-22T12:42:00Z">
+            <w:rPrChange w:id="183" w:author="Craig Parker" w:date="2025-08-22T12:42:00Z">
               <w:rPr>
                 <w:rFonts w:ascii="Arial" w:hAnsi="Arial" w:cs="Arial"/>
                 <w:b/>
@@ -12722,7 +12686,7 @@
           </w:rPr>
           <w:t> and during the transition period from WHC-managed cloud security architecture with 24/7 Security Operations Centre (SOC) monitoring and advanced threat detection systems for improved security posture and compliance.</w:t>
         </w:r>
-        <w:del w:id="188" w:author="Craig Parker" w:date="2025-08-22T12:41:00Z">
+        <w:del w:id="184" w:author="Craig Parker" w:date="2025-08-22T12:41:00Z">
           <w:r>
             <w:delText>.</w:delText>
           </w:r>
@@ -12752,7 +12716,7 @@
       <w:r>
         <w:t xml:space="preserve">: UCT’s Cisco firewall </w:t>
       </w:r>
-      <w:del w:id="189" w:author="Craig Parker" w:date="2025-08-22T12:42:00Z" w16du:dateUtc="2025-08-22T10:42:00Z">
+      <w:del w:id="185" w:author="Craig Parker" w:date="2025-08-22T12:42:00Z" w16du:dateUtc="2025-08-22T10:42:00Z">
         <w:r>
           <w:rPr>
             <w:b/>
@@ -12761,7 +12725,7 @@
           <w:delText>[TRACKED CHANGE] and cloud-native firewall services</w:delText>
         </w:r>
       </w:del>
-      <w:ins w:id="190" w:author="Craig Parker" w:date="2025-08-22T12:42:00Z" w16du:dateUtc="2025-08-22T10:42:00Z">
+      <w:ins w:id="186" w:author="Craig Parker" w:date="2025-08-22T12:42:00Z" w16du:dateUtc="2025-08-22T10:42:00Z">
         <w:r>
           <w:rPr>
             <w:b/>
@@ -12833,9 +12797,9 @@
       <w:pPr>
         <w:pStyle w:val="Heading3"/>
       </w:pPr>
-      <w:bookmarkStart w:id="191" w:name="_Toc206760705"/>
-      <w:bookmarkStart w:id="192" w:name="local-authentication-and-authorisation"/>
-      <w:bookmarkEnd w:id="180"/>
+      <w:bookmarkStart w:id="187" w:name="_Toc206760705"/>
+      <w:bookmarkStart w:id="188" w:name="local-authentication-and-authorisation"/>
+      <w:bookmarkEnd w:id="176"/>
       <w:r>
         <w:t xml:space="preserve">14.3. Local authentication and </w:t>
       </w:r>
@@ -12843,7 +12807,7 @@
       <w:r>
         <w:t>authorisation</w:t>
       </w:r>
-      <w:bookmarkEnd w:id="191"/>
+      <w:bookmarkEnd w:id="187"/>
       <w:proofErr w:type="spellEnd"/>
     </w:p>
     <w:p>
@@ -12861,7 +12825,7 @@
       <w:r>
         <w:t xml:space="preserve"> protocols </w:t>
       </w:r>
-      <w:del w:id="193" w:author="Craig Parker" w:date="2025-08-05T12:03:00Z" w16du:dateUtc="2025-08-05T10:03:00Z">
+      <w:del w:id="189" w:author="Craig Parker" w:date="2025-08-05T12:03:00Z" w16du:dateUtc="2025-08-05T10:03:00Z">
         <w:r>
           <w:rPr>
             <w:b/>
@@ -12873,7 +12837,7 @@
           <w:delText xml:space="preserve">. </w:delText>
         </w:r>
       </w:del>
-      <w:del w:id="194" w:author="Craig Parker" w:date="2025-08-22T12:43:00Z" w16du:dateUtc="2025-08-22T10:43:00Z">
+      <w:del w:id="190" w:author="Craig Parker" w:date="2025-08-22T12:43:00Z" w16du:dateUtc="2025-08-22T10:43:00Z">
         <w:r>
           <w:rPr>
             <w:b/>
@@ -12896,7 +12860,7 @@
           <w:delText xml:space="preserve"> </w:delText>
         </w:r>
       </w:del>
-      <w:ins w:id="195" w:author="Craig Parker" w:date="2025-08-22T12:43:00Z" w16du:dateUtc="2025-08-22T10:43:00Z">
+      <w:ins w:id="191" w:author="Craig Parker" w:date="2025-08-22T12:43:00Z" w16du:dateUtc="2025-08-22T10:43:00Z">
         <w:r>
           <w:rPr>
             <w:b/>
@@ -12936,13 +12900,18 @@
       </w:r>
     </w:p>
     <w:p>
-      <w:del w:id="196" w:author="Craig Parker" w:date="2025-08-05T12:16:00Z" w16du:dateUtc="2025-08-05T10:16:00Z">
+      <w:del w:id="192" w:author="Craig Parker" w:date="2025-08-05T12:16:00Z" w16du:dateUtc="2025-08-05T10:16:00Z">
+        <w:r>
+          <w:rPr>
+            <w:noProof/>
+          </w:rPr>
+        </w:r>
         <w:r>
           <w:rPr>
             <w:noProof/>
           </w:rPr>
           <w:pict w14:anchorId="5C7CEA93">
-            <v:rect id="_x0000_i1025" alt="" style="width:468pt;height:.05pt;mso-width-percent:0;mso-height-percent:0;mso-width-percent:0;mso-height-percent:0" o:hralign="center" o:hrstd="t" o:hr="t"/>
+            <v:rect id="_x0000_i1031" alt="" style="width:468pt;height:.05pt;mso-width-percent:0;mso-height-percent:0;mso-width-percent:0;mso-height-percent:0" o:hralign="center" o:hrstd="t" o:hr="t"/>
           </w:pict>
         </w:r>
       </w:del>
@@ -12950,24 +12919,24 @@
     <w:p>
       <w:pPr>
         <w:rPr>
-          <w:ins w:id="197" w:author="Craig Parker [2]" w:date="2025-09-11T15:07:00Z" w16du:dateUtc="2025-09-11T13:07:00Z"/>
-        </w:rPr>
-        <w:pPrChange w:id="198" w:author="Craig Parker" w:date="2025-08-22T12:44:00Z" w16du:dateUtc="2025-08-22T10:44:00Z">
+          <w:ins w:id="193" w:author="Craig Parker [2]" w:date="2025-09-11T15:07:00Z" w16du:dateUtc="2025-09-11T13:07:00Z"/>
+        </w:rPr>
+        <w:pPrChange w:id="194" w:author="Craig Parker" w:date="2025-08-22T12:44:00Z" w16du:dateUtc="2025-08-22T10:44:00Z">
           <w:pPr>
             <w:pStyle w:val="Heading2"/>
           </w:pPr>
         </w:pPrChange>
       </w:pPr>
-      <w:bookmarkStart w:id="199" w:name="roles-and-responsibilities"/>
-      <w:bookmarkEnd w:id="171"/>
-      <w:bookmarkEnd w:id="192"/>
-      <w:ins w:id="200" w:author="Craig Parker [2]" w:date="2025-09-11T15:07:00Z" w16du:dateUtc="2025-09-11T13:07:00Z">
+      <w:bookmarkStart w:id="195" w:name="roles-and-responsibilities"/>
+      <w:bookmarkEnd w:id="167"/>
+      <w:bookmarkEnd w:id="188"/>
+      <w:ins w:id="196" w:author="Craig Parker [2]" w:date="2025-09-11T15:07:00Z" w16du:dateUtc="2025-09-11T13:07:00Z">
         <w:r>
           <w:t>From the start of Year 5,</w:t>
         </w:r>
         <w:r>
           <w:rPr>
-            <w:rPrChange w:id="201" w:author="Craig Parker" w:date="2025-08-22T12:44:00Z">
+            <w:rPrChange w:id="197" w:author="Craig Parker" w:date="2025-08-22T12:44:00Z">
               <w:rPr>
                 <w:b/>
                 <w:bCs/>
@@ -12975,6 +12944,43 @@
             </w:rPrChange>
           </w:rPr>
           <w:t xml:space="preserve"> enhanced cloud security measures include:</w:t>
+        </w:r>
+      </w:ins>
+    </w:p>
+    <w:p>
+      <w:pPr>
+        <w:pStyle w:val="ListParagraph"/>
+        <w:numPr>
+          <w:ilvl w:val="0"/>
+          <w:numId w:val="27"/>
+        </w:numPr>
+        <w:rPr>
+          <w:ins w:id="198" w:author="Craig Parker [2]" w:date="2025-09-11T15:07:00Z" w16du:dateUtc="2025-09-11T13:07:00Z"/>
+        </w:rPr>
+        <w:pPrChange w:id="199" w:author="Craig Parker" w:date="2025-08-22T12:44:00Z" w16du:dateUtc="2025-08-22T10:44:00Z">
+          <w:pPr>
+            <w:pStyle w:val="Heading2"/>
+            <w:numPr>
+              <w:numId w:val="26"/>
+            </w:numPr>
+            <w:tabs>
+              <w:tab w:val="num" w:pos="720"/>
+            </w:tabs>
+            <w:ind w:left="720" w:hanging="360"/>
+          </w:pPr>
+        </w:pPrChange>
+      </w:pPr>
+      <w:ins w:id="200" w:author="Craig Parker [2]" w:date="2025-09-11T15:07:00Z" w16du:dateUtc="2025-09-11T13:07:00Z">
+        <w:r>
+          <w:rPr>
+            <w:rPrChange w:id="201" w:author="Craig Parker" w:date="2025-08-22T12:44:00Z" w16du:dateUtc="2025-08-22T10:44:00Z">
+              <w:rPr>
+                <w:b/>
+                <w:bCs/>
+              </w:rPr>
+            </w:rPrChange>
+          </w:rPr>
+          <w:t>AES-256 Encryption: All data at rest and in transit</w:t>
         </w:r>
       </w:ins>
     </w:p>
@@ -13011,7 +13017,7 @@
               </w:rPr>
             </w:rPrChange>
           </w:rPr>
-          <w:t>AES-256 Encryption: All data at rest and in transit</w:t>
+          <w:t>24/7 SOC Monitoring: Continuous security monitoring and threat detection</w:t>
         </w:r>
       </w:ins>
     </w:p>
@@ -13048,7 +13054,7 @@
               </w:rPr>
             </w:rPrChange>
           </w:rPr>
-          <w:t>24/7 SOC Monitoring: Continuous security monitoring and threat detection</w:t>
+          <w:t>Role-based Access Controls: Multi-factor authentication and granular permissions</w:t>
         </w:r>
       </w:ins>
     </w:p>
@@ -13085,7 +13091,7 @@
               </w:rPr>
             </w:rPrChange>
           </w:rPr>
-          <w:t>Role-based Access Controls: Multi-factor authentication and granular permissions</w:t>
+          <w:t>Automated Backup Systems: Enhanced disaster recovery capabilities</w:t>
         </w:r>
       </w:ins>
     </w:p>
@@ -13122,43 +13128,6 @@
               </w:rPr>
             </w:rPrChange>
           </w:rPr>
-          <w:t>Automated Backup Systems: Enhanced disaster recovery capabilities</w:t>
-        </w:r>
-      </w:ins>
-    </w:p>
-    <w:p>
-      <w:pPr>
-        <w:pStyle w:val="ListParagraph"/>
-        <w:numPr>
-          <w:ilvl w:val="0"/>
-          <w:numId w:val="27"/>
-        </w:numPr>
-        <w:rPr>
-          <w:ins w:id="218" w:author="Craig Parker [2]" w:date="2025-09-11T15:07:00Z" w16du:dateUtc="2025-09-11T13:07:00Z"/>
-        </w:rPr>
-        <w:pPrChange w:id="219" w:author="Craig Parker" w:date="2025-08-22T12:44:00Z" w16du:dateUtc="2025-08-22T10:44:00Z">
-          <w:pPr>
-            <w:pStyle w:val="Heading2"/>
-            <w:numPr>
-              <w:numId w:val="26"/>
-            </w:numPr>
-            <w:tabs>
-              <w:tab w:val="num" w:pos="720"/>
-            </w:tabs>
-            <w:ind w:left="720" w:hanging="360"/>
-          </w:pPr>
-        </w:pPrChange>
-      </w:pPr>
-      <w:ins w:id="220" w:author="Craig Parker [2]" w:date="2025-09-11T15:07:00Z" w16du:dateUtc="2025-09-11T13:07:00Z">
-        <w:r>
-          <w:rPr>
-            <w:rPrChange w:id="221" w:author="Craig Parker" w:date="2025-08-22T12:44:00Z" w16du:dateUtc="2025-08-22T10:44:00Z">
-              <w:rPr>
-                <w:b/>
-                <w:bCs/>
-              </w:rPr>
-            </w:rPrChange>
-          </w:rPr>
           <w:t>Compliance Monitoring: Automated reporting for regulatory compliance</w:t>
         </w:r>
       </w:ins>
@@ -13180,7 +13149,7 @@
       <w:pPr>
         <w:pStyle w:val="Heading2"/>
       </w:pPr>
-      <w:bookmarkStart w:id="222" w:name="_Toc206760706"/>
+      <w:bookmarkStart w:id="218" w:name="_Toc206760706"/>
       <w:r>
         <w:lastRenderedPageBreak/>
         <w:t>15. Roles and responsibilitie</w:t>
@@ -13188,7 +13157,7 @@
       <w:r>
         <w:t>s</w:t>
       </w:r>
-      <w:bookmarkEnd w:id="222"/>
+      <w:bookmarkEnd w:id="218"/>
     </w:p>
     <w:p>
       <w:r>
@@ -13242,8 +13211,8 @@
                 <w:color w:val="000000"/>
               </w:rPr>
             </w:pPr>
-            <w:bookmarkStart w:id="223" w:name="X2878d8c0a61e4de906e8d0ce3fe7a9adc3709f9"/>
-            <w:bookmarkEnd w:id="199"/>
+            <w:bookmarkStart w:id="219" w:name="X2878d8c0a61e4de906e8d0ce3fe7a9adc3709f9"/>
+            <w:bookmarkEnd w:id="195"/>
             <w:r>
               <w:rPr>
                 <w:rFonts w:ascii="Arial" w:eastAsia="Times New Roman" w:hAnsi="Arial" w:cs="Arial"/>
@@ -13400,8 +13369,8 @@
                 <w:color w:val="000000"/>
               </w:rPr>
             </w:pPr>
-            <w:commentRangeStart w:id="224"/>
-            <w:commentRangeStart w:id="225"/>
+            <w:commentRangeStart w:id="220"/>
+            <w:commentRangeStart w:id="221"/>
             <w:r>
               <w:rPr>
                 <w:rFonts w:ascii="Arial" w:eastAsia="Times New Roman" w:hAnsi="Arial" w:cs="Arial"/>
@@ -13409,19 +13378,19 @@
               </w:rPr>
               <w:t>UCT, IBM, WHC</w:t>
             </w:r>
-            <w:commentRangeEnd w:id="224"/>
+            <w:commentRangeEnd w:id="220"/>
             <w:r>
               <w:rPr>
                 <w:rStyle w:val="CommentReference"/>
               </w:rPr>
-              <w:commentReference w:id="224"/>
-            </w:r>
-            <w:commentRangeEnd w:id="225"/>
+              <w:commentReference w:id="220"/>
+            </w:r>
+            <w:commentRangeEnd w:id="221"/>
             <w:r>
               <w:rPr>
                 <w:rStyle w:val="CommentReference"/>
               </w:rPr>
-              <w:commentReference w:id="225"/>
+              <w:commentReference w:id="221"/>
             </w:r>
           </w:p>
         </w:tc>
@@ -13991,12 +13960,12 @@
       <w:pPr>
         <w:pStyle w:val="Heading2"/>
       </w:pPr>
-      <w:bookmarkStart w:id="226" w:name="_Toc206760707"/>
+      <w:bookmarkStart w:id="222" w:name="_Toc206760707"/>
       <w:r>
         <w:lastRenderedPageBreak/>
         <w:t>16. Assessment and revision of the Data Management Plan</w:t>
       </w:r>
-      <w:bookmarkEnd w:id="226"/>
+      <w:bookmarkEnd w:id="222"/>
     </w:p>
     <w:p>
       <w:pPr>
@@ -14018,12 +13987,12 @@
       <w:pPr>
         <w:pStyle w:val="Heading3"/>
       </w:pPr>
-      <w:bookmarkStart w:id="227" w:name="_Toc206760708"/>
-      <w:bookmarkStart w:id="228" w:name="assessment-scope"/>
+      <w:bookmarkStart w:id="223" w:name="_Toc206760708"/>
+      <w:bookmarkStart w:id="224" w:name="assessment-scope"/>
       <w:r>
         <w:t>16.1. Assessment scope</w:t>
       </w:r>
-      <w:bookmarkEnd w:id="227"/>
+      <w:bookmarkEnd w:id="223"/>
     </w:p>
     <w:p>
       <w:pPr>
@@ -14182,13 +14151,13 @@
       <w:pPr>
         <w:pStyle w:val="Heading3"/>
       </w:pPr>
-      <w:bookmarkStart w:id="229" w:name="_Toc206760709"/>
-      <w:bookmarkStart w:id="230" w:name="revision-process"/>
-      <w:bookmarkEnd w:id="228"/>
+      <w:bookmarkStart w:id="225" w:name="_Toc206760709"/>
+      <w:bookmarkStart w:id="226" w:name="revision-process"/>
+      <w:bookmarkEnd w:id="224"/>
       <w:r>
         <w:t>16.2. Revision process</w:t>
       </w:r>
-      <w:bookmarkEnd w:id="229"/>
+      <w:bookmarkEnd w:id="225"/>
     </w:p>
     <w:p>
       <w:pPr>
@@ -14269,7 +14238,7 @@
           <w:numId w:val="16"/>
         </w:numPr>
         <w:rPr>
-          <w:ins w:id="231" w:author="Craig Parker" w:date="2025-08-15T08:16:00Z" w16du:dateUtc="2025-08-15T08:16:34Z"/>
+          <w:ins w:id="227" w:author="Craig Parker" w:date="2025-08-15T08:16:00Z" w16du:dateUtc="2025-08-15T08:16:34Z"/>
         </w:rPr>
       </w:pPr>
       <w:r>
@@ -14284,11 +14253,11 @@
           <w:numId w:val="16"/>
         </w:numPr>
         <w:rPr>
-          <w:ins w:id="232" w:author="Craig Parker [2]" w:date="2025-09-11T15:08:00Z" w16du:dateUtc="2025-09-11T13:08:00Z"/>
+          <w:ins w:id="228" w:author="Craig Parker [2]" w:date="2025-09-11T15:08:00Z" w16du:dateUtc="2025-09-11T13:08:00Z"/>
           <w:rFonts w:ascii="Aptos" w:eastAsia="Aptos" w:hAnsi="Aptos"/>
         </w:rPr>
       </w:pPr>
-      <w:ins w:id="233" w:author="Craig Parker [2]" w:date="2025-09-11T15:08:00Z" w16du:dateUtc="2025-09-11T13:08:00Z">
+      <w:ins w:id="229" w:author="Craig Parker [2]" w:date="2025-09-11T15:08:00Z" w16du:dateUtc="2025-09-11T13:08:00Z">
         <w:r>
           <w:rPr>
             <w:rFonts w:ascii="Aptos" w:eastAsia="Aptos" w:hAnsi="Aptos"/>
@@ -14301,7 +14270,7 @@
       <w:pPr>
         <w:pStyle w:val="Compact"/>
         <w:ind w:left="720"/>
-        <w:pPrChange w:id="234" w:author="Craig Parker" w:date="2025-08-15T08:17:00Z">
+        <w:pPrChange w:id="230" w:author="Craig Parker" w:date="2025-08-15T08:17:00Z">
           <w:pPr>
             <w:pStyle w:val="Compact"/>
             <w:numPr>
@@ -14383,16 +14352,16 @@
           <w:cols w:space="720"/>
         </w:sectPr>
       </w:pPr>
-      <w:bookmarkStart w:id="235" w:name="cloud-migration-implementation"/>
-      <w:bookmarkEnd w:id="223"/>
-      <w:bookmarkEnd w:id="230"/>
-    </w:p>
-    <w:p>
-      <w:bookmarkStart w:id="236" w:name="migration-strategy"/>
-      <w:bookmarkStart w:id="237" w:name="technical-implementation"/>
-      <w:bookmarkStart w:id="238" w:name="risk-mitigation-and-quality-assurance"/>
-      <w:bookmarkEnd w:id="236"/>
-      <w:bookmarkEnd w:id="237"/>
+      <w:bookmarkStart w:id="231" w:name="cloud-migration-implementation"/>
+      <w:bookmarkEnd w:id="219"/>
+      <w:bookmarkEnd w:id="226"/>
+    </w:p>
+    <w:p>
+      <w:bookmarkStart w:id="232" w:name="migration-strategy"/>
+      <w:bookmarkStart w:id="233" w:name="technical-implementation"/>
+      <w:bookmarkStart w:id="234" w:name="risk-mitigation-and-quality-assurance"/>
+      <w:bookmarkEnd w:id="232"/>
+      <w:bookmarkEnd w:id="233"/>
     </w:p>
     <w:p>
       <w:pPr>
@@ -14406,42 +14375,42 @@
           <w:cols w:space="720"/>
         </w:sectPr>
       </w:pPr>
-      <w:bookmarkStart w:id="239" w:name="annexes"/>
-      <w:bookmarkEnd w:id="235"/>
-      <w:bookmarkEnd w:id="238"/>
+      <w:bookmarkStart w:id="235" w:name="annexes"/>
+      <w:bookmarkEnd w:id="231"/>
+      <w:bookmarkEnd w:id="234"/>
     </w:p>
     <w:p>
       <w:pPr>
         <w:pStyle w:val="Heading2"/>
       </w:pPr>
-      <w:bookmarkStart w:id="240" w:name="_Toc206760710"/>
+      <w:bookmarkStart w:id="236" w:name="_Toc206760710"/>
       <w:r>
         <w:lastRenderedPageBreak/>
         <w:t>Annexes</w:t>
       </w:r>
-      <w:bookmarkEnd w:id="240"/>
+      <w:bookmarkEnd w:id="236"/>
     </w:p>
     <w:p>
       <w:pPr>
         <w:pStyle w:val="Heading3"/>
         <w:rPr>
-          <w:ins w:id="241" w:author="Craig Parker [2]" w:date="2025-09-11T15:11:00Z" w16du:dateUtc="2025-09-11T13:11:00Z"/>
-        </w:rPr>
-      </w:pPr>
-      <w:bookmarkStart w:id="242" w:name="annex-1-key-data-sources"/>
-      <w:bookmarkStart w:id="243" w:name="_Toc206760711"/>
-      <w:ins w:id="244" w:author="Craig Parker [2]" w:date="2025-09-11T15:11:00Z" w16du:dateUtc="2025-09-11T13:11:00Z">
+          <w:ins w:id="237" w:author="Craig Parker [2]" w:date="2025-09-11T15:11:00Z" w16du:dateUtc="2025-09-11T13:11:00Z"/>
+        </w:rPr>
+      </w:pPr>
+      <w:bookmarkStart w:id="238" w:name="_Toc206760711"/>
+      <w:bookmarkStart w:id="239" w:name="annex-1-key-data-sources"/>
+      <w:ins w:id="240" w:author="Craig Parker [2]" w:date="2025-09-11T15:11:00Z" w16du:dateUtc="2025-09-11T13:11:00Z">
         <w:r>
           <w:t>Annex 1: Transition Implementation Details</w:t>
         </w:r>
-        <w:bookmarkEnd w:id="243"/>
+        <w:bookmarkEnd w:id="238"/>
       </w:ins>
     </w:p>
     <w:p>
       <w:pPr>
         <w:pStyle w:val="BodyText"/>
         <w:rPr>
-          <w:ins w:id="245" w:author="Craig Parker [2]" w:date="2025-09-11T15:11:00Z" w16du:dateUtc="2025-09-11T13:11:00Z"/>
+          <w:ins w:id="241" w:author="Craig Parker [2]" w:date="2025-09-11T15:11:00Z" w16du:dateUtc="2025-09-11T13:11:00Z"/>
         </w:rPr>
       </w:pPr>
     </w:p>
@@ -14449,14 +14418,14 @@
       <w:pPr>
         <w:spacing w:before="100" w:beforeAutospacing="1" w:after="100" w:afterAutospacing="1"/>
         <w:rPr>
-          <w:ins w:id="246" w:author="Craig Parker [2]" w:date="2025-09-11T15:11:00Z" w16du:dateUtc="2025-09-11T13:11:00Z"/>
+          <w:ins w:id="242" w:author="Craig Parker [2]" w:date="2025-09-11T15:11:00Z" w16du:dateUtc="2025-09-11T13:11:00Z"/>
           <w:rFonts w:ascii="Arial" w:eastAsia="Times New Roman" w:hAnsi="Arial" w:cs="Arial"/>
           <w:color w:val="000000"/>
           <w:sz w:val="27"/>
           <w:szCs w:val="27"/>
         </w:rPr>
       </w:pPr>
-      <w:ins w:id="247" w:author="Craig Parker [2]" w:date="2025-09-11T15:11:00Z" w16du:dateUtc="2025-09-11T13:11:00Z">
+      <w:ins w:id="243" w:author="Craig Parker [2]" w:date="2025-09-11T15:11:00Z" w16du:dateUtc="2025-09-11T13:11:00Z">
         <w:r>
           <w:rPr>
             <w:rFonts w:ascii="Arial" w:eastAsia="Times New Roman" w:hAnsi="Arial" w:cs="Arial"/>
@@ -14499,7 +14468,7 @@
         <w:spacing w:before="100" w:beforeAutospacing="1" w:after="100" w:afterAutospacing="1"/>
         <w:outlineLvl w:val="3"/>
         <w:rPr>
-          <w:ins w:id="248" w:author="Craig Parker [2]" w:date="2025-09-11T15:11:00Z" w16du:dateUtc="2025-09-11T13:11:00Z"/>
+          <w:ins w:id="244" w:author="Craig Parker [2]" w:date="2025-09-11T15:11:00Z" w16du:dateUtc="2025-09-11T13:11:00Z"/>
           <w:rFonts w:ascii="Arial" w:eastAsia="Times New Roman" w:hAnsi="Arial" w:cs="Arial"/>
           <w:b/>
           <w:bCs/>
@@ -14508,7 +14477,7 @@
           <w:szCs w:val="27"/>
         </w:rPr>
       </w:pPr>
-      <w:ins w:id="249" w:author="Craig Parker [2]" w:date="2025-09-11T15:11:00Z" w16du:dateUtc="2025-09-11T13:11:00Z">
+      <w:ins w:id="245" w:author="Craig Parker [2]" w:date="2025-09-11T15:11:00Z" w16du:dateUtc="2025-09-11T13:11:00Z">
         <w:r>
           <w:rPr>
             <w:rFonts w:ascii="Arial" w:eastAsia="Times New Roman" w:hAnsi="Arial" w:cs="Arial"/>
@@ -14526,14 +14495,14 @@
       <w:pPr>
         <w:spacing w:before="100" w:beforeAutospacing="1" w:after="100" w:afterAutospacing="1"/>
         <w:rPr>
-          <w:ins w:id="250" w:author="Craig Parker [2]" w:date="2025-09-11T15:11:00Z" w16du:dateUtc="2025-09-11T13:11:00Z"/>
+          <w:ins w:id="246" w:author="Craig Parker [2]" w:date="2025-09-11T15:11:00Z" w16du:dateUtc="2025-09-11T13:11:00Z"/>
           <w:rFonts w:ascii="Arial" w:eastAsia="Times New Roman" w:hAnsi="Arial" w:cs="Arial"/>
           <w:color w:val="000000"/>
           <w:sz w:val="27"/>
           <w:szCs w:val="27"/>
         </w:rPr>
       </w:pPr>
-      <w:ins w:id="251" w:author="Craig Parker [2]" w:date="2025-09-11T15:11:00Z" w16du:dateUtc="2025-09-11T13:11:00Z">
+      <w:ins w:id="247" w:author="Craig Parker [2]" w:date="2025-09-11T15:11:00Z" w16du:dateUtc="2025-09-11T13:11:00Z">
         <w:r>
           <w:rPr>
             <w:rFonts w:ascii="Arial" w:eastAsia="Times New Roman" w:hAnsi="Arial" w:cs="Arial"/>
@@ -14551,14 +14520,14 @@
       <w:pPr>
         <w:spacing w:before="100" w:beforeAutospacing="1" w:after="100" w:afterAutospacing="1"/>
         <w:rPr>
-          <w:ins w:id="252" w:author="Craig Parker [2]" w:date="2025-09-11T15:11:00Z" w16du:dateUtc="2025-09-11T13:11:00Z"/>
+          <w:ins w:id="248" w:author="Craig Parker [2]" w:date="2025-09-11T15:11:00Z" w16du:dateUtc="2025-09-11T13:11:00Z"/>
           <w:rFonts w:ascii="Arial" w:eastAsia="Times New Roman" w:hAnsi="Arial" w:cs="Arial"/>
           <w:color w:val="000000"/>
           <w:sz w:val="27"/>
           <w:szCs w:val="27"/>
         </w:rPr>
       </w:pPr>
-      <w:ins w:id="253" w:author="Craig Parker [2]" w:date="2025-09-11T15:11:00Z" w16du:dateUtc="2025-09-11T13:11:00Z">
+      <w:ins w:id="249" w:author="Craig Parker [2]" w:date="2025-09-11T15:11:00Z" w16du:dateUtc="2025-09-11T13:11:00Z">
         <w:r>
           <w:rPr>
             <w:rFonts w:ascii="Arial" w:eastAsia="Times New Roman" w:hAnsi="Arial" w:cs="Arial"/>
@@ -14580,14 +14549,14 @@
         </w:numPr>
         <w:spacing w:before="100" w:beforeAutospacing="1" w:after="100" w:afterAutospacing="1"/>
         <w:rPr>
-          <w:ins w:id="254" w:author="Craig Parker [2]" w:date="2025-09-11T15:11:00Z" w16du:dateUtc="2025-09-11T13:11:00Z"/>
+          <w:ins w:id="250" w:author="Craig Parker [2]" w:date="2025-09-11T15:11:00Z" w16du:dateUtc="2025-09-11T13:11:00Z"/>
           <w:rFonts w:ascii="Arial" w:eastAsia="Times New Roman" w:hAnsi="Arial" w:cs="Arial"/>
           <w:color w:val="000000"/>
           <w:sz w:val="27"/>
           <w:szCs w:val="27"/>
         </w:rPr>
       </w:pPr>
-      <w:ins w:id="255" w:author="Craig Parker [2]" w:date="2025-09-11T15:11:00Z" w16du:dateUtc="2025-09-11T13:11:00Z">
+      <w:ins w:id="251" w:author="Craig Parker [2]" w:date="2025-09-11T15:11:00Z" w16du:dateUtc="2025-09-11T13:11:00Z">
         <w:r>
           <w:rPr>
             <w:rFonts w:ascii="Arial" w:eastAsia="Times New Roman" w:hAnsi="Arial" w:cs="Arial"/>
@@ -14609,14 +14578,14 @@
         </w:numPr>
         <w:spacing w:before="100" w:beforeAutospacing="1" w:after="100" w:afterAutospacing="1"/>
         <w:rPr>
-          <w:ins w:id="256" w:author="Craig Parker [2]" w:date="2025-09-11T15:11:00Z" w16du:dateUtc="2025-09-11T13:11:00Z"/>
+          <w:ins w:id="252" w:author="Craig Parker [2]" w:date="2025-09-11T15:11:00Z" w16du:dateUtc="2025-09-11T13:11:00Z"/>
           <w:rFonts w:ascii="Arial" w:eastAsia="Times New Roman" w:hAnsi="Arial" w:cs="Arial"/>
           <w:color w:val="000000"/>
           <w:sz w:val="27"/>
           <w:szCs w:val="27"/>
         </w:rPr>
       </w:pPr>
-      <w:ins w:id="257" w:author="Craig Parker [2]" w:date="2025-09-11T15:11:00Z" w16du:dateUtc="2025-09-11T13:11:00Z">
+      <w:ins w:id="253" w:author="Craig Parker [2]" w:date="2025-09-11T15:11:00Z" w16du:dateUtc="2025-09-11T13:11:00Z">
         <w:r>
           <w:rPr>
             <w:rFonts w:ascii="Arial" w:eastAsia="Times New Roman" w:hAnsi="Arial" w:cs="Arial"/>
@@ -14638,14 +14607,14 @@
         </w:numPr>
         <w:spacing w:before="100" w:beforeAutospacing="1" w:after="100" w:afterAutospacing="1"/>
         <w:rPr>
-          <w:ins w:id="258" w:author="Craig Parker [2]" w:date="2025-09-11T15:11:00Z" w16du:dateUtc="2025-09-11T13:11:00Z"/>
+          <w:ins w:id="254" w:author="Craig Parker [2]" w:date="2025-09-11T15:11:00Z" w16du:dateUtc="2025-09-11T13:11:00Z"/>
           <w:rFonts w:ascii="Arial" w:eastAsia="Times New Roman" w:hAnsi="Arial" w:cs="Arial"/>
           <w:color w:val="000000"/>
           <w:sz w:val="27"/>
           <w:szCs w:val="27"/>
         </w:rPr>
       </w:pPr>
-      <w:ins w:id="259" w:author="Craig Parker [2]" w:date="2025-09-11T15:11:00Z" w16du:dateUtc="2025-09-11T13:11:00Z">
+      <w:ins w:id="255" w:author="Craig Parker [2]" w:date="2025-09-11T15:11:00Z" w16du:dateUtc="2025-09-11T13:11:00Z">
         <w:r>
           <w:rPr>
             <w:rFonts w:ascii="Arial" w:eastAsia="Times New Roman" w:hAnsi="Arial" w:cs="Arial"/>
@@ -14667,14 +14636,14 @@
         </w:numPr>
         <w:spacing w:before="100" w:beforeAutospacing="1" w:after="100" w:afterAutospacing="1"/>
         <w:rPr>
-          <w:ins w:id="260" w:author="Craig Parker [2]" w:date="2025-09-11T15:11:00Z" w16du:dateUtc="2025-09-11T13:11:00Z"/>
+          <w:ins w:id="256" w:author="Craig Parker [2]" w:date="2025-09-11T15:11:00Z" w16du:dateUtc="2025-09-11T13:11:00Z"/>
           <w:rFonts w:ascii="Arial" w:eastAsia="Times New Roman" w:hAnsi="Arial" w:cs="Arial"/>
           <w:color w:val="000000"/>
           <w:sz w:val="27"/>
           <w:szCs w:val="27"/>
         </w:rPr>
       </w:pPr>
-      <w:ins w:id="261" w:author="Craig Parker [2]" w:date="2025-09-11T15:11:00Z" w16du:dateUtc="2025-09-11T13:11:00Z">
+      <w:ins w:id="257" w:author="Craig Parker [2]" w:date="2025-09-11T15:11:00Z" w16du:dateUtc="2025-09-11T13:11:00Z">
         <w:r>
           <w:rPr>
             <w:rFonts w:ascii="Arial" w:eastAsia="Times New Roman" w:hAnsi="Arial" w:cs="Arial"/>
@@ -14692,14 +14661,14 @@
       <w:pPr>
         <w:spacing w:before="100" w:beforeAutospacing="1" w:after="100" w:afterAutospacing="1"/>
         <w:rPr>
-          <w:ins w:id="262" w:author="Craig Parker [2]" w:date="2025-09-11T15:11:00Z" w16du:dateUtc="2025-09-11T13:11:00Z"/>
+          <w:ins w:id="258" w:author="Craig Parker [2]" w:date="2025-09-11T15:11:00Z" w16du:dateUtc="2025-09-11T13:11:00Z"/>
           <w:rFonts w:ascii="Arial" w:eastAsia="Times New Roman" w:hAnsi="Arial" w:cs="Arial"/>
           <w:color w:val="000000"/>
           <w:sz w:val="27"/>
           <w:szCs w:val="27"/>
         </w:rPr>
       </w:pPr>
-      <w:ins w:id="263" w:author="Craig Parker [2]" w:date="2025-09-11T15:11:00Z" w16du:dateUtc="2025-09-11T13:11:00Z">
+      <w:ins w:id="259" w:author="Craig Parker [2]" w:date="2025-09-11T15:11:00Z" w16du:dateUtc="2025-09-11T13:11:00Z">
         <w:r>
           <w:rPr>
             <w:rFonts w:ascii="Arial" w:eastAsia="Times New Roman" w:hAnsi="Arial" w:cs="Arial"/>
@@ -14721,14 +14690,14 @@
         </w:numPr>
         <w:spacing w:before="100" w:beforeAutospacing="1" w:after="100" w:afterAutospacing="1"/>
         <w:rPr>
-          <w:ins w:id="264" w:author="Craig Parker [2]" w:date="2025-09-11T15:11:00Z" w16du:dateUtc="2025-09-11T13:11:00Z"/>
+          <w:ins w:id="260" w:author="Craig Parker [2]" w:date="2025-09-11T15:11:00Z" w16du:dateUtc="2025-09-11T13:11:00Z"/>
           <w:rFonts w:ascii="Arial" w:eastAsia="Times New Roman" w:hAnsi="Arial" w:cs="Arial"/>
           <w:color w:val="000000"/>
           <w:sz w:val="27"/>
           <w:szCs w:val="27"/>
         </w:rPr>
       </w:pPr>
-      <w:ins w:id="265" w:author="Craig Parker [2]" w:date="2025-09-11T15:11:00Z" w16du:dateUtc="2025-09-11T13:11:00Z">
+      <w:ins w:id="261" w:author="Craig Parker [2]" w:date="2025-09-11T15:11:00Z" w16du:dateUtc="2025-09-11T13:11:00Z">
         <w:r>
           <w:rPr>
             <w:rFonts w:ascii="Arial" w:eastAsia="Times New Roman" w:hAnsi="Arial" w:cs="Arial"/>
@@ -14750,14 +14719,14 @@
         </w:numPr>
         <w:spacing w:before="100" w:beforeAutospacing="1" w:after="100" w:afterAutospacing="1"/>
         <w:rPr>
-          <w:ins w:id="266" w:author="Craig Parker [2]" w:date="2025-09-11T15:11:00Z" w16du:dateUtc="2025-09-11T13:11:00Z"/>
+          <w:ins w:id="262" w:author="Craig Parker [2]" w:date="2025-09-11T15:11:00Z" w16du:dateUtc="2025-09-11T13:11:00Z"/>
           <w:rFonts w:ascii="Arial" w:eastAsia="Times New Roman" w:hAnsi="Arial" w:cs="Arial"/>
           <w:color w:val="000000"/>
           <w:sz w:val="27"/>
           <w:szCs w:val="27"/>
         </w:rPr>
       </w:pPr>
-      <w:ins w:id="267" w:author="Craig Parker [2]" w:date="2025-09-11T15:11:00Z" w16du:dateUtc="2025-09-11T13:11:00Z">
+      <w:ins w:id="263" w:author="Craig Parker [2]" w:date="2025-09-11T15:11:00Z" w16du:dateUtc="2025-09-11T13:11:00Z">
         <w:r>
           <w:rPr>
             <w:rFonts w:ascii="Arial" w:eastAsia="Times New Roman" w:hAnsi="Arial" w:cs="Arial"/>
@@ -14792,14 +14761,14 @@
         </w:numPr>
         <w:spacing w:before="100" w:beforeAutospacing="1" w:after="100" w:afterAutospacing="1"/>
         <w:rPr>
-          <w:ins w:id="268" w:author="Craig Parker [2]" w:date="2025-09-11T15:11:00Z" w16du:dateUtc="2025-09-11T13:11:00Z"/>
+          <w:ins w:id="264" w:author="Craig Parker [2]" w:date="2025-09-11T15:11:00Z" w16du:dateUtc="2025-09-11T13:11:00Z"/>
           <w:rFonts w:ascii="Arial" w:eastAsia="Times New Roman" w:hAnsi="Arial" w:cs="Arial"/>
           <w:color w:val="000000"/>
           <w:sz w:val="27"/>
           <w:szCs w:val="27"/>
         </w:rPr>
       </w:pPr>
-      <w:ins w:id="269" w:author="Craig Parker [2]" w:date="2025-09-11T15:11:00Z" w16du:dateUtc="2025-09-11T13:11:00Z">
+      <w:ins w:id="265" w:author="Craig Parker [2]" w:date="2025-09-11T15:11:00Z" w16du:dateUtc="2025-09-11T13:11:00Z">
         <w:r>
           <w:rPr>
             <w:rFonts w:ascii="Arial" w:eastAsia="Times New Roman" w:hAnsi="Arial" w:cs="Arial"/>
@@ -14821,14 +14790,14 @@
         </w:numPr>
         <w:spacing w:before="100" w:beforeAutospacing="1" w:after="100" w:afterAutospacing="1"/>
         <w:rPr>
-          <w:ins w:id="270" w:author="Craig Parker [2]" w:date="2025-09-11T15:11:00Z" w16du:dateUtc="2025-09-11T13:11:00Z"/>
+          <w:ins w:id="266" w:author="Craig Parker [2]" w:date="2025-09-11T15:11:00Z" w16du:dateUtc="2025-09-11T13:11:00Z"/>
           <w:rFonts w:ascii="Arial" w:eastAsia="Times New Roman" w:hAnsi="Arial" w:cs="Arial"/>
           <w:color w:val="000000"/>
           <w:sz w:val="27"/>
           <w:szCs w:val="27"/>
         </w:rPr>
       </w:pPr>
-      <w:ins w:id="271" w:author="Craig Parker [2]" w:date="2025-09-11T15:11:00Z" w16du:dateUtc="2025-09-11T13:11:00Z">
+      <w:ins w:id="267" w:author="Craig Parker [2]" w:date="2025-09-11T15:11:00Z" w16du:dateUtc="2025-09-11T13:11:00Z">
         <w:r>
           <w:rPr>
             <w:rFonts w:ascii="Arial" w:eastAsia="Times New Roman" w:hAnsi="Arial" w:cs="Arial"/>
@@ -14846,14 +14815,14 @@
       <w:pPr>
         <w:spacing w:before="100" w:beforeAutospacing="1" w:after="100" w:afterAutospacing="1"/>
         <w:rPr>
-          <w:ins w:id="272" w:author="Craig Parker [2]" w:date="2025-09-11T15:11:00Z" w16du:dateUtc="2025-09-11T13:11:00Z"/>
+          <w:ins w:id="268" w:author="Craig Parker [2]" w:date="2025-09-11T15:11:00Z" w16du:dateUtc="2025-09-11T13:11:00Z"/>
           <w:rFonts w:ascii="Arial" w:eastAsia="Times New Roman" w:hAnsi="Arial" w:cs="Arial"/>
           <w:color w:val="000000"/>
           <w:sz w:val="27"/>
           <w:szCs w:val="27"/>
         </w:rPr>
       </w:pPr>
-      <w:ins w:id="273" w:author="Craig Parker [2]" w:date="2025-09-11T15:11:00Z" w16du:dateUtc="2025-09-11T13:11:00Z">
+      <w:ins w:id="269" w:author="Craig Parker [2]" w:date="2025-09-11T15:11:00Z" w16du:dateUtc="2025-09-11T13:11:00Z">
         <w:r>
           <w:rPr>
             <w:rFonts w:ascii="Arial" w:eastAsia="Times New Roman" w:hAnsi="Arial" w:cs="Arial"/>
@@ -14875,14 +14844,14 @@
         </w:numPr>
         <w:spacing w:before="100" w:beforeAutospacing="1" w:after="100" w:afterAutospacing="1"/>
         <w:rPr>
-          <w:ins w:id="274" w:author="Craig Parker [2]" w:date="2025-09-11T15:11:00Z" w16du:dateUtc="2025-09-11T13:11:00Z"/>
+          <w:ins w:id="270" w:author="Craig Parker [2]" w:date="2025-09-11T15:11:00Z" w16du:dateUtc="2025-09-11T13:11:00Z"/>
           <w:rFonts w:ascii="Arial" w:eastAsia="Times New Roman" w:hAnsi="Arial" w:cs="Arial"/>
           <w:color w:val="000000"/>
           <w:sz w:val="27"/>
           <w:szCs w:val="27"/>
         </w:rPr>
       </w:pPr>
-      <w:ins w:id="275" w:author="Craig Parker [2]" w:date="2025-09-11T15:11:00Z" w16du:dateUtc="2025-09-11T13:11:00Z">
+      <w:ins w:id="271" w:author="Craig Parker [2]" w:date="2025-09-11T15:11:00Z" w16du:dateUtc="2025-09-11T13:11:00Z">
         <w:r>
           <w:rPr>
             <w:rFonts w:ascii="Arial" w:eastAsia="Times New Roman" w:hAnsi="Arial" w:cs="Arial"/>
@@ -14916,14 +14885,14 @@
         </w:numPr>
         <w:spacing w:before="100" w:beforeAutospacing="1" w:after="100" w:afterAutospacing="1"/>
         <w:rPr>
-          <w:ins w:id="276" w:author="Craig Parker [2]" w:date="2025-09-11T15:11:00Z" w16du:dateUtc="2025-09-11T13:11:00Z"/>
+          <w:ins w:id="272" w:author="Craig Parker [2]" w:date="2025-09-11T15:11:00Z" w16du:dateUtc="2025-09-11T13:11:00Z"/>
           <w:rFonts w:ascii="Arial" w:eastAsia="Times New Roman" w:hAnsi="Arial" w:cs="Arial"/>
           <w:color w:val="000000"/>
           <w:sz w:val="27"/>
           <w:szCs w:val="27"/>
         </w:rPr>
       </w:pPr>
-      <w:ins w:id="277" w:author="Craig Parker [2]" w:date="2025-09-11T15:11:00Z" w16du:dateUtc="2025-09-11T13:11:00Z">
+      <w:ins w:id="273" w:author="Craig Parker [2]" w:date="2025-09-11T15:11:00Z" w16du:dateUtc="2025-09-11T13:11:00Z">
         <w:r>
           <w:rPr>
             <w:rFonts w:ascii="Arial" w:eastAsia="Times New Roman" w:hAnsi="Arial" w:cs="Arial"/>
@@ -14945,14 +14914,14 @@
         </w:numPr>
         <w:spacing w:before="100" w:beforeAutospacing="1" w:after="100" w:afterAutospacing="1"/>
         <w:rPr>
-          <w:ins w:id="278" w:author="Craig Parker [2]" w:date="2025-09-11T15:11:00Z" w16du:dateUtc="2025-09-11T13:11:00Z"/>
+          <w:ins w:id="274" w:author="Craig Parker [2]" w:date="2025-09-11T15:11:00Z" w16du:dateUtc="2025-09-11T13:11:00Z"/>
           <w:rFonts w:ascii="Arial" w:eastAsia="Times New Roman" w:hAnsi="Arial" w:cs="Arial"/>
           <w:color w:val="000000"/>
           <w:sz w:val="27"/>
           <w:szCs w:val="27"/>
         </w:rPr>
       </w:pPr>
-      <w:ins w:id="279" w:author="Craig Parker [2]" w:date="2025-09-11T15:11:00Z" w16du:dateUtc="2025-09-11T13:11:00Z">
+      <w:ins w:id="275" w:author="Craig Parker [2]" w:date="2025-09-11T15:11:00Z" w16du:dateUtc="2025-09-11T13:11:00Z">
         <w:r>
           <w:rPr>
             <w:rFonts w:ascii="Arial" w:eastAsia="Times New Roman" w:hAnsi="Arial" w:cs="Arial"/>
@@ -14974,14 +14943,14 @@
         </w:numPr>
         <w:spacing w:before="100" w:beforeAutospacing="1" w:after="100" w:afterAutospacing="1"/>
         <w:rPr>
-          <w:ins w:id="280" w:author="Craig Parker [2]" w:date="2025-09-11T15:11:00Z" w16du:dateUtc="2025-09-11T13:11:00Z"/>
+          <w:ins w:id="276" w:author="Craig Parker [2]" w:date="2025-09-11T15:11:00Z" w16du:dateUtc="2025-09-11T13:11:00Z"/>
           <w:rFonts w:ascii="Arial" w:eastAsia="Times New Roman" w:hAnsi="Arial" w:cs="Arial"/>
           <w:color w:val="000000"/>
           <w:sz w:val="27"/>
           <w:szCs w:val="27"/>
         </w:rPr>
       </w:pPr>
-      <w:ins w:id="281" w:author="Craig Parker [2]" w:date="2025-09-11T15:11:00Z" w16du:dateUtc="2025-09-11T13:11:00Z">
+      <w:ins w:id="277" w:author="Craig Parker [2]" w:date="2025-09-11T15:11:00Z" w16du:dateUtc="2025-09-11T13:11:00Z">
         <w:r>
           <w:rPr>
             <w:rFonts w:ascii="Arial" w:eastAsia="Times New Roman" w:hAnsi="Arial" w:cs="Arial"/>
@@ -14999,14 +14968,14 @@
       <w:pPr>
         <w:spacing w:before="100" w:beforeAutospacing="1" w:after="100" w:afterAutospacing="1"/>
         <w:rPr>
-          <w:ins w:id="282" w:author="Craig Parker [2]" w:date="2025-09-11T15:11:00Z" w16du:dateUtc="2025-09-11T13:11:00Z"/>
+          <w:ins w:id="278" w:author="Craig Parker [2]" w:date="2025-09-11T15:11:00Z" w16du:dateUtc="2025-09-11T13:11:00Z"/>
           <w:rFonts w:ascii="Arial" w:eastAsia="Times New Roman" w:hAnsi="Arial" w:cs="Arial"/>
           <w:color w:val="000000"/>
           <w:sz w:val="27"/>
           <w:szCs w:val="27"/>
         </w:rPr>
       </w:pPr>
-      <w:ins w:id="283" w:author="Craig Parker [2]" w:date="2025-09-11T15:11:00Z" w16du:dateUtc="2025-09-11T13:11:00Z">
+      <w:ins w:id="279" w:author="Craig Parker [2]" w:date="2025-09-11T15:11:00Z" w16du:dateUtc="2025-09-11T13:11:00Z">
         <w:r>
           <w:rPr>
             <w:rFonts w:ascii="Arial" w:eastAsia="Times New Roman" w:hAnsi="Arial" w:cs="Arial"/>
@@ -15028,14 +14997,14 @@
         </w:numPr>
         <w:spacing w:before="100" w:beforeAutospacing="1" w:after="100" w:afterAutospacing="1"/>
         <w:rPr>
-          <w:ins w:id="284" w:author="Craig Parker [2]" w:date="2025-09-11T15:11:00Z" w16du:dateUtc="2025-09-11T13:11:00Z"/>
+          <w:ins w:id="280" w:author="Craig Parker [2]" w:date="2025-09-11T15:11:00Z" w16du:dateUtc="2025-09-11T13:11:00Z"/>
           <w:rFonts w:ascii="Arial" w:eastAsia="Times New Roman" w:hAnsi="Arial" w:cs="Arial"/>
           <w:color w:val="000000"/>
           <w:sz w:val="27"/>
           <w:szCs w:val="27"/>
         </w:rPr>
       </w:pPr>
-      <w:ins w:id="285" w:author="Craig Parker [2]" w:date="2025-09-11T15:11:00Z" w16du:dateUtc="2025-09-11T13:11:00Z">
+      <w:ins w:id="281" w:author="Craig Parker [2]" w:date="2025-09-11T15:11:00Z" w16du:dateUtc="2025-09-11T13:11:00Z">
         <w:r>
           <w:rPr>
             <w:rFonts w:ascii="Arial" w:eastAsia="Times New Roman" w:hAnsi="Arial" w:cs="Arial"/>
@@ -15057,14 +15026,14 @@
         </w:numPr>
         <w:spacing w:before="100" w:beforeAutospacing="1" w:after="100" w:afterAutospacing="1"/>
         <w:rPr>
-          <w:ins w:id="286" w:author="Craig Parker [2]" w:date="2025-09-11T15:11:00Z" w16du:dateUtc="2025-09-11T13:11:00Z"/>
+          <w:ins w:id="282" w:author="Craig Parker [2]" w:date="2025-09-11T15:11:00Z" w16du:dateUtc="2025-09-11T13:11:00Z"/>
           <w:rFonts w:ascii="Arial" w:eastAsia="Times New Roman" w:hAnsi="Arial" w:cs="Arial"/>
           <w:color w:val="000000"/>
           <w:sz w:val="27"/>
           <w:szCs w:val="27"/>
         </w:rPr>
       </w:pPr>
-      <w:ins w:id="287" w:author="Craig Parker [2]" w:date="2025-09-11T15:11:00Z" w16du:dateUtc="2025-09-11T13:11:00Z">
+      <w:ins w:id="283" w:author="Craig Parker [2]" w:date="2025-09-11T15:11:00Z" w16du:dateUtc="2025-09-11T13:11:00Z">
         <w:r>
           <w:rPr>
             <w:rFonts w:ascii="Arial" w:eastAsia="Times New Roman" w:hAnsi="Arial" w:cs="Arial"/>
@@ -15086,14 +15055,14 @@
         </w:numPr>
         <w:spacing w:before="100" w:beforeAutospacing="1" w:after="100" w:afterAutospacing="1"/>
         <w:rPr>
-          <w:ins w:id="288" w:author="Craig Parker [2]" w:date="2025-09-11T15:11:00Z" w16du:dateUtc="2025-09-11T13:11:00Z"/>
+          <w:ins w:id="284" w:author="Craig Parker [2]" w:date="2025-09-11T15:11:00Z" w16du:dateUtc="2025-09-11T13:11:00Z"/>
           <w:rFonts w:ascii="Arial" w:eastAsia="Times New Roman" w:hAnsi="Arial" w:cs="Arial"/>
           <w:color w:val="000000"/>
           <w:sz w:val="27"/>
           <w:szCs w:val="27"/>
         </w:rPr>
       </w:pPr>
-      <w:ins w:id="289" w:author="Craig Parker [2]" w:date="2025-09-11T15:11:00Z" w16du:dateUtc="2025-09-11T13:11:00Z">
+      <w:ins w:id="285" w:author="Craig Parker [2]" w:date="2025-09-11T15:11:00Z" w16du:dateUtc="2025-09-11T13:11:00Z">
         <w:r>
           <w:rPr>
             <w:rFonts w:ascii="Arial" w:eastAsia="Times New Roman" w:hAnsi="Arial" w:cs="Arial"/>
@@ -15115,14 +15084,14 @@
         </w:numPr>
         <w:spacing w:before="100" w:beforeAutospacing="1" w:after="100" w:afterAutospacing="1"/>
         <w:rPr>
-          <w:ins w:id="290" w:author="Craig Parker [2]" w:date="2025-09-11T15:11:00Z" w16du:dateUtc="2025-09-11T13:11:00Z"/>
+          <w:ins w:id="286" w:author="Craig Parker [2]" w:date="2025-09-11T15:11:00Z" w16du:dateUtc="2025-09-11T13:11:00Z"/>
           <w:rFonts w:ascii="Arial" w:eastAsia="Times New Roman" w:hAnsi="Arial" w:cs="Arial"/>
           <w:color w:val="000000"/>
           <w:sz w:val="27"/>
           <w:szCs w:val="27"/>
         </w:rPr>
       </w:pPr>
-      <w:ins w:id="291" w:author="Craig Parker [2]" w:date="2025-09-11T15:11:00Z" w16du:dateUtc="2025-09-11T13:11:00Z">
+      <w:ins w:id="287" w:author="Craig Parker [2]" w:date="2025-09-11T15:11:00Z" w16du:dateUtc="2025-09-11T13:11:00Z">
         <w:r>
           <w:rPr>
             <w:rFonts w:ascii="Arial" w:eastAsia="Times New Roman" w:hAnsi="Arial" w:cs="Arial"/>
@@ -15141,7 +15110,7 @@
         <w:spacing w:before="100" w:beforeAutospacing="1" w:after="100" w:afterAutospacing="1"/>
         <w:outlineLvl w:val="3"/>
         <w:rPr>
-          <w:ins w:id="292" w:author="Craig Parker [2]" w:date="2025-09-11T15:11:00Z" w16du:dateUtc="2025-09-11T13:11:00Z"/>
+          <w:ins w:id="288" w:author="Craig Parker [2]" w:date="2025-09-11T15:11:00Z" w16du:dateUtc="2025-09-11T13:11:00Z"/>
           <w:rFonts w:ascii="Arial" w:eastAsia="Times New Roman" w:hAnsi="Arial" w:cs="Arial"/>
           <w:b/>
           <w:bCs/>
@@ -15150,7 +15119,7 @@
           <w:szCs w:val="27"/>
         </w:rPr>
       </w:pPr>
-      <w:ins w:id="293" w:author="Craig Parker [2]" w:date="2025-09-11T15:11:00Z" w16du:dateUtc="2025-09-11T13:11:00Z">
+      <w:ins w:id="289" w:author="Craig Parker [2]" w:date="2025-09-11T15:11:00Z" w16du:dateUtc="2025-09-11T13:11:00Z">
         <w:r>
           <w:rPr>
             <w:rFonts w:ascii="Arial" w:eastAsia="Times New Roman" w:hAnsi="Arial" w:cs="Arial"/>
@@ -15168,14 +15137,14 @@
       <w:pPr>
         <w:spacing w:before="100" w:beforeAutospacing="1" w:after="100" w:afterAutospacing="1"/>
         <w:rPr>
-          <w:ins w:id="294" w:author="Craig Parker [2]" w:date="2025-09-11T15:11:00Z" w16du:dateUtc="2025-09-11T13:11:00Z"/>
+          <w:ins w:id="290" w:author="Craig Parker [2]" w:date="2025-09-11T15:11:00Z" w16du:dateUtc="2025-09-11T13:11:00Z"/>
           <w:rFonts w:ascii="Arial" w:eastAsia="Times New Roman" w:hAnsi="Arial" w:cs="Arial"/>
           <w:color w:val="000000"/>
           <w:sz w:val="27"/>
           <w:szCs w:val="27"/>
         </w:rPr>
       </w:pPr>
-      <w:ins w:id="295" w:author="Craig Parker [2]" w:date="2025-09-11T15:11:00Z" w16du:dateUtc="2025-09-11T13:11:00Z">
+      <w:ins w:id="291" w:author="Craig Parker [2]" w:date="2025-09-11T15:11:00Z" w16du:dateUtc="2025-09-11T13:11:00Z">
         <w:r>
           <w:rPr>
             <w:rFonts w:ascii="Arial" w:eastAsia="Times New Roman" w:hAnsi="Arial" w:cs="Arial"/>
@@ -15193,14 +15162,14 @@
       <w:pPr>
         <w:spacing w:before="100" w:beforeAutospacing="1" w:after="100" w:afterAutospacing="1"/>
         <w:rPr>
-          <w:ins w:id="296" w:author="Craig Parker [2]" w:date="2025-09-11T15:11:00Z" w16du:dateUtc="2025-09-11T13:11:00Z"/>
+          <w:ins w:id="292" w:author="Craig Parker [2]" w:date="2025-09-11T15:11:00Z" w16du:dateUtc="2025-09-11T13:11:00Z"/>
           <w:rFonts w:ascii="Arial" w:eastAsia="Times New Roman" w:hAnsi="Arial" w:cs="Arial"/>
           <w:color w:val="000000"/>
           <w:sz w:val="27"/>
           <w:szCs w:val="27"/>
         </w:rPr>
       </w:pPr>
-      <w:ins w:id="297" w:author="Craig Parker [2]" w:date="2025-09-11T15:11:00Z" w16du:dateUtc="2025-09-11T13:11:00Z">
+      <w:ins w:id="293" w:author="Craig Parker [2]" w:date="2025-09-11T15:11:00Z" w16du:dateUtc="2025-09-11T13:11:00Z">
         <w:r>
           <w:rPr>
             <w:rFonts w:ascii="Arial" w:eastAsia="Times New Roman" w:hAnsi="Arial" w:cs="Arial"/>
@@ -15218,14 +15187,14 @@
       <w:pPr>
         <w:spacing w:before="100" w:beforeAutospacing="1" w:after="100" w:afterAutospacing="1"/>
         <w:rPr>
-          <w:ins w:id="298" w:author="Craig Parker [2]" w:date="2025-09-11T15:11:00Z" w16du:dateUtc="2025-09-11T13:11:00Z"/>
+          <w:ins w:id="294" w:author="Craig Parker [2]" w:date="2025-09-11T15:11:00Z" w16du:dateUtc="2025-09-11T13:11:00Z"/>
           <w:rFonts w:ascii="Arial" w:eastAsia="Times New Roman" w:hAnsi="Arial" w:cs="Arial"/>
           <w:color w:val="000000"/>
           <w:sz w:val="27"/>
           <w:szCs w:val="27"/>
         </w:rPr>
       </w:pPr>
-      <w:ins w:id="299" w:author="Craig Parker [2]" w:date="2025-09-11T15:11:00Z" w16du:dateUtc="2025-09-11T13:11:00Z">
+      <w:ins w:id="295" w:author="Craig Parker [2]" w:date="2025-09-11T15:11:00Z" w16du:dateUtc="2025-09-11T13:11:00Z">
         <w:r>
           <w:rPr>
             <w:rFonts w:ascii="Arial" w:eastAsia="Times New Roman" w:hAnsi="Arial" w:cs="Arial"/>
@@ -15243,14 +15212,14 @@
       <w:pPr>
         <w:spacing w:before="100" w:beforeAutospacing="1" w:after="100" w:afterAutospacing="1"/>
         <w:rPr>
-          <w:ins w:id="300" w:author="Craig Parker [2]" w:date="2025-09-11T15:11:00Z" w16du:dateUtc="2025-09-11T13:11:00Z"/>
+          <w:ins w:id="296" w:author="Craig Parker [2]" w:date="2025-09-11T15:11:00Z" w16du:dateUtc="2025-09-11T13:11:00Z"/>
           <w:rFonts w:ascii="Arial" w:eastAsia="Times New Roman" w:hAnsi="Arial" w:cs="Arial"/>
           <w:color w:val="000000"/>
           <w:sz w:val="27"/>
           <w:szCs w:val="27"/>
         </w:rPr>
       </w:pPr>
-      <w:ins w:id="301" w:author="Craig Parker [2]" w:date="2025-09-11T15:11:00Z" w16du:dateUtc="2025-09-11T13:11:00Z">
+      <w:ins w:id="297" w:author="Craig Parker [2]" w:date="2025-09-11T15:11:00Z" w16du:dateUtc="2025-09-11T13:11:00Z">
         <w:r>
           <w:rPr>
             <w:rFonts w:ascii="Arial" w:eastAsia="Times New Roman" w:hAnsi="Arial" w:cs="Arial"/>
@@ -15292,14 +15261,14 @@
       <w:pPr>
         <w:spacing w:before="100" w:beforeAutospacing="1" w:after="100" w:afterAutospacing="1"/>
         <w:rPr>
-          <w:ins w:id="302" w:author="Craig Parker [2]" w:date="2025-09-11T15:11:00Z" w16du:dateUtc="2025-09-11T13:11:00Z"/>
+          <w:ins w:id="298" w:author="Craig Parker [2]" w:date="2025-09-11T15:11:00Z" w16du:dateUtc="2025-09-11T13:11:00Z"/>
           <w:rFonts w:ascii="Arial" w:eastAsia="Times New Roman" w:hAnsi="Arial" w:cs="Arial"/>
           <w:color w:val="000000"/>
           <w:sz w:val="27"/>
           <w:szCs w:val="27"/>
         </w:rPr>
       </w:pPr>
-      <w:ins w:id="303" w:author="Craig Parker [2]" w:date="2025-09-11T15:11:00Z" w16du:dateUtc="2025-09-11T13:11:00Z">
+      <w:ins w:id="299" w:author="Craig Parker [2]" w:date="2025-09-11T15:11:00Z" w16du:dateUtc="2025-09-11T13:11:00Z">
         <w:r>
           <w:rPr>
             <w:rFonts w:ascii="Arial" w:eastAsia="Times New Roman" w:hAnsi="Arial" w:cs="Arial"/>
@@ -15321,14 +15290,14 @@
         </w:numPr>
         <w:spacing w:before="100" w:beforeAutospacing="1" w:after="100" w:afterAutospacing="1"/>
         <w:rPr>
-          <w:ins w:id="304" w:author="Craig Parker [2]" w:date="2025-09-11T15:11:00Z" w16du:dateUtc="2025-09-11T13:11:00Z"/>
+          <w:ins w:id="300" w:author="Craig Parker [2]" w:date="2025-09-11T15:11:00Z" w16du:dateUtc="2025-09-11T13:11:00Z"/>
           <w:rFonts w:ascii="Arial" w:eastAsia="Times New Roman" w:hAnsi="Arial" w:cs="Arial"/>
           <w:color w:val="000000"/>
           <w:sz w:val="27"/>
           <w:szCs w:val="27"/>
         </w:rPr>
       </w:pPr>
-      <w:ins w:id="305" w:author="Craig Parker [2]" w:date="2025-09-11T15:11:00Z" w16du:dateUtc="2025-09-11T13:11:00Z">
+      <w:ins w:id="301" w:author="Craig Parker [2]" w:date="2025-09-11T15:11:00Z" w16du:dateUtc="2025-09-11T13:11:00Z">
         <w:r>
           <w:rPr>
             <w:rFonts w:ascii="Arial" w:eastAsia="Times New Roman" w:hAnsi="Arial" w:cs="Arial"/>
@@ -15350,14 +15319,14 @@
         </w:numPr>
         <w:spacing w:before="100" w:beforeAutospacing="1" w:after="100" w:afterAutospacing="1"/>
         <w:rPr>
-          <w:ins w:id="306" w:author="Craig Parker [2]" w:date="2025-09-11T15:11:00Z" w16du:dateUtc="2025-09-11T13:11:00Z"/>
+          <w:ins w:id="302" w:author="Craig Parker [2]" w:date="2025-09-11T15:11:00Z" w16du:dateUtc="2025-09-11T13:11:00Z"/>
           <w:rFonts w:ascii="Arial" w:eastAsia="Times New Roman" w:hAnsi="Arial" w:cs="Arial"/>
           <w:color w:val="000000"/>
           <w:sz w:val="27"/>
           <w:szCs w:val="27"/>
         </w:rPr>
       </w:pPr>
-      <w:ins w:id="307" w:author="Craig Parker [2]" w:date="2025-09-11T15:11:00Z" w16du:dateUtc="2025-09-11T13:11:00Z">
+      <w:ins w:id="303" w:author="Craig Parker [2]" w:date="2025-09-11T15:11:00Z" w16du:dateUtc="2025-09-11T13:11:00Z">
         <w:r>
           <w:rPr>
             <w:rFonts w:ascii="Arial" w:eastAsia="Times New Roman" w:hAnsi="Arial" w:cs="Arial"/>
@@ -15379,14 +15348,14 @@
         </w:numPr>
         <w:spacing w:before="100" w:beforeAutospacing="1" w:after="100" w:afterAutospacing="1"/>
         <w:rPr>
-          <w:ins w:id="308" w:author="Craig Parker [2]" w:date="2025-09-11T15:11:00Z" w16du:dateUtc="2025-09-11T13:11:00Z"/>
+          <w:ins w:id="304" w:author="Craig Parker [2]" w:date="2025-09-11T15:11:00Z" w16du:dateUtc="2025-09-11T13:11:00Z"/>
           <w:rFonts w:ascii="Arial" w:eastAsia="Times New Roman" w:hAnsi="Arial" w:cs="Arial"/>
           <w:color w:val="000000"/>
           <w:sz w:val="27"/>
           <w:szCs w:val="27"/>
         </w:rPr>
       </w:pPr>
-      <w:ins w:id="309" w:author="Craig Parker [2]" w:date="2025-09-11T15:11:00Z" w16du:dateUtc="2025-09-11T13:11:00Z">
+      <w:ins w:id="305" w:author="Craig Parker [2]" w:date="2025-09-11T15:11:00Z" w16du:dateUtc="2025-09-11T13:11:00Z">
         <w:r>
           <w:rPr>
             <w:rFonts w:ascii="Arial" w:eastAsia="Times New Roman" w:hAnsi="Arial" w:cs="Arial"/>
@@ -15408,14 +15377,14 @@
         </w:numPr>
         <w:spacing w:before="100" w:beforeAutospacing="1" w:after="100" w:afterAutospacing="1"/>
         <w:rPr>
-          <w:ins w:id="310" w:author="Craig Parker [2]" w:date="2025-09-11T15:11:00Z" w16du:dateUtc="2025-09-11T13:11:00Z"/>
+          <w:ins w:id="306" w:author="Craig Parker [2]" w:date="2025-09-11T15:11:00Z" w16du:dateUtc="2025-09-11T13:11:00Z"/>
           <w:rFonts w:ascii="Arial" w:eastAsia="Times New Roman" w:hAnsi="Arial" w:cs="Arial"/>
           <w:color w:val="000000"/>
           <w:sz w:val="27"/>
           <w:szCs w:val="27"/>
         </w:rPr>
       </w:pPr>
-      <w:ins w:id="311" w:author="Craig Parker [2]" w:date="2025-09-11T15:11:00Z" w16du:dateUtc="2025-09-11T13:11:00Z">
+      <w:ins w:id="307" w:author="Craig Parker [2]" w:date="2025-09-11T15:11:00Z" w16du:dateUtc="2025-09-11T13:11:00Z">
         <w:r>
           <w:rPr>
             <w:rFonts w:ascii="Arial" w:eastAsia="Times New Roman" w:hAnsi="Arial" w:cs="Arial"/>
@@ -15433,14 +15402,14 @@
       <w:pPr>
         <w:spacing w:before="100" w:beforeAutospacing="1" w:after="100" w:afterAutospacing="1"/>
         <w:rPr>
-          <w:ins w:id="312" w:author="Craig Parker [2]" w:date="2025-09-11T15:11:00Z" w16du:dateUtc="2025-09-11T13:11:00Z"/>
+          <w:ins w:id="308" w:author="Craig Parker [2]" w:date="2025-09-11T15:11:00Z" w16du:dateUtc="2025-09-11T13:11:00Z"/>
           <w:rFonts w:ascii="Arial" w:eastAsia="Times New Roman" w:hAnsi="Arial" w:cs="Arial"/>
           <w:color w:val="000000"/>
           <w:sz w:val="27"/>
           <w:szCs w:val="27"/>
         </w:rPr>
       </w:pPr>
-      <w:ins w:id="313" w:author="Craig Parker [2]" w:date="2025-09-11T15:11:00Z" w16du:dateUtc="2025-09-11T13:11:00Z">
+      <w:ins w:id="309" w:author="Craig Parker [2]" w:date="2025-09-11T15:11:00Z" w16du:dateUtc="2025-09-11T13:11:00Z">
         <w:r>
           <w:rPr>
             <w:rFonts w:ascii="Arial" w:eastAsia="Times New Roman" w:hAnsi="Arial" w:cs="Arial"/>
@@ -15459,14 +15428,14 @@
       <w:pPr>
         <w:spacing w:before="100" w:beforeAutospacing="1" w:after="100" w:afterAutospacing="1"/>
         <w:rPr>
-          <w:ins w:id="314" w:author="Craig Parker [2]" w:date="2025-09-11T15:11:00Z" w16du:dateUtc="2025-09-11T13:11:00Z"/>
+          <w:ins w:id="310" w:author="Craig Parker [2]" w:date="2025-09-11T15:11:00Z" w16du:dateUtc="2025-09-11T13:11:00Z"/>
           <w:rFonts w:ascii="Arial" w:eastAsia="Times New Roman" w:hAnsi="Arial" w:cs="Arial"/>
           <w:color w:val="000000"/>
           <w:sz w:val="27"/>
           <w:szCs w:val="27"/>
         </w:rPr>
       </w:pPr>
-      <w:ins w:id="315" w:author="Craig Parker [2]" w:date="2025-09-11T15:11:00Z" w16du:dateUtc="2025-09-11T13:11:00Z">
+      <w:ins w:id="311" w:author="Craig Parker [2]" w:date="2025-09-11T15:11:00Z" w16du:dateUtc="2025-09-11T13:11:00Z">
         <w:r>
           <w:rPr>
             <w:rFonts w:ascii="Arial" w:eastAsia="Times New Roman" w:hAnsi="Arial" w:cs="Arial"/>
@@ -15484,14 +15453,14 @@
       <w:pPr>
         <w:spacing w:before="100" w:beforeAutospacing="1" w:after="100" w:afterAutospacing="1"/>
         <w:rPr>
-          <w:ins w:id="316" w:author="Craig Parker [2]" w:date="2025-09-11T15:11:00Z" w16du:dateUtc="2025-09-11T13:11:00Z"/>
+          <w:ins w:id="312" w:author="Craig Parker [2]" w:date="2025-09-11T15:11:00Z" w16du:dateUtc="2025-09-11T13:11:00Z"/>
           <w:rFonts w:ascii="Arial" w:eastAsia="Times New Roman" w:hAnsi="Arial" w:cs="Arial"/>
           <w:color w:val="000000"/>
           <w:sz w:val="27"/>
           <w:szCs w:val="27"/>
         </w:rPr>
       </w:pPr>
-      <w:ins w:id="317" w:author="Craig Parker [2]" w:date="2025-09-11T15:11:00Z" w16du:dateUtc="2025-09-11T13:11:00Z">
+      <w:ins w:id="313" w:author="Craig Parker [2]" w:date="2025-09-11T15:11:00Z" w16du:dateUtc="2025-09-11T13:11:00Z">
         <w:r>
           <w:rPr>
             <w:rFonts w:ascii="Arial" w:eastAsia="Times New Roman" w:hAnsi="Arial" w:cs="Arial"/>
@@ -15509,24 +15478,24 @@
       <w:pPr>
         <w:spacing w:before="100" w:beforeAutospacing="1" w:after="100" w:afterAutospacing="1"/>
         <w:rPr>
-          <w:ins w:id="318" w:author="Craig Parker [2]" w:date="2025-09-11T15:11:00Z" w16du:dateUtc="2025-09-11T13:11:00Z"/>
+          <w:ins w:id="314" w:author="Craig Parker [2]" w:date="2025-09-11T15:11:00Z" w16du:dateUtc="2025-09-11T13:11:00Z"/>
           <w:rFonts w:ascii="Arial" w:eastAsia="Times New Roman" w:hAnsi="Arial" w:cs="Arial"/>
           <w:color w:val="000000"/>
           <w:sz w:val="27"/>
           <w:szCs w:val="27"/>
-          <w:rPrChange w:id="319" w:author="Craig Parker" w:date="2025-08-22T12:51:00Z" w16du:dateUtc="2025-08-22T10:51:00Z">
+          <w:rPrChange w:id="315" w:author="Craig Parker" w:date="2025-08-22T12:51:00Z" w16du:dateUtc="2025-08-22T10:51:00Z">
             <w:rPr>
-              <w:ins w:id="320" w:author="Craig Parker [2]" w:date="2025-09-11T15:11:00Z" w16du:dateUtc="2025-09-11T13:11:00Z"/>
+              <w:ins w:id="316" w:author="Craig Parker [2]" w:date="2025-09-11T15:11:00Z" w16du:dateUtc="2025-09-11T13:11:00Z"/>
             </w:rPr>
           </w:rPrChange>
         </w:rPr>
-        <w:pPrChange w:id="321" w:author="Craig Parker" w:date="2025-08-22T12:51:00Z" w16du:dateUtc="2025-08-22T10:51:00Z">
+        <w:pPrChange w:id="317" w:author="Craig Parker" w:date="2025-08-22T12:51:00Z" w16du:dateUtc="2025-08-22T10:51:00Z">
           <w:pPr>
             <w:pStyle w:val="Heading3"/>
           </w:pPr>
         </w:pPrChange>
       </w:pPr>
-      <w:ins w:id="322" w:author="Craig Parker [2]" w:date="2025-09-11T15:11:00Z" w16du:dateUtc="2025-09-11T13:11:00Z">
+      <w:ins w:id="318" w:author="Craig Parker [2]" w:date="2025-09-11T15:11:00Z" w16du:dateUtc="2025-09-11T13:11:00Z">
         <w:r>
           <w:rPr>
             <w:rFonts w:ascii="Arial" w:eastAsia="Times New Roman" w:hAnsi="Arial" w:cs="Arial"/>
@@ -15555,7 +15524,7 @@
     <w:p>
       <w:pPr>
         <w:pStyle w:val="BodyText"/>
-        <w:pPrChange w:id="323" w:author="Craig Parker" w:date="2025-08-22T12:49:00Z" w16du:dateUtc="2025-08-22T10:49:00Z">
+        <w:pPrChange w:id="319" w:author="Craig Parker" w:date="2025-08-22T12:49:00Z" w16du:dateUtc="2025-08-22T10:49:00Z">
           <w:pPr>
             <w:pStyle w:val="Heading3"/>
           </w:pPr>
@@ -15566,16 +15535,16 @@
       <w:pPr>
         <w:pStyle w:val="Heading3"/>
       </w:pPr>
-      <w:bookmarkStart w:id="324" w:name="_Toc206760712"/>
+      <w:bookmarkStart w:id="320" w:name="_Toc206760712"/>
       <w:r>
         <w:t xml:space="preserve">Annex </w:t>
       </w:r>
-      <w:ins w:id="325" w:author="Craig Parker" w:date="2025-08-22T12:51:00Z" w16du:dateUtc="2025-08-22T10:51:00Z">
+      <w:ins w:id="321" w:author="Craig Parker" w:date="2025-08-22T12:51:00Z" w16du:dateUtc="2025-08-22T10:51:00Z">
         <w:r>
           <w:t>2</w:t>
         </w:r>
       </w:ins>
-      <w:del w:id="326" w:author="Craig Parker" w:date="2025-08-22T12:51:00Z" w16du:dateUtc="2025-08-22T10:51:00Z">
+      <w:del w:id="322" w:author="Craig Parker" w:date="2025-08-22T12:51:00Z" w16du:dateUtc="2025-08-22T10:51:00Z">
         <w:r>
           <w:delText>1</w:delText>
         </w:r>
@@ -15583,7 +15552,7 @@
       <w:r>
         <w:t>: Key data sources</w:t>
       </w:r>
-      <w:bookmarkEnd w:id="324"/>
+      <w:bookmarkEnd w:id="320"/>
     </w:p>
     <w:tbl>
       <w:tblPr>
@@ -16796,8 +16765,8 @@
           <w:docGrid w:linePitch="326"/>
         </w:sectPr>
       </w:pPr>
-      <w:bookmarkStart w:id="327" w:name="Xa849b79b1dd2b5d94d7497064e6cba4d629a369"/>
-      <w:bookmarkEnd w:id="242"/>
+      <w:bookmarkStart w:id="323" w:name="Xa849b79b1dd2b5d94d7497064e6cba4d629a369"/>
+      <w:bookmarkEnd w:id="239"/>
     </w:p>
     <w:p>
       <w:pPr>
@@ -16807,23 +16776,23 @@
           <w:bCs/>
         </w:rPr>
       </w:pPr>
-      <w:bookmarkStart w:id="328" w:name="_Toc206760713"/>
+      <w:bookmarkStart w:id="324" w:name="_Toc206760713"/>
       <w:r>
         <w:lastRenderedPageBreak/>
         <w:t xml:space="preserve">Annex </w:t>
       </w:r>
-      <w:ins w:id="329" w:author="Craig Parker" w:date="2025-08-22T12:52:00Z" w16du:dateUtc="2025-08-22T10:52:00Z">
+      <w:ins w:id="325" w:author="Craig Parker" w:date="2025-08-22T12:52:00Z" w16du:dateUtc="2025-08-22T10:52:00Z">
         <w:r>
           <w:t>3</w:t>
         </w:r>
       </w:ins>
-      <w:del w:id="330" w:author="Craig Parker" w:date="2025-08-22T12:52:00Z" w16du:dateUtc="2025-08-22T10:52:00Z">
+      <w:del w:id="326" w:author="Craig Parker" w:date="2025-08-22T12:52:00Z" w16du:dateUtc="2025-08-22T10:52:00Z">
         <w:r>
           <w:delText>2</w:delText>
         </w:r>
       </w:del>
-      <w:bookmarkStart w:id="331" w:name="Xd3aeb4927b3c85f518871109bed5817377321d2"/>
-      <w:bookmarkEnd w:id="327"/>
+      <w:bookmarkStart w:id="327" w:name="Xd3aeb4927b3c85f518871109bed5817377321d2"/>
+      <w:bookmarkEnd w:id="323"/>
       <w:r>
         <w:t xml:space="preserve">: </w:t>
       </w:r>
@@ -16833,7 +16802,7 @@
         </w:rPr>
         <w:t>Personal information processing agreement</w:t>
       </w:r>
-      <w:bookmarkEnd w:id="328"/>
+      <w:bookmarkEnd w:id="324"/>
       <w:r>
         <w:rPr>
           <w:b/>
@@ -17004,7 +16973,7 @@
         <w:rPr>
           <w:sz w:val="22"/>
           <w:szCs w:val="22"/>
-          <w:rPrChange w:id="332" w:author="Craig Parker [2]" w:date="2025-09-09T12:00:00Z" w16du:dateUtc="2025-09-09T10:00:00Z">
+          <w:rPrChange w:id="328" w:author="Craig Parker [2]" w:date="2025-09-09T12:00:00Z" w16du:dateUtc="2025-09-09T10:00:00Z">
             <w:rPr/>
           </w:rPrChange>
         </w:rPr>
@@ -17014,7 +16983,7 @@
           <w:sz w:val="22"/>
           <w:szCs w:val="22"/>
           <w:lang w:val="en-ZA"/>
-          <w:rPrChange w:id="333" w:author="Craig Parker [2]" w:date="2025-09-09T12:00:00Z" w16du:dateUtc="2025-09-09T10:00:00Z">
+          <w:rPrChange w:id="329" w:author="Craig Parker [2]" w:date="2025-09-09T12:00:00Z" w16du:dateUtc="2025-09-09T10:00:00Z">
             <w:rPr>
               <w:lang w:val="en-ZA"/>
             </w:rPr>
@@ -17026,7 +16995,7 @@
         <w:rPr>
           <w:sz w:val="22"/>
           <w:szCs w:val="22"/>
-          <w:rPrChange w:id="334" w:author="Craig Parker [2]" w:date="2025-09-09T12:00:00Z" w16du:dateUtc="2025-09-09T10:00:00Z">
+          <w:rPrChange w:id="330" w:author="Craig Parker [2]" w:date="2025-09-09T12:00:00Z" w16du:dateUtc="2025-09-09T10:00:00Z">
             <w:rPr/>
           </w:rPrChange>
         </w:rPr>
@@ -17038,7 +17007,7 @@
           <w:color w:val="0F4761" w:themeColor="accent1" w:themeShade="BF"/>
           <w:sz w:val="22"/>
           <w:szCs w:val="22"/>
-          <w:rPrChange w:id="335" w:author="Craig Parker [2]" w:date="2025-09-09T12:00:00Z" w16du:dateUtc="2025-09-09T10:00:00Z">
+          <w:rPrChange w:id="331" w:author="Craig Parker [2]" w:date="2025-09-09T12:00:00Z" w16du:dateUtc="2025-09-09T10:00:00Z">
             <w:rPr>
               <w:rFonts w:eastAsiaTheme="majorEastAsia" w:cstheme="majorBidi"/>
               <w:color w:val="0F4761" w:themeColor="accent1" w:themeShade="BF"/>
@@ -17068,17 +17037,17 @@
       <w:pPr>
         <w:pStyle w:val="Heading3"/>
       </w:pPr>
-      <w:bookmarkStart w:id="336" w:name="_Toc206760714"/>
+      <w:bookmarkStart w:id="332" w:name="_Toc206760714"/>
       <w:r>
         <w:lastRenderedPageBreak/>
         <w:t xml:space="preserve">Annex </w:t>
       </w:r>
-      <w:ins w:id="337" w:author="Craig Parker" w:date="2025-08-22T12:52:00Z" w16du:dateUtc="2025-08-22T10:52:00Z">
+      <w:ins w:id="333" w:author="Craig Parker" w:date="2025-08-22T12:52:00Z" w16du:dateUtc="2025-08-22T10:52:00Z">
         <w:r>
           <w:t>4</w:t>
         </w:r>
       </w:ins>
-      <w:del w:id="338" w:author="Craig Parker" w:date="2025-08-22T12:52:00Z" w16du:dateUtc="2025-08-22T10:52:00Z">
+      <w:del w:id="334" w:author="Craig Parker" w:date="2025-08-22T12:52:00Z" w16du:dateUtc="2025-08-22T10:52:00Z">
         <w:r>
           <w:delText>3</w:delText>
         </w:r>
@@ -17086,7 +17055,7 @@
       <w:r>
         <w:t>: Ethics notification letter template</w:t>
       </w:r>
-      <w:bookmarkEnd w:id="336"/>
+      <w:bookmarkEnd w:id="332"/>
     </w:p>
     <w:p>
       <w:pPr>
@@ -17101,8 +17070,8 @@
           <w:szCs w:val="18"/>
         </w:rPr>
       </w:pPr>
-      <w:bookmarkStart w:id="339" w:name="Xf6ffab845a425d734eb08b22a51ddefff17a61a"/>
-      <w:bookmarkEnd w:id="331"/>
+      <w:bookmarkStart w:id="335" w:name="Xf6ffab845a425d734eb08b22a51ddefff17a61a"/>
+      <w:bookmarkEnd w:id="327"/>
       <w:r>
         <w:rPr>
           <w:rFonts w:ascii="Nunito" w:eastAsia="Times New Roman" w:hAnsi="Nunito" w:cs="Segoe UI"/>
@@ -19019,17 +18988,17 @@
       <w:pPr>
         <w:pStyle w:val="Heading3"/>
       </w:pPr>
-      <w:bookmarkStart w:id="340" w:name="_Toc206760715"/>
+      <w:bookmarkStart w:id="336" w:name="_Toc206760715"/>
       <w:r>
         <w:lastRenderedPageBreak/>
         <w:t xml:space="preserve">Annex </w:t>
       </w:r>
-      <w:ins w:id="341" w:author="Craig Parker" w:date="2025-08-22T12:52:00Z" w16du:dateUtc="2025-08-22T10:52:00Z">
+      <w:ins w:id="337" w:author="Craig Parker" w:date="2025-08-22T12:52:00Z" w16du:dateUtc="2025-08-22T10:52:00Z">
         <w:r>
           <w:t>5</w:t>
         </w:r>
       </w:ins>
-      <w:del w:id="342" w:author="Craig Parker" w:date="2025-08-22T12:52:00Z" w16du:dateUtc="2025-08-22T10:52:00Z">
+      <w:del w:id="338" w:author="Craig Parker" w:date="2025-08-22T12:52:00Z" w16du:dateUtc="2025-08-22T10:52:00Z">
         <w:r>
           <w:delText>4</w:delText>
         </w:r>
@@ -19037,7 +19006,7 @@
       <w:r>
         <w:t>: Data Access Committee Terms of Reference</w:t>
       </w:r>
-      <w:bookmarkEnd w:id="340"/>
+      <w:bookmarkEnd w:id="336"/>
     </w:p>
     <w:p>
       <w:pPr>
@@ -19052,8 +19021,8 @@
           <w:bCs/>
         </w:rPr>
       </w:pPr>
-      <w:bookmarkStart w:id="343" w:name="annex-5-data-request-form"/>
-      <w:bookmarkEnd w:id="339"/>
+      <w:bookmarkStart w:id="339" w:name="annex-5-data-request-form"/>
+      <w:bookmarkEnd w:id="335"/>
       <w:r>
         <w:rPr>
           <w:rStyle w:val="normaltextrun"/>
@@ -19596,17 +19565,17 @@
       <w:pPr>
         <w:pStyle w:val="Heading3"/>
       </w:pPr>
-      <w:bookmarkStart w:id="344" w:name="_Toc206760716"/>
+      <w:bookmarkStart w:id="340" w:name="_Toc206760716"/>
       <w:r>
         <w:lastRenderedPageBreak/>
         <w:t xml:space="preserve">Annex </w:t>
       </w:r>
-      <w:ins w:id="345" w:author="Craig Parker" w:date="2025-08-22T12:52:00Z" w16du:dateUtc="2025-08-22T10:52:00Z">
+      <w:ins w:id="341" w:author="Craig Parker" w:date="2025-08-22T12:52:00Z" w16du:dateUtc="2025-08-22T10:52:00Z">
         <w:r>
           <w:t>6</w:t>
         </w:r>
       </w:ins>
-      <w:del w:id="346" w:author="Craig Parker" w:date="2025-08-22T12:52:00Z" w16du:dateUtc="2025-08-22T10:52:00Z">
+      <w:del w:id="342" w:author="Craig Parker" w:date="2025-08-22T12:52:00Z" w16du:dateUtc="2025-08-22T10:52:00Z">
         <w:r>
           <w:delText>5</w:delText>
         </w:r>
@@ -19614,11 +19583,11 @@
       <w:r>
         <w:t>: Data Request Form</w:t>
       </w:r>
-      <w:bookmarkEnd w:id="344"/>
+      <w:bookmarkEnd w:id="340"/>
     </w:p>
     <w:bookmarkEnd w:id="0"/>
-    <w:bookmarkEnd w:id="239"/>
-    <w:bookmarkEnd w:id="343"/>
+    <w:bookmarkEnd w:id="235"/>
+    <w:bookmarkEnd w:id="339"/>
     <w:p>
       <w:pPr>
         <w:pStyle w:val="paragraph"/>
@@ -19671,7 +19640,7 @@
         </w:rPr>
         <w:t xml:space="preserve">Proposals for new studies that utilize data collected in the HE²AT Center may be submitted by </w:t>
       </w:r>
-      <w:ins w:id="347" w:author="Lisa van Aardenne" w:date="2025-08-25T14:02:00Z">
+      <w:ins w:id="343" w:author="Lisa van Aardenne" w:date="2025-08-25T14:02:00Z">
         <w:r>
           <w:rPr>
             <w:rStyle w:val="normaltextrun"/>
@@ -23660,7 +23629,7 @@
       </w:r>
     </w:p>
   </w:comment>
-  <w:comment w:id="224" w:author="Lisa van Aardenne" w:date="2025-08-25T20:15:00Z" w:initials="LA">
+  <w:comment w:id="220" w:author="Lisa van Aardenne" w:date="2025-08-25T20:15:00Z" w:initials="LA">
     <w:p>
       <w:pPr>
         <w:pStyle w:val="CommentText"/>
@@ -23676,7 +23645,7 @@
       </w:r>
     </w:p>
   </w:comment>
-  <w:comment w:id="225" w:author="Craig Parker [2]" w:date="2025-09-09T11:42:00Z" w:initials="CP">
+  <w:comment w:id="221" w:author="Craig Parker [2]" w:date="2025-09-09T11:42:00Z" w:initials="CP">
     <w:p>
       <w:r>
         <w:rPr>

</xml_diff>